<commit_message>
Contratti: clausola 7.4 con rimborso tramite bonifico entro 90 giorni
Nel caso di evento annullato e richiesta di rimborso, il rimborso avviene
con bonifico entro 90 gg dalla data di inizio prevista. Clausola divisa in
tre capoversi; corretto il refuso di quando versato. Modelli contratto di
sponsorizzazione e non ECM, IT ed EN.

Co-Authored-By: Claude Opus 5.5 <noreply@anthropic.com>
</commit_message>
<xml_diff>
--- a/contracts/templates_pdf/template_contratto_sponsor_non_ecm_en.docx
+++ b/contracts/templates_pdf/template_contratto_sponsor_non_ecm_en.docx
@@ -3507,7 +3507,57 @@
           <w:sz w:val="18"/>
           <w:szCs w:val="20"/>
         </w:rPr>
-        <w:t xml:space="preserve">In the event that the exhibition, event or congress cannot take place due to unforeseen circumstances or for any reason of an exceptional and unforeseen nature, immediate notice will be given to all those who have already submitted an application for admission/participation. In such a case, the Organizing Secretariat will proceed with new scheduling, and the Sponsor shall have the option to take part in it or to request a refund of the amount paid. Upon refund of the aforesaid amount, no further claim of any kind, on any grounds or for any reason, may be made against the Organizing Secretariat. In the event that the exhibition, event or congress should, for any reason, be closed early or temporarily suspended, regardless of the will of the Organizing Secretariat, no compensation shall be due to the Sponsors on any grounds or for any reason. </w:t>
+        <w:t>In the event that the exhibition, event or congress cannot take place due to unforeseen circumstances or for any reason of an exceptional and unforeseen nature, immediate notice will be given to all those who have already submitted an application for admission/participation. In such a case, the Organizing Secretariat will proceed with new scheduling, and the Sponsor shall have the option to take part in it or to request a refund of the amount paid. Upon refund of the aforesaid amount, no further claim of any kind, on any grounds or for any reason, may be made against the Organizing Secretariat.</w:t>
+      </w:r>
+    </w:p>
+    <w:p>
+      <w:pPr>
+        <w:pStyle w:val="Paragrafoelenco"/>
+        <w:widowControl w:val="false"/>
+        <w:tabs>
+          <w:tab w:val="clear" w:pos="709"/>
+          <w:tab w:val="right" w:pos="426" w:leader="none"/>
+          <w:tab w:val="left" w:pos="1765" w:leader="none"/>
+        </w:tabs>
+        <w:autoSpaceDE w:val="false"/>
+        <w:spacing w:lineRule="auto" w:line="230" w:before="0" w:after="0"/>
+        <w:ind w:left="0" w:right="56" w:hanging="0"/>
+        <w:contextualSpacing w:val="false"/>
+        <w:jc w:val="both"/>
+        <w:rPr/>
+      </w:pPr>
+      <w:r>
+        <w:rPr>
+          <w:rFonts w:cs="Arial" w:ascii="Arial" w:hAnsi="Arial"/>
+          <w:sz w:val="18"/>
+          <w:szCs w:val="20"/>
+        </w:rPr>
+        <w:t>Should a refund be requested, it will be made by bank transfer within 90 days of the scheduled start date of the event.</w:t>
+      </w:r>
+    </w:p>
+    <w:p>
+      <w:pPr>
+        <w:pStyle w:val="Paragrafoelenco"/>
+        <w:widowControl w:val="false"/>
+        <w:tabs>
+          <w:tab w:val="clear" w:pos="709"/>
+          <w:tab w:val="right" w:pos="426" w:leader="none"/>
+          <w:tab w:val="left" w:pos="1765" w:leader="none"/>
+        </w:tabs>
+        <w:autoSpaceDE w:val="false"/>
+        <w:spacing w:lineRule="auto" w:line="230" w:before="0" w:after="0"/>
+        <w:ind w:left="0" w:right="56" w:hanging="0"/>
+        <w:contextualSpacing w:val="false"/>
+        <w:jc w:val="both"/>
+        <w:rPr/>
+      </w:pPr>
+      <w:r>
+        <w:rPr>
+          <w:rFonts w:cs="Arial" w:ascii="Arial" w:hAnsi="Arial"/>
+          <w:sz w:val="18"/>
+          <w:szCs w:val="20"/>
+        </w:rPr>
+        <w:t>In the event that the exhibition, event or congress should, for any reason, be closed early or temporarily suspended, regardless of the will of the Organizing Secretariat, no compensation shall be due to the Sponsors on any grounds or for any reason.</w:t>
       </w:r>
     </w:p>
     <w:p>

</xml_diff>

<commit_message>
Contratto di sponsorizzazione: termini di cancellazione, risoluzione, riproduzione, art. 8-9 e doppia firma ex 1341-1342 c.c.
- Art. 3 rinominato Corrispettivo, modalita di pagamento e termini di
  cancellazione, con nuovo 3.3 (rinuncia e penale). La penale e la stessa
  della Domanda di ammissione: la caparra del contratto, altrimenti la
  penale dell evento.
- Seconda 7.4 rinumerata 7.5; nuovi 7.6 Modalita di risoluzione e 7.7
  Diritti di riproduzione; nuovi art. 8 Modifiche o variazioni e 9 Legge
  applicabile e foro competente.
- Il numero di pagine dichiarato e quello reale (contratto + Allegato 1):
  si genera, si contano le pagine e se serve si rigenera.
- Dopo le firme, approvazione specifica ex artt. 1341-1342 c.c. con
  seconda firma. Modelli IT ed EN (traduzione inglese da rivedere).

Co-Authored-By: Claude Opus 5.5 <noreply@anthropic.com>
</commit_message>
<xml_diff>
--- a/contracts/templates_pdf/template_contratto_sponsor_non_ecm_en.docx
+++ b/contracts/templates_pdf/template_contratto_sponsor_non_ecm_en.docx
@@ -2877,7 +2877,7 @@
           <w:bCs/>
           <w:sz w:val="18"/>
         </w:rPr>
-        <w:t xml:space="preserve">3. Consideration and payment terms </w:t>
+        <w:t xml:space="preserve">3. Consideration, payment terms and cancellation terms </w:t>
       </w:r>
     </w:p>
     <w:p>
@@ -2941,6 +2941,36 @@
           <w:sz w:val="18"/>
         </w:rPr>
         <w:t xml:space="preserve">The Organizing Secretariat guarantees and declares that the fee paid by the Sponsor, indicated in this Agreement, as regards its amount and payment terms, does not condition the content of the activities, but is intended to provide the financial support necessary for the success of the event itself</w:t>
+      </w:r>
+    </w:p>
+    <w:p>
+      <w:pPr>
+        <w:pStyle w:val="Normal"/>
+        <w:spacing w:before="0" w:after="0" w:line="230" w:lineRule="auto"/>
+        <w:jc w:val="both"/>
+        <w:rPr>
+          <w:rFonts w:ascii="Calibri" w:hAnsi="Calibri" w:cs="Calibri"/>
+          <w:b/>
+          <w:b/>
+          <w:bCs/>
+        </w:rPr>
+      </w:pPr>
+      <w:r>
+        <w:rPr>
+          <w:rFonts w:cs="Arial" w:ascii="Arial" w:hAnsi="Arial"/>
+          <w:b/>
+          <w:bCs/>
+          <w:sz w:val="18"/>
+        </w:rPr>
+        <w:t xml:space="preserve">3.3 </w:t>
+      </w:r>
+      <w:r>
+        <w:rPr>
+          <w:rFonts w:cs="Arial" w:ascii="Arial" w:hAnsi="Arial"/>
+          <w:iCs/>
+          <w:sz w:val="18"/>
+        </w:rPr>
+        <w:t>The Exhibitor's withdrawal from participation in the Event (and/or any total or partial changes or cancellations of the booking), for any reason whatsoever, must be notified by registered letter with return receipt or by certified e-mail (PEC) addressed to the Organiser at least 30 days before the start of the Event. In such case the Organiser shall be entitled to retain, as a penalty, an amount equal to {{ penale_percent }}% of the total amount of this agreement{% if has_deposit %} (corresponding to the security deposit/down payment){% endif %}. Should the withdrawal be received after the 30th day before the start of the Event, the Exhibitor shall be required to pay the full consideration of this agreement.</w:t>
       </w:r>
     </w:p>
     <w:p>
@@ -3499,7 +3529,7 @@
           <w:sz w:val="18"/>
           <w:szCs w:val="20"/>
         </w:rPr>
-        <w:t xml:space="preserve">7.4 </w:t>
+        <w:t xml:space="preserve">7.5 </w:t>
       </w:r>
       <w:r>
         <w:rPr>
@@ -3570,6 +3600,305 @@
           <w:b/>
           <w:b/>
           <w:bCs/>
+        </w:rPr>
+      </w:pPr>
+    </w:p>
+    <w:p>
+      <w:pPr>
+        <w:pStyle w:val="Normal"/>
+        <w:spacing w:before="0" w:after="0" w:line="230" w:lineRule="auto"/>
+        <w:jc w:val="both"/>
+        <w:rPr>
+          <w:rFonts w:ascii="Calibri" w:hAnsi="Calibri" w:cs="Calibri"/>
+          <w:b/>
+          <w:b/>
+          <w:bCs/>
+        </w:rPr>
+      </w:pPr>
+      <w:r>
+        <w:rPr>
+          <w:rFonts w:cs="Arial" w:ascii="Arial" w:hAnsi="Arial"/>
+          <w:b/>
+          <w:bCs/>
+          <w:sz w:val="18"/>
+        </w:rPr>
+        <w:t>7.6 TERMINATION</w:t>
+      </w:r>
+    </w:p>
+    <w:p>
+      <w:pPr>
+        <w:pStyle w:val="Normal"/>
+        <w:spacing w:before="0" w:after="0" w:line="230" w:lineRule="auto"/>
+        <w:jc w:val="both"/>
+        <w:rPr>
+          <w:rFonts w:ascii="Calibri" w:hAnsi="Calibri" w:cs="Calibri"/>
+          <w:b/>
+          <w:b/>
+          <w:bCs/>
+        </w:rPr>
+      </w:pPr>
+      <w:r>
+        <w:rPr>
+          <w:rFonts w:cs="Arial" w:ascii="Arial" w:hAnsi="Arial"/>
+          <w:iCs/>
+          <w:sz w:val="18"/>
+        </w:rPr>
+        <w:t>Any breach of the provisions of articles 2, 3, 4, 5, 7, 8 and 9 shall entitle the Organiser to unilaterally terminate this agreement with immediate effect pursuant to art. 1456 of the Italian Civil Code, by notice sent by registered letter with return receipt and/or certified e-mail (PEC), declaring its intention to avail itself of this express termination clause, without prejudice to compensation for any damages suffered.</w:t>
+      </w:r>
+    </w:p>
+    <w:p>
+      <w:pPr>
+        <w:pStyle w:val="Normal"/>
+        <w:spacing w:before="0" w:after="0" w:line="230" w:lineRule="auto"/>
+        <w:jc w:val="both"/>
+        <w:rPr>
+          <w:rFonts w:ascii="Calibri" w:hAnsi="Calibri" w:cs="Calibri"/>
+          <w:b/>
+          <w:b/>
+          <w:bCs/>
+        </w:rPr>
+      </w:pPr>
+      <w:r>
+        <w:rPr>
+          <w:rFonts w:cs="Arial" w:ascii="Arial" w:hAnsi="Arial"/>
+          <w:iCs/>
+          <w:sz w:val="18"/>
+        </w:rPr>
+        <w:t>Should the Organiser exercise its right of termination during the Event, the Exhibitor shall immediately cease all activities within the Exhibition Space and vacate it within the time indicated by the Organiser. In this regard the Exhibitor waives any objection, reserving the protection of its rights to any subsequent legal proceedings.</w:t>
+      </w:r>
+    </w:p>
+    <w:p>
+      <w:pPr>
+        <w:pStyle w:val="Normal"/>
+        <w:spacing w:before="0" w:after="0" w:line="230" w:lineRule="auto"/>
+        <w:jc w:val="both"/>
+        <w:rPr>
+          <w:rFonts w:ascii="Calibri" w:hAnsi="Calibri" w:cs="Calibri"/>
+          <w:b/>
+          <w:b/>
+          <w:bCs/>
+        </w:rPr>
+      </w:pPr>
+    </w:p>
+    <w:p>
+      <w:pPr>
+        <w:pStyle w:val="Normal"/>
+        <w:spacing w:before="0" w:after="0" w:line="230" w:lineRule="auto"/>
+        <w:jc w:val="both"/>
+        <w:rPr>
+          <w:rFonts w:ascii="Calibri" w:hAnsi="Calibri" w:cs="Calibri"/>
+          <w:b/>
+          <w:b/>
+          <w:bCs/>
+        </w:rPr>
+      </w:pPr>
+      <w:r>
+        <w:rPr>
+          <w:rFonts w:cs="Arial" w:ascii="Arial" w:hAnsi="Arial"/>
+          <w:b/>
+          <w:bCs/>
+          <w:sz w:val="18"/>
+        </w:rPr>
+        <w:t>7.7 REPRODUCTION RIGHTS</w:t>
+      </w:r>
+    </w:p>
+    <w:p>
+      <w:pPr>
+        <w:pStyle w:val="Normal"/>
+        <w:spacing w:before="0" w:after="0" w:line="230" w:lineRule="auto"/>
+        <w:jc w:val="both"/>
+        <w:rPr>
+          <w:rFonts w:ascii="Calibri" w:hAnsi="Calibri" w:cs="Calibri"/>
+          <w:b/>
+          <w:b/>
+          <w:bCs/>
+        </w:rPr>
+      </w:pPr>
+      <w:r>
+        <w:rPr>
+          <w:rFonts w:cs="Arial" w:ascii="Arial" w:hAnsi="Arial"/>
+          <w:iCs/>
+          <w:sz w:val="18"/>
+        </w:rPr>
+        <w:t>The Exhibitor gives its prior consent to the Organiser making graphic, photographic and/or film reproductions of the exhibition area of the halls and of everything contained therein.</w:t>
+      </w:r>
+    </w:p>
+    <w:p>
+      <w:pPr>
+        <w:pStyle w:val="Normal"/>
+        <w:spacing w:before="0" w:after="0" w:line="230" w:lineRule="auto"/>
+        <w:jc w:val="both"/>
+        <w:rPr>
+          <w:rFonts w:ascii="Calibri" w:hAnsi="Calibri" w:cs="Calibri"/>
+          <w:b/>
+          <w:b/>
+          <w:bCs/>
+        </w:rPr>
+      </w:pPr>
+    </w:p>
+    <w:p>
+      <w:pPr>
+        <w:pStyle w:val="Normal"/>
+        <w:spacing w:before="0" w:after="0" w:line="230" w:lineRule="auto"/>
+        <w:jc w:val="both"/>
+        <w:rPr>
+          <w:rFonts w:ascii="Calibri" w:hAnsi="Calibri" w:cs="Calibri"/>
+        </w:rPr>
+      </w:pPr>
+      <w:r>
+        <w:rPr>
+          <w:rFonts w:cs="Arial" w:ascii="Arial" w:hAnsi="Arial"/>
+          <w:b/>
+          <w:bCs/>
+          <w:sz w:val="18"/>
+        </w:rPr>
+        <w:t xml:space="preserve">8. Amendments or variations </w:t>
+      </w:r>
+    </w:p>
+    <w:p>
+      <w:pPr>
+        <w:pStyle w:val="Normal"/>
+        <w:spacing w:before="0" w:after="0" w:line="230" w:lineRule="auto"/>
+        <w:jc w:val="both"/>
+        <w:rPr>
+          <w:rFonts w:ascii="Calibri" w:hAnsi="Calibri" w:cs="Calibri"/>
+          <w:b/>
+          <w:b/>
+          <w:bCs/>
+        </w:rPr>
+      </w:pPr>
+      <w:r>
+        <w:rPr>
+          <w:rFonts w:cs="Arial" w:ascii="Arial" w:hAnsi="Arial"/>
+          <w:b/>
+          <w:bCs/>
+          <w:sz w:val="18"/>
+        </w:rPr>
+        <w:t xml:space="preserve">8.1 </w:t>
+      </w:r>
+      <w:r>
+        <w:rPr>
+          <w:rFonts w:cs="Arial" w:ascii="Arial" w:hAnsi="Arial"/>
+          <w:iCs/>
+          <w:sz w:val="18"/>
+        </w:rPr>
+        <w:t>Any derogation from this Agreement/Regulations shall be null and void and in any case without effect unless made in writing.</w:t>
+      </w:r>
+    </w:p>
+    <w:p>
+      <w:pPr>
+        <w:pStyle w:val="Normal"/>
+        <w:spacing w:before="0" w:after="0" w:line="230" w:lineRule="auto"/>
+        <w:jc w:val="both"/>
+        <w:rPr>
+          <w:rFonts w:ascii="Calibri" w:hAnsi="Calibri" w:cs="Calibri"/>
+          <w:b/>
+          <w:b/>
+          <w:bCs/>
+        </w:rPr>
+      </w:pPr>
+      <w:r>
+        <w:rPr>
+          <w:rFonts w:cs="Arial" w:ascii="Arial" w:hAnsi="Arial"/>
+          <w:iCs/>
+          <w:sz w:val="18"/>
+        </w:rPr>
+        <w:t>This document consists of {{ numero_pagine }} pages.</w:t>
+      </w:r>
+    </w:p>
+    <w:p>
+      <w:pPr>
+        <w:pStyle w:val="Normal"/>
+        <w:spacing w:before="0" w:after="0" w:line="230" w:lineRule="auto"/>
+        <w:jc w:val="both"/>
+        <w:rPr>
+          <w:rFonts w:ascii="Calibri" w:hAnsi="Calibri" w:cs="Calibri"/>
+          <w:b/>
+          <w:b/>
+          <w:bCs/>
+        </w:rPr>
+      </w:pPr>
+      <w:r>
+        <w:rPr>
+          <w:rFonts w:cs="Arial" w:ascii="Arial" w:hAnsi="Arial"/>
+          <w:iCs/>
+          <w:sz w:val="18"/>
+        </w:rPr>
+        <w:t>By signing these regulations, the Exhibitor declares to have read them and specifically approves their clauses.</w:t>
+      </w:r>
+    </w:p>
+    <w:p>
+      <w:pPr>
+        <w:pStyle w:val="Normal"/>
+        <w:spacing w:before="0" w:after="0" w:line="230" w:lineRule="auto"/>
+        <w:jc w:val="both"/>
+        <w:rPr>
+          <w:rFonts w:ascii="Calibri" w:hAnsi="Calibri" w:cs="Calibri"/>
+          <w:b/>
+          <w:b/>
+          <w:bCs/>
+        </w:rPr>
+      </w:pPr>
+    </w:p>
+    <w:p>
+      <w:pPr>
+        <w:pStyle w:val="Normal"/>
+        <w:spacing w:before="0" w:after="0" w:line="230" w:lineRule="auto"/>
+        <w:jc w:val="both"/>
+        <w:rPr>
+          <w:rFonts w:ascii="Calibri" w:hAnsi="Calibri" w:cs="Calibri"/>
+        </w:rPr>
+      </w:pPr>
+      <w:r>
+        <w:rPr>
+          <w:rFonts w:cs="Arial" w:ascii="Arial" w:hAnsi="Arial"/>
+          <w:b/>
+          <w:bCs/>
+          <w:sz w:val="18"/>
+        </w:rPr>
+        <w:t xml:space="preserve">9. Governing law and jurisdiction </w:t>
+      </w:r>
+    </w:p>
+    <w:p>
+      <w:pPr>
+        <w:pStyle w:val="Normal"/>
+        <w:spacing w:before="0" w:after="0" w:line="230" w:lineRule="auto"/>
+        <w:jc w:val="both"/>
+        <w:rPr>
+          <w:rFonts w:ascii="Calibri" w:hAnsi="Calibri" w:cs="Calibri"/>
+          <w:b/>
+          <w:b/>
+          <w:bCs/>
+        </w:rPr>
+      </w:pPr>
+      <w:r>
+        <w:rPr>
+          <w:rFonts w:cs="Arial" w:ascii="Arial" w:hAnsi="Arial"/>
+          <w:b/>
+          <w:bCs/>
+          <w:sz w:val="18"/>
+        </w:rPr>
+        <w:t xml:space="preserve">9.1 </w:t>
+      </w:r>
+      <w:r>
+        <w:rPr>
+          <w:rFonts w:cs="Arial" w:ascii="Arial" w:hAnsi="Arial"/>
+          <w:iCs/>
+          <w:sz w:val="18"/>
+        </w:rPr>
+        <w:t>This agreement is governed by Italian law. The Court of Bologna shall have exclusive jurisdiction over any legal disputes relating to or connected with the interpretation, performance and termination of this agreement or arising from the Exhibitor's participation in the Event.</w:t>
+      </w:r>
+    </w:p>
+    <w:p>
+      <w:pPr>
+        <w:pStyle w:val="Normal"/>
+        <w:spacing w:before="0" w:after="0" w:line="230" w:lineRule="auto"/>
+        <w:jc w:val="both"/>
+        <w:rPr>
+          <w:rFonts w:ascii="Calibri" w:hAnsi="Calibri" w:cs="Calibri"/>
+          <w:b/>
+          <w:b/>
+          <w:bCs/>
           <w:sz w:val="20"/>
           <w:szCs w:val="20"/>
         </w:rPr>
@@ -3659,6 +3988,343 @@
           <w:sz w:val="18"/>
         </w:rPr>
       </w:r>
+    </w:p>
+    <w:tbl>
+      <w:tblPr>
+        <w:tblW w:type="auto" w:w="0"/>
+        <w:tblLayout w:type="autofit"/>
+        <w:tblLook w:firstColumn="1" w:firstRow="1" w:lastColumn="0" w:lastRow="0" w:noHBand="0" w:noVBand="1" w:val="04A0"/>
+        <w:tblBorders>
+          <w:top w:val="nil"/>
+          <w:left w:val="nil"/>
+          <w:bottom w:val="nil"/>
+          <w:right w:val="nil"/>
+          <w:insideH w:val="nil"/>
+          <w:insideV w:val="nil"/>
+        </w:tblBorders>
+      </w:tblPr>
+      <w:tblGrid>
+        <w:gridCol w:w="5103"/>
+        <w:gridCol w:w="5103"/>
+      </w:tblGrid>
+      <w:tr>
+        <w:tc>
+          <w:tcPr>
+            <w:tcW w:type="dxa" w:w="4819"/>
+          </w:tcPr>
+          <w:p>
+            <w:pPr>
+              <w:pStyle w:val="Normal"/>
+              <w:keepNext/>
+              <w:keepLines/>
+              <w:spacing w:before="0" w:after="0" w:line="230" w:lineRule="auto"/>
+              <w:jc w:val="left"/>
+              <w:rPr>
+                <w:rFonts w:ascii="Calibri" w:hAnsi="Calibri" w:cs="Calibri"/>
+              </w:rPr>
+            </w:pPr>
+            <w:r>
+              <w:rPr>
+                <w:rFonts w:cs="Arial" w:ascii="Arial" w:hAnsi="Arial"/>
+                <w:b/>
+                <w:bCs/>
+                <w:sz w:val="18"/>
+              </w:rPr>
+              <w:t xml:space="preserve">Organizing Secretariat: </w:t>
+            </w:r>
+          </w:p>
+          <w:p>
+            <w:pPr>
+              <w:pStyle w:val="Normal"/>
+              <w:keepNext/>
+              <w:keepLines/>
+              <w:spacing w:before="0" w:after="0" w:line="230" w:lineRule="auto"/>
+              <w:jc w:val="left"/>
+              <w:rPr>
+                <w:rFonts w:ascii="Calibri" w:hAnsi="Calibri" w:cs="Calibri"/>
+              </w:rPr>
+            </w:pPr>
+            <w:r>
+              <w:rPr>
+                <w:rFonts w:cs="Arial" w:ascii="Arial" w:hAnsi="Arial"/>
+                <w:sz w:val="18"/>
+              </w:rPr>
+              <w:t xml:space="preserve">{{ organizer_name or "VALET SRL" }} </w:t>
+            </w:r>
+          </w:p>
+          <w:p>
+            <w:pPr>
+              <w:pStyle w:val="Normal"/>
+              <w:keepNext/>
+              <w:keepLines/>
+              <w:spacing w:before="0" w:after="0" w:line="230" w:lineRule="auto"/>
+              <w:jc w:val="left"/>
+              <w:rPr>
+                <w:rFonts w:ascii="Calibri" w:hAnsi="Calibri" w:cs="Calibri"/>
+              </w:rPr>
+            </w:pPr>
+            <w:r>
+              <w:rPr>
+                <w:rFonts w:ascii="Arial" w:hAnsi="Arial" w:cs="Arial"/>
+                <w:sz w:val="18"/>
+              </w:rPr>
+              <w:drawing>
+                <wp:anchor behindDoc="1" distT="0" distB="0" distL="114935" distR="114935" simplePos="0" locked="0" layoutInCell="0" allowOverlap="1" relativeHeight="2">
+                  <wp:simplePos x="0" y="0"/>
+                  <wp:positionH relativeFrom="column">
+                    <wp:posOffset>0</wp:posOffset>
+                  </wp:positionH>
+                  <wp:positionV relativeFrom="paragraph">
+                    <wp:posOffset>107315</wp:posOffset>
+                  </wp:positionV>
+                  <wp:extent cx="1489710" cy="590550"/>
+                  <wp:effectExtent l="0" t="0" r="0" b="0"/>
+                  <wp:wrapNone/>
+                  <wp:docPr id="1" name="Image1" descr=""/>
+                  <wp:cNvGraphicFramePr>
+                    <a:graphicFrameLocks xmlns:a="http://schemas.openxmlformats.org/drawingml/2006/main" noChangeAspect="1"/>
+                  </wp:cNvGraphicFramePr>
+                  <a:graphic xmlns:a="http://schemas.openxmlformats.org/drawingml/2006/main">
+                    <a:graphicData uri="http://schemas.openxmlformats.org/drawingml/2006/picture">
+                      <pic:pic xmlns:pic="http://schemas.openxmlformats.org/drawingml/2006/picture">
+                        <pic:nvPicPr>
+                          <pic:cNvPr id="1" name="Image1" descr=""/>
+                          <pic:cNvPicPr>
+                            <a:picLocks noChangeAspect="1" noChangeArrowheads="1"/>
+                          </pic:cNvPicPr>
+                        </pic:nvPicPr>
+                        <pic:blipFill>
+                          <a:blip r:embed="rId2"/>
+                          <a:srcRect l="-12" t="-31" r="-12" b="-31"/>
+                          <a:stretch>
+                            <a:fillRect/>
+                          </a:stretch>
+                        </pic:blipFill>
+                        <pic:spPr bwMode="auto">
+                          <a:xfrm>
+                            <a:off x="0" y="0"/>
+                            <a:ext cx="1489710" cy="590550"/>
+                          </a:xfrm>
+                          <a:prstGeom prst="rect">
+                            <a:avLst/>
+                          </a:prstGeom>
+                        </pic:spPr>
+                      </pic:pic>
+                    </a:graphicData>
+                  </a:graphic>
+                </wp:anchor>
+              </w:drawing>
+            </w:r>
+            <w:r>
+              <w:rPr>
+                <w:rFonts w:cs="Arial" w:ascii="Arial" w:hAnsi="Arial"/>
+                <w:sz w:val="18"/>
+              </w:rPr>
+              <w:t xml:space="preserve">The Legal Representative</w:t>
+            </w:r>
+          </w:p>
+          <w:p>
+            <w:pPr>
+              <w:pStyle w:val="Normal"/>
+              <w:keepNext/>
+              <w:keepLines/>
+              <w:spacing w:before="0" w:after="0" w:line="230" w:lineRule="auto"/>
+              <w:jc w:val="left"/>
+              <w:rPr>
+                <w:rFonts w:ascii="Calibri" w:hAnsi="Calibri" w:cs="Calibri"/>
+              </w:rPr>
+            </w:pPr>
+            <w:r>
+              <w:rPr>
+                <w:rFonts w:cs="Arial" w:ascii="Arial" w:hAnsi="Arial"/>
+                <w:sz w:val="18"/>
+              </w:rPr>
+              <w:t xml:space="preserve">(Daniele Morini)</w:t>
+            </w:r>
+          </w:p>
+          <w:p>
+            <w:pPr>
+              <w:pStyle w:val="Normal"/>
+              <w:keepNext w:val="0"/>
+              <w:keepLines/>
+              <w:spacing w:before="0" w:after="0" w:line="230" w:lineRule="auto"/>
+              <w:jc w:val="left"/>
+              <w:rPr>
+                <w:rFonts w:ascii="Calibri" w:hAnsi="Calibri" w:cs="Calibri"/>
+              </w:rPr>
+            </w:pPr>
+            <w:r>
+              <w:rPr>
+                <w:rFonts w:cs="Arial" w:ascii="Arial" w:hAnsi="Arial"/>
+                <w:sz w:val="18"/>
+              </w:rPr>
+              <w:t xml:space="preserve">____________________</w:t>
+            </w:r>
+          </w:p>
+        </w:tc>
+        <w:tc>
+          <w:tcPr>
+            <w:tcW w:type="dxa" w:w="4819"/>
+          </w:tcPr>
+          <w:p>
+            <w:pPr>
+              <w:jc w:val="center"/>
+            </w:pPr>
+            <w:r>
+              <w:rPr>
+                <w:rFonts w:ascii="Arial" w:hAnsi="Arial"/>
+                <w:b/>
+                <w:color w:val="000000"/>
+                <w:sz w:val="18"/>
+              </w:rPr>
+              <w:t xml:space="preserve">Sponsor</w:t>
+            </w:r>
+          </w:p>
+          <w:p>
+            <w:pPr>
+              <w:keepNext/>
+              <w:keepLines/>
+              <w:spacing w:before="0" w:after="0"/>
+              <w:jc w:val="center"/>
+            </w:pPr>
+            <w:r>
+              <w:rPr>
+                <w:rFonts w:ascii="Arial" w:hAnsi="Arial" w:cs="Arial"/>
+                <w:b/>
+                <w:sz w:val="18"/>
+              </w:rPr>
+              <w:t xml:space="preserve">{{ sponsor.legal_name }}</w:t>
+            </w:r>
+          </w:p>
+          <w:p>
+            <w:pPr>
+              <w:keepNext/>
+              <w:keepLines/>
+              <w:spacing w:before="0" w:after="0"/>
+              <w:jc w:val="center"/>
+            </w:pPr>
+            <w:r>
+              <w:rPr>
+                <w:rFonts w:ascii="Arial" w:hAnsi="Arial" w:cs="Arial"/>
+                <w:b/>
+                <w:sz w:val="18"/>
+              </w:rPr>
+              <w:t xml:space="preserve">{% if signer.full_name %}{{ signer.full_name }}{% endif %}</w:t>
+            </w:r>
+          </w:p>
+          <w:p>
+            <w:pPr>
+              <w:keepNext/>
+              <w:keepLines/>
+              <w:spacing w:before="0" w:after="0"/>
+              <w:jc w:val="center"/>
+            </w:pPr>
+            <w:r>
+              <w:rPr>
+                <w:rFonts w:ascii="Arial" w:hAnsi="Arial" w:cs="Arial"/>
+                <w:b w:val="0"/>
+                <w:sz w:val="18"/>
+              </w:rPr>
+              <w:t xml:space="preserve">_______________________________</w:t>
+            </w:r>
+          </w:p>
+        </w:tc>
+      </w:tr>
+    </w:tbl>
+    <w:p>
+      <w:pPr>
+        <w:pStyle w:val="Normal"/>
+        <w:spacing w:before="0" w:after="0" w:line="230" w:lineRule="auto"/>
+        <w:jc w:val="both"/>
+        <w:rPr>
+          <w:rFonts w:ascii="Calibri" w:hAnsi="Calibri" w:cs="Calibri"/>
+          <w:b/>
+          <w:b/>
+          <w:bCs/>
+        </w:rPr>
+      </w:pPr>
+    </w:p>
+    <w:p>
+      <w:pPr>
+        <w:pStyle w:val="Normal"/>
+        <w:spacing w:before="0" w:after="0" w:line="230" w:lineRule="auto"/>
+        <w:jc w:val="both"/>
+        <w:rPr>
+          <w:rFonts w:ascii="Calibri" w:hAnsi="Calibri" w:cs="Calibri"/>
+          <w:b/>
+          <w:b/>
+          <w:bCs/>
+        </w:rPr>
+      </w:pPr>
+    </w:p>
+    <w:p>
+      <w:pPr>
+        <w:pStyle w:val="Normal"/>
+        <w:spacing w:before="0" w:after="0" w:line="230" w:lineRule="auto"/>
+        <w:jc w:val="both"/>
+        <w:rPr>
+          <w:rFonts w:ascii="Calibri" w:hAnsi="Calibri" w:cs="Calibri"/>
+          <w:b/>
+          <w:b/>
+          <w:bCs/>
+        </w:rPr>
+      </w:pPr>
+      <w:r>
+        <w:rPr>
+          <w:rFonts w:cs="Arial" w:ascii="Arial" w:hAnsi="Arial"/>
+          <w:iCs/>
+          <w:sz w:val="18"/>
+        </w:rPr>
+        <w:t>The parties, by mutual agreement, after carefully reading the registration rules and the terms contained in this agreement, acknowledging that each clause has been the subject and result of extensive and thorough negotiation, to the extent necessary and for all legal purposes, including the provisions of articles 1341 and 1342 of the Italian Civil Code, declare that they have read, approve and fully accept the provisions relating to:</w:t>
+      </w:r>
+    </w:p>
+    <w:p>
+      <w:pPr>
+        <w:pStyle w:val="Normal"/>
+        <w:spacing w:before="0" w:after="0" w:line="230" w:lineRule="auto"/>
+        <w:jc w:val="both"/>
+        <w:rPr>
+          <w:rFonts w:ascii="Calibri" w:hAnsi="Calibri" w:cs="Calibri"/>
+          <w:b/>
+          <w:b/>
+          <w:bCs/>
+        </w:rPr>
+      </w:pPr>
+      <w:r>
+        <w:rPr>
+          <w:rFonts w:cs="Arial" w:ascii="Arial" w:hAnsi="Arial"/>
+          <w:b/>
+          <w:bCs/>
+          <w:sz w:val="18"/>
+        </w:rPr>
+        <w:t>3. Consideration, payment terms and cancellation terms; 4. Term and Termination of the Agreement; 5. Confidentiality and non-disclosure; 7. Miscellaneous; 8. Amendments or variations; 9. Governing law and jurisdiction;</w:t>
+      </w:r>
+    </w:p>
+    <w:p>
+      <w:pPr>
+        <w:pStyle w:val="Normal"/>
+        <w:spacing w:before="0" w:after="0" w:line="230" w:lineRule="auto"/>
+        <w:jc w:val="both"/>
+        <w:rPr>
+          <w:rFonts w:ascii="Calibri" w:hAnsi="Calibri" w:cs="Calibri"/>
+          <w:b/>
+          <w:b/>
+          <w:bCs/>
+        </w:rPr>
+      </w:pPr>
+    </w:p>
+    <w:p>
+      <w:pPr>
+        <w:pStyle w:val="Normal"/>
+        <w:spacing w:before="0" w:after="0" w:line="230" w:lineRule="auto"/>
+        <w:jc w:val="both"/>
+        <w:rPr>
+          <w:rFonts w:ascii="Calibri" w:hAnsi="Calibri" w:cs="Calibri"/>
+          <w:b/>
+          <w:b/>
+          <w:bCs/>
+        </w:rPr>
+      </w:pPr>
     </w:p>
     <w:tbl>
       <w:tblPr>

</xml_diff>

<commit_message>
Contratto: tabella delle parti con i valori su una riga sola
Colonne ridistribuite nei modelli IT/EN (data di nascita ed email piu
larghe, dall ultima colonna che ha solo sigle e numeri brevi) e, alla
generazione, carattere ridotto solo nella casella il cui testo non ci
starebbe (minimo 7 pt).

Co-Authored-By: Claude Opus 5.5 <noreply@anthropic.com>
</commit_message>
<xml_diff>
--- a/contracts/templates_pdf/template_contratto_sponsor_non_ecm_en.docx
+++ b/contracts/templates_pdf/template_contratto_sponsor_non_ecm_en.docx
@@ -503,21 +503,21 @@
         <w:gridCol w:w="643"/>
         <w:gridCol w:w="195"/>
         <w:gridCol w:w="98"/>
-        <w:gridCol w:w="641"/>
+        <w:gridCol w:w="1041"/>
         <w:gridCol w:w="542"/>
         <w:gridCol w:w="303"/>
-        <w:gridCol w:w="992"/>
+        <w:gridCol w:w="1492"/>
         <w:gridCol w:w="284"/>
         <w:gridCol w:w="1275"/>
         <w:gridCol w:w="709"/>
         <w:gridCol w:w="284"/>
-        <w:gridCol w:w="3089"/>
+        <w:gridCol w:w="2189"/>
       </w:tblGrid>
       <w:tr>
         <w:trPr/>
         <w:tc>
           <w:tcPr>
-            <w:tcW w:w="3114" w:type="dxa"/>
+            <w:tcW w:w="3514" w:type="dxa"/>
             <w:gridSpan w:val="7"/>
             <w:tcBorders>
               <w:top w:val="single" w:sz="4" w:space="0" w:color="000000"/>
@@ -560,7 +560,7 @@
         </w:tc>
         <w:tc>
           <w:tcPr>
-            <w:tcW w:w="6633" w:type="dxa"/>
+            <w:tcW w:w="6233" w:type="dxa"/>
             <w:gridSpan w:val="6"/>
             <w:tcBorders>
               <w:top w:val="single" w:sz="4" w:space="0" w:color="000000"/>
@@ -592,7 +592,7 @@
         <w:trPr/>
         <w:tc>
           <w:tcPr>
-            <w:tcW w:w="3114" w:type="dxa"/>
+            <w:tcW w:w="3514" w:type="dxa"/>
             <w:gridSpan w:val="7"/>
             <w:tcBorders>
               <w:top w:val="single" w:sz="4" w:space="0" w:color="000000"/>
@@ -635,7 +635,7 @@
         </w:tc>
         <w:tc>
           <w:tcPr>
-            <w:tcW w:w="6633" w:type="dxa"/>
+            <w:tcW w:w="6233" w:type="dxa"/>
             <w:gridSpan w:val="6"/>
             <w:tcBorders>
               <w:top w:val="single" w:sz="4" w:space="0" w:color="000000"/>
@@ -667,7 +667,7 @@
         <w:trPr/>
         <w:tc>
           <w:tcPr>
-            <w:tcW w:w="3114" w:type="dxa"/>
+            <w:tcW w:w="3514" w:type="dxa"/>
             <w:gridSpan w:val="7"/>
             <w:tcBorders>
               <w:top w:val="single" w:sz="4" w:space="0" w:color="000000"/>
@@ -697,7 +697,7 @@
         </w:tc>
         <w:tc>
           <w:tcPr>
-            <w:tcW w:w="6633" w:type="dxa"/>
+            <w:tcW w:w="6233" w:type="dxa"/>
             <w:gridSpan w:val="6"/>
             <w:tcBorders>
               <w:top w:val="single" w:sz="4" w:space="0" w:color="000000"/>
@@ -787,7 +787,7 @@
         </w:tc>
         <w:tc>
           <w:tcPr>
-            <w:tcW w:w="739" w:type="dxa"/>
+            <w:tcW w:w="1139" w:type="dxa"/>
             <w:gridSpan w:val="2"/>
             <w:tcBorders>
               <w:top w:val="single" w:sz="4" w:space="0" w:color="000000"/>
@@ -849,7 +849,7 @@
         </w:tc>
         <w:tc>
           <w:tcPr>
-            <w:tcW w:w="992" w:type="dxa"/>
+            <w:tcW w:w="1492" w:type="dxa"/>
             <w:tcBorders>
               <w:top w:val="single" w:sz="4" w:space="0" w:color="000000"/>
               <w:left w:val="single" w:sz="4" w:space="0" w:color="000000"/>
@@ -936,7 +936,7 @@
         </w:tc>
         <w:tc>
           <w:tcPr>
-            <w:tcW w:w="3373" w:type="dxa"/>
+            <w:tcW w:w="2473" w:type="dxa"/>
             <w:gridSpan w:val="2"/>
             <w:tcBorders>
               <w:top w:val="single" w:sz="4" w:space="0" w:color="000000"/>
@@ -998,7 +998,7 @@
         </w:tc>
         <w:tc>
           <w:tcPr>
-            <w:tcW w:w="2478" w:type="dxa"/>
+            <w:tcW w:w="3378" w:type="dxa"/>
             <w:gridSpan w:val="4"/>
             <w:tcBorders>
               <w:top w:val="single" w:sz="4" w:space="0" w:color="000000"/>
@@ -1057,7 +1057,7 @@
         </w:tc>
         <w:tc>
           <w:tcPr>
-            <w:tcW w:w="4082" w:type="dxa"/>
+            <w:tcW w:w="3182" w:type="dxa"/>
             <w:gridSpan w:val="3"/>
             <w:tcBorders>
               <w:top w:val="single" w:sz="4" w:space="0" w:color="000000"/>
@@ -1089,7 +1089,7 @@
         <w:trPr/>
         <w:tc>
           <w:tcPr>
-            <w:tcW w:w="3114" w:type="dxa"/>
+            <w:tcW w:w="3514" w:type="dxa"/>
             <w:gridSpan w:val="7"/>
             <w:tcBorders>
               <w:top w:val="single" w:sz="4" w:space="0" w:color="000000"/>
@@ -1142,7 +1142,7 @@
         </w:tc>
         <w:tc>
           <w:tcPr>
-            <w:tcW w:w="2551" w:type="dxa"/>
+            <w:tcW w:w="3051" w:type="dxa"/>
             <w:gridSpan w:val="3"/>
             <w:tcBorders>
               <w:top w:val="single" w:sz="4" w:space="0" w:color="000000"/>
@@ -1202,7 +1202,7 @@
         </w:tc>
         <w:tc>
           <w:tcPr>
-            <w:tcW w:w="3089" w:type="dxa"/>
+            <w:tcW w:w="2189" w:type="dxa"/>
             <w:tcBorders>
               <w:top w:val="single" w:sz="4" w:space="0" w:color="000000"/>
               <w:left w:val="single" w:sz="4" w:space="0" w:color="000000"/>
@@ -1234,7 +1234,7 @@
         <w:trPr/>
         <w:tc>
           <w:tcPr>
-            <w:tcW w:w="5665" w:type="dxa"/>
+            <w:tcW w:w="6565" w:type="dxa"/>
             <w:gridSpan w:val="10"/>
             <w:tcBorders>
               <w:top w:val="single" w:sz="4" w:space="0" w:color="000000"/>
@@ -1264,7 +1264,7 @@
         </w:tc>
         <w:tc>
           <w:tcPr>
-            <w:tcW w:w="4082" w:type="dxa"/>
+            <w:tcW w:w="3182" w:type="dxa"/>
             <w:gridSpan w:val="3"/>
             <w:tcBorders>
               <w:top w:val="single" w:sz="4" w:space="0" w:color="000000"/>
@@ -1339,7 +1339,7 @@
         </w:tc>
         <w:tc>
           <w:tcPr>
-            <w:tcW w:w="934" w:type="dxa"/>
+            <w:tcW w:w="1334" w:type="dxa"/>
             <w:gridSpan w:val="3"/>
             <w:tcBorders>
               <w:top w:val="single" w:sz="4" w:space="0" w:color="000000"/>
@@ -1398,7 +1398,7 @@
         </w:tc>
         <w:tc>
           <w:tcPr>
-            <w:tcW w:w="2854" w:type="dxa"/>
+            <w:tcW w:w="3354" w:type="dxa"/>
             <w:gridSpan w:val="4"/>
             <w:tcBorders>
               <w:top w:val="single" w:sz="4" w:space="0" w:color="000000"/>
@@ -1458,7 +1458,7 @@
         </w:tc>
         <w:tc>
           <w:tcPr>
-            <w:tcW w:w="3089" w:type="dxa"/>
+            <w:tcW w:w="2189" w:type="dxa"/>
             <w:tcBorders>
               <w:top w:val="single" w:sz="4" w:space="0" w:color="000000"/>
               <w:left w:val="single" w:sz="4" w:space="0" w:color="000000"/>
@@ -1490,7 +1490,7 @@
         <w:trPr/>
         <w:tc>
           <w:tcPr>
-            <w:tcW w:w="2269" w:type="dxa"/>
+            <w:tcW w:w="2669" w:type="dxa"/>
             <w:gridSpan w:val="5"/>
             <w:tcBorders>
               <w:top w:val="single" w:sz="4" w:space="0" w:color="000000"/>
@@ -1520,7 +1520,7 @@
         </w:tc>
         <w:tc>
           <w:tcPr>
-            <w:tcW w:w="3396" w:type="dxa"/>
+            <w:tcW w:w="3896" w:type="dxa"/>
             <w:gridSpan w:val="5"/>
             <w:tcBorders>
               <w:top w:val="single" w:sz="4" w:space="0" w:color="000000"/>
@@ -1580,7 +1580,7 @@
         </w:tc>
         <w:tc>
           <w:tcPr>
-            <w:tcW w:w="3089" w:type="dxa"/>
+            <w:tcW w:w="2189" w:type="dxa"/>
             <w:tcBorders>
               <w:top w:val="single" w:sz="4" w:space="0" w:color="000000"/>
               <w:left w:val="single" w:sz="4" w:space="0" w:color="000000"/>
@@ -1612,7 +1612,7 @@
         <w:trPr/>
         <w:tc>
           <w:tcPr>
-            <w:tcW w:w="2269" w:type="dxa"/>
+            <w:tcW w:w="2669" w:type="dxa"/>
             <w:gridSpan w:val="5"/>
             <w:tcBorders>
               <w:top w:val="single" w:sz="4" w:space="0" w:color="000000"/>
@@ -1642,7 +1642,7 @@
         </w:tc>
         <w:tc>
           <w:tcPr>
-            <w:tcW w:w="3396" w:type="dxa"/>
+            <w:tcW w:w="3896" w:type="dxa"/>
             <w:gridSpan w:val="5"/>
             <w:tcBorders>
               <w:top w:val="single" w:sz="4" w:space="0" w:color="000000"/>
@@ -1702,7 +1702,7 @@
         </w:tc>
         <w:tc>
           <w:tcPr>
-            <w:tcW w:w="3089" w:type="dxa"/>
+            <w:tcW w:w="2189" w:type="dxa"/>
             <w:tcBorders>
               <w:top w:val="single" w:sz="4" w:space="0" w:color="000000"/>
               <w:left w:val="single" w:sz="4" w:space="0" w:color="000000"/>
@@ -1734,7 +1734,7 @@
         <w:trPr/>
         <w:tc>
           <w:tcPr>
-            <w:tcW w:w="2269" w:type="dxa"/>
+            <w:tcW w:w="2669" w:type="dxa"/>
             <w:gridSpan w:val="5"/>
             <w:tcBorders>
               <w:top w:val="single" w:sz="4" w:space="0" w:color="000000"/>
@@ -1764,7 +1764,7 @@
         </w:tc>
         <w:tc>
           <w:tcPr>
-            <w:tcW w:w="2121" w:type="dxa"/>
+            <w:tcW w:w="2621" w:type="dxa"/>
             <w:gridSpan w:val="4"/>
             <w:tcBorders>
               <w:top w:val="single" w:sz="4" w:space="0" w:color="000000"/>
@@ -1823,7 +1823,7 @@
         </w:tc>
         <w:tc>
           <w:tcPr>
-            <w:tcW w:w="4082" w:type="dxa"/>
+            <w:tcW w:w="3182" w:type="dxa"/>
             <w:gridSpan w:val="3"/>
             <w:tcBorders>
               <w:top w:val="single" w:sz="4" w:space="0" w:color="000000"/>

</xml_diff>

<commit_message>
Contratti: Bologna e data anche prima della seconda firma; beneficiario del bonifico con la ragione sociale completa VALET; note degli orari legate al loro giorno
- Contratto di sponsorizzazione IT/EN: Bologna, data prima della firma che
  segue la dichiarazione ex artt. 1341-1342.
- Domanda: BENEFICIARIO = VALET Societa a Responsabilita Limitata quando
  l organizzatore e VALET (comunque scritto) o non indicato; altrimenti il
  nome dell organizzatore dell evento, come prima.
- Allegato 2: la nota di un giorno ha lo stesso fondo della riga del giorno,
  nessuna linea fra le due e l etichetta Nota per <giorno data>.

Co-Authored-By: Claude Opus 5.5 <noreply@anthropic.com>
</commit_message>
<xml_diff>
--- a/contracts/templates_pdf/template_contratto_sponsor_non_ecm_en.docx
+++ b/contracts/templates_pdf/template_contratto_sponsor_non_ecm_en.docx
@@ -4325,6 +4325,23 @@
           <w:bCs/>
         </w:rPr>
       </w:pPr>
+    </w:p>
+    <w:p>
+      <w:pPr>
+        <w:pStyle w:val="Normal"/>
+        <w:spacing w:before="0" w:after="0" w:line="230" w:lineRule="auto"/>
+        <w:jc w:val="both"/>
+        <w:rPr>
+          <w:rFonts w:ascii="Calibri" w:hAnsi="Calibri" w:cs="Calibri"/>
+        </w:rPr>
+      </w:pPr>
+      <w:r>
+        <w:rPr>
+          <w:rFonts w:cs="Arial" w:ascii="Arial" w:hAnsi="Arial"/>
+          <w:sz w:val="18"/>
+        </w:rPr>
+        <w:t xml:space="preserve">Bologna,  {{ contract.signed_date|format_date|default('___________', true) }}</w:t>
+      </w:r>
     </w:p>
     <w:tbl>
       <w:tblPr>

</xml_diff>

<commit_message>
Contratto: riga di stacco fra Bologna, data e la seconda firma
Co-Authored-By: Claude Opus 5.5 <noreply@anthropic.com>
</commit_message>
<xml_diff>
--- a/contracts/templates_pdf/template_contratto_sponsor_non_ecm_en.docx
+++ b/contracts/templates_pdf/template_contratto_sponsor_non_ecm_en.docx
@@ -4342,6 +4342,16 @@
         </w:rPr>
         <w:t xml:space="preserve">Bologna,  {{ contract.signed_date|format_date|default('___________', true) }}</w:t>
       </w:r>
+    </w:p>
+    <w:p>
+      <w:pPr>
+        <w:pStyle w:val="Normal"/>
+        <w:spacing w:before="0" w:after="0" w:line="230" w:lineRule="auto"/>
+        <w:jc w:val="both"/>
+        <w:rPr>
+          <w:rFonts w:ascii="Calibri" w:hAnsi="Calibri" w:cs="Calibri"/>
+        </w:rPr>
+      </w:pPr>
     </w:p>
     <w:tbl>
       <w:tblPr>

</xml_diff>

<commit_message>
Contratto: art. 8-10 (altoparlanti, azioni promo-pubblicitarie, riconsegna e rifiuti) spostati dal Regolamento tecnico; Allegato 2 con Stand/Contratto/Accesso in una tabellina
- Contratto IT/EN: nuovi art. 8, 9, 10; vecchi 8 e 9 ora 11 e 12; 7.6
  aggiornato; dichiarazione ex 1341-1342 con i nuovi capitoli, elenco sulla
  stessa riga e non in grassetto.
- Allegato 2: Azienda su una riga, poi Stand n. | Contratto n. | Accesso al
  padiglione n. in una tabella a una riga a tutta larghezza.

Co-Authored-By: Claude Opus 5.5 <noreply@anthropic.com>
</commit_message>
<xml_diff>
--- a/contracts/templates_pdf/template_contratto_sponsor_non_ecm_en.docx
+++ b/contracts/templates_pdf/template_contratto_sponsor_non_ecm_en.docx
@@ -3643,7 +3643,7 @@
           <w:iCs/>
           <w:sz w:val="18"/>
         </w:rPr>
-        <w:t>Any breach of the provisions of articles 2, 3, 4, 5, 7, 8 and 9 shall entitle the Organiser to unilaterally terminate this agreement with immediate effect pursuant to art. 1456 of the Italian Civil Code, by notice sent by registered letter with return receipt and/or certified e-mail (PEC), declaring its intention to avail itself of this express termination clause, without prejudice to compensation for any damages suffered.</w:t>
+        <w:t>Any breach of the provisions of articles 2, 3, 4, 5, 7, 8, 9, 10, 11 and 12 shall entitle the Organiser to unilaterally terminate this agreement with immediate effect pursuant to art. 1456 of the Italian Civil Code, by notice sent by registered letter with return receipt and/or certified e-mail (PEC), declaring its intention to avail itself of this express termination clause, without prejudice to compensation for any damages suffered.</w:t>
       </w:r>
     </w:p>
     <w:p>
@@ -3752,7 +3752,7 @@
           <w:bCs/>
           <w:sz w:val="18"/>
         </w:rPr>
-        <w:t xml:space="preserve">8. Amendments or variations </w:t>
+        <w:t xml:space="preserve">8. Loudspeakers - Sound broadcasts </w:t>
       </w:r>
     </w:p>
     <w:p>
@@ -3782,6 +3782,282 @@
           <w:iCs/>
           <w:sz w:val="18"/>
         </w:rPr>
+        <w:t>Sound broadcasts are permitted within the Exhibitor's own space, including the use of radio receivers and television sets, provided they do not cause disturbance (SIAE fees payable by the exhibiting company). To this end the Organiser reserves the right to determine the volume of sound broadcasts.</w:t>
+      </w:r>
+    </w:p>
+    <w:p>
+      <w:pPr>
+        <w:pStyle w:val="Normal"/>
+        <w:spacing w:before="0" w:after="0" w:line="230" w:lineRule="auto"/>
+        <w:jc w:val="both"/>
+        <w:rPr>
+          <w:rFonts w:ascii="Calibri" w:hAnsi="Calibri" w:cs="Calibri"/>
+          <w:b/>
+          <w:b/>
+          <w:bCs/>
+        </w:rPr>
+      </w:pPr>
+      <w:r>
+        <w:rPr>
+          <w:rFonts w:cs="Arial" w:ascii="Arial" w:hAnsi="Arial"/>
+          <w:b/>
+          <w:bCs/>
+          <w:sz w:val="18"/>
+        </w:rPr>
+        <w:t xml:space="preserve">8.2 </w:t>
+      </w:r>
+      <w:r>
+        <w:rPr>
+          <w:rFonts w:cs="Arial" w:ascii="Arial" w:hAnsi="Arial"/>
+          <w:iCs/>
+          <w:sz w:val="18"/>
+        </w:rPr>
+        <w:t>The Organiser may use the loudspeakers installed in the exhibition centre for official announcements or in case of emergency.</w:t>
+      </w:r>
+    </w:p>
+    <w:p>
+      <w:pPr>
+        <w:pStyle w:val="Normal"/>
+        <w:spacing w:before="0" w:after="0" w:line="230" w:lineRule="auto"/>
+        <w:jc w:val="both"/>
+        <w:rPr>
+          <w:rFonts w:ascii="Calibri" w:hAnsi="Calibri" w:cs="Calibri"/>
+          <w:b/>
+          <w:b/>
+          <w:bCs/>
+        </w:rPr>
+      </w:pPr>
+    </w:p>
+    <w:p>
+      <w:pPr>
+        <w:pStyle w:val="Normal"/>
+        <w:spacing w:before="0" w:after="0" w:line="230" w:lineRule="auto"/>
+        <w:jc w:val="both"/>
+        <w:rPr>
+          <w:rFonts w:ascii="Calibri" w:hAnsi="Calibri" w:cs="Calibri"/>
+        </w:rPr>
+      </w:pPr>
+      <w:r>
+        <w:rPr>
+          <w:rFonts w:cs="Arial" w:ascii="Arial" w:hAnsi="Arial"/>
+          <w:b/>
+          <w:bCs/>
+          <w:sz w:val="18"/>
+        </w:rPr>
+        <w:t xml:space="preserve">9. Promotional and advertising activities </w:t>
+      </w:r>
+    </w:p>
+    <w:p>
+      <w:pPr>
+        <w:pStyle w:val="Normal"/>
+        <w:spacing w:before="0" w:after="0" w:line="230" w:lineRule="auto"/>
+        <w:jc w:val="both"/>
+        <w:rPr>
+          <w:rFonts w:ascii="Calibri" w:hAnsi="Calibri" w:cs="Calibri"/>
+          <w:b/>
+          <w:b/>
+          <w:bCs/>
+        </w:rPr>
+      </w:pPr>
+      <w:r>
+        <w:rPr>
+          <w:rFonts w:cs="Arial" w:ascii="Arial" w:hAnsi="Arial"/>
+          <w:b/>
+          <w:bCs/>
+          <w:sz w:val="18"/>
+        </w:rPr>
+        <w:t xml:space="preserve">9.1 </w:t>
+      </w:r>
+      <w:r>
+        <w:rPr>
+          <w:rFonts w:cs="Arial" w:ascii="Arial" w:hAnsi="Arial"/>
+          <w:iCs/>
+          <w:sz w:val="18"/>
+        </w:rPr>
+        <w:t>As regards advertising, except for advertising within the Exhibitor's own space, the Organiser reserves the exclusive right to promote and manage advertising for the event, also with the collaboration of specialised agencies.</w:t>
+      </w:r>
+    </w:p>
+    <w:p>
+      <w:pPr>
+        <w:pStyle w:val="Normal"/>
+        <w:spacing w:before="0" w:after="0" w:line="230" w:lineRule="auto"/>
+        <w:jc w:val="both"/>
+        <w:rPr>
+          <w:rFonts w:ascii="Calibri" w:hAnsi="Calibri" w:cs="Calibri"/>
+          <w:b/>
+          <w:b/>
+          <w:bCs/>
+        </w:rPr>
+      </w:pPr>
+      <w:r>
+        <w:rPr>
+          <w:rFonts w:cs="Arial" w:ascii="Arial" w:hAnsi="Arial"/>
+          <w:b/>
+          <w:bCs/>
+          <w:sz w:val="18"/>
+        </w:rPr>
+        <w:t xml:space="preserve">9.2 </w:t>
+      </w:r>
+      <w:r>
+        <w:rPr>
+          <w:rFonts w:cs="Arial" w:ascii="Arial" w:hAnsi="Arial"/>
+          <w:iCs/>
+          <w:sz w:val="18"/>
+        </w:rPr>
+        <w:t>The Exhibitor consents to the graphic reproduction of photographs and video footage taken during the event for the purpose of promoting the congress in the media.</w:t>
+      </w:r>
+    </w:p>
+    <w:p>
+      <w:pPr>
+        <w:pStyle w:val="Normal"/>
+        <w:spacing w:before="0" w:after="0" w:line="230" w:lineRule="auto"/>
+        <w:jc w:val="both"/>
+        <w:rPr>
+          <w:rFonts w:ascii="Calibri" w:hAnsi="Calibri" w:cs="Calibri"/>
+          <w:b/>
+          <w:b/>
+          <w:bCs/>
+        </w:rPr>
+      </w:pPr>
+    </w:p>
+    <w:p>
+      <w:pPr>
+        <w:pStyle w:val="Normal"/>
+        <w:spacing w:before="0" w:after="0" w:line="230" w:lineRule="auto"/>
+        <w:jc w:val="both"/>
+        <w:rPr>
+          <w:rFonts w:ascii="Calibri" w:hAnsi="Calibri" w:cs="Calibri"/>
+        </w:rPr>
+      </w:pPr>
+      <w:r>
+        <w:rPr>
+          <w:rFonts w:cs="Arial" w:ascii="Arial" w:hAnsi="Arial"/>
+          <w:b/>
+          <w:bCs/>
+          <w:sz w:val="18"/>
+        </w:rPr>
+        <w:t xml:space="preserve">10. Return of the space - Damage to stand spaces - Waste disposal </w:t>
+      </w:r>
+    </w:p>
+    <w:p>
+      <w:pPr>
+        <w:pStyle w:val="Normal"/>
+        <w:spacing w:before="0" w:after="0" w:line="230" w:lineRule="auto"/>
+        <w:jc w:val="both"/>
+        <w:rPr>
+          <w:rFonts w:ascii="Calibri" w:hAnsi="Calibri" w:cs="Calibri"/>
+          <w:b/>
+          <w:b/>
+          <w:bCs/>
+        </w:rPr>
+      </w:pPr>
+      <w:r>
+        <w:rPr>
+          <w:rFonts w:cs="Arial" w:ascii="Arial" w:hAnsi="Arial"/>
+          <w:b/>
+          <w:bCs/>
+          <w:sz w:val="18"/>
+        </w:rPr>
+        <w:t xml:space="preserve">10.1 </w:t>
+      </w:r>
+      <w:r>
+        <w:rPr>
+          <w:rFonts w:cs="Arial" w:ascii="Arial" w:hAnsi="Arial"/>
+          <w:iCs/>
+          <w:sz w:val="18"/>
+        </w:rPr>
+        <w:t>At the end of the event the exhibition space must be returned in the same condition in which it was taken over by the Exhibitor. All materials and set-up residues must be removed from the Exhibition Space.</w:t>
+      </w:r>
+    </w:p>
+    <w:p>
+      <w:pPr>
+        <w:pStyle w:val="Normal"/>
+        <w:spacing w:before="0" w:after="0" w:line="230" w:lineRule="auto"/>
+        <w:jc w:val="both"/>
+        <w:rPr>
+          <w:rFonts w:ascii="Calibri" w:hAnsi="Calibri" w:cs="Calibri"/>
+          <w:b/>
+          <w:b/>
+          <w:bCs/>
+        </w:rPr>
+      </w:pPr>
+      <w:r>
+        <w:rPr>
+          <w:rFonts w:cs="Arial" w:ascii="Arial" w:hAnsi="Arial"/>
+          <w:b/>
+          <w:bCs/>
+          <w:sz w:val="18"/>
+        </w:rPr>
+        <w:t xml:space="preserve">10.2 </w:t>
+      </w:r>
+      <w:r>
+        <w:rPr>
+          <w:rFonts w:cs="Arial" w:ascii="Arial" w:hAnsi="Arial"/>
+          <w:iCs/>
+          <w:sz w:val="18"/>
+        </w:rPr>
+        <w:t>All waste produced during set-up/dismantling and during the event must be disposed of by the Exhibitor in compliance with the regulations in force. Should any materials not be taken to the landfill but be abandoned on the premises, or should waste not be disposed of correctly, the Organiser reserves the right to clear, at the Exhibitor's risk and expense, all materials, equipment and anything else not collected within the prescribed time limits, and to restore the occupied space. The Organiser assumes no obligation to store the materials and goods of Exhibitors cleared directly. All restoration costs and expenses, for any damage caused and for waste disposal, shall be borne by the Exhibitor.</w:t>
+      </w:r>
+    </w:p>
+    <w:p>
+      <w:pPr>
+        <w:pStyle w:val="Normal"/>
+        <w:spacing w:before="0" w:after="0" w:line="230" w:lineRule="auto"/>
+        <w:jc w:val="both"/>
+        <w:rPr>
+          <w:rFonts w:ascii="Calibri" w:hAnsi="Calibri" w:cs="Calibri"/>
+          <w:b/>
+          <w:b/>
+          <w:bCs/>
+        </w:rPr>
+      </w:pPr>
+    </w:p>
+    <w:p>
+      <w:pPr>
+        <w:pStyle w:val="Normal"/>
+        <w:spacing w:before="0" w:after="0" w:line="230" w:lineRule="auto"/>
+        <w:jc w:val="both"/>
+        <w:rPr>
+          <w:rFonts w:ascii="Calibri" w:hAnsi="Calibri" w:cs="Calibri"/>
+        </w:rPr>
+      </w:pPr>
+      <w:r>
+        <w:rPr>
+          <w:rFonts w:cs="Arial" w:ascii="Arial" w:hAnsi="Arial"/>
+          <w:b/>
+          <w:bCs/>
+          <w:sz w:val="18"/>
+        </w:rPr>
+        <w:t xml:space="preserve">11. Amendments or variations </w:t>
+      </w:r>
+    </w:p>
+    <w:p>
+      <w:pPr>
+        <w:pStyle w:val="Normal"/>
+        <w:spacing w:before="0" w:after="0" w:line="230" w:lineRule="auto"/>
+        <w:jc w:val="both"/>
+        <w:rPr>
+          <w:rFonts w:ascii="Calibri" w:hAnsi="Calibri" w:cs="Calibri"/>
+          <w:b/>
+          <w:b/>
+          <w:bCs/>
+        </w:rPr>
+      </w:pPr>
+      <w:r>
+        <w:rPr>
+          <w:rFonts w:cs="Arial" w:ascii="Arial" w:hAnsi="Arial"/>
+          <w:b/>
+          <w:bCs/>
+          <w:sz w:val="18"/>
+        </w:rPr>
+        <w:t xml:space="preserve">11.1 </w:t>
+      </w:r>
+      <w:r>
+        <w:rPr>
+          <w:rFonts w:cs="Arial" w:ascii="Arial" w:hAnsi="Arial"/>
+          <w:iCs/>
+          <w:sz w:val="18"/>
+        </w:rPr>
         <w:t>Any derogation from this Agreement/Regulations shall be null and void and in any case without effect unless made in writing.</w:t>
       </w:r>
     </w:p>
@@ -3856,29 +4132,29 @@
           <w:bCs/>
           <w:sz w:val="18"/>
         </w:rPr>
-        <w:t xml:space="preserve">9. Governing law and jurisdiction </w:t>
-      </w:r>
-    </w:p>
-    <w:p>
-      <w:pPr>
-        <w:pStyle w:val="Normal"/>
-        <w:spacing w:before="0" w:after="0" w:line="230" w:lineRule="auto"/>
-        <w:jc w:val="both"/>
-        <w:rPr>
-          <w:rFonts w:ascii="Calibri" w:hAnsi="Calibri" w:cs="Calibri"/>
-          <w:b/>
-          <w:b/>
-          <w:bCs/>
-        </w:rPr>
-      </w:pPr>
-      <w:r>
-        <w:rPr>
-          <w:rFonts w:cs="Arial" w:ascii="Arial" w:hAnsi="Arial"/>
-          <w:b/>
-          <w:bCs/>
-          <w:sz w:val="18"/>
-        </w:rPr>
-        <w:t xml:space="preserve">9.1 </w:t>
+        <w:t xml:space="preserve">12. Governing law and jurisdiction </w:t>
+      </w:r>
+    </w:p>
+    <w:p>
+      <w:pPr>
+        <w:pStyle w:val="Normal"/>
+        <w:spacing w:before="0" w:after="0" w:line="230" w:lineRule="auto"/>
+        <w:jc w:val="both"/>
+        <w:rPr>
+          <w:rFonts w:ascii="Calibri" w:hAnsi="Calibri" w:cs="Calibri"/>
+          <w:b/>
+          <w:b/>
+          <w:bCs/>
+        </w:rPr>
+      </w:pPr>
+      <w:r>
+        <w:rPr>
+          <w:rFonts w:cs="Arial" w:ascii="Arial" w:hAnsi="Arial"/>
+          <w:b/>
+          <w:bCs/>
+          <w:sz w:val="18"/>
+        </w:rPr>
+        <w:t xml:space="preserve">12.1 </w:t>
       </w:r>
       <w:r>
         <w:rPr>
@@ -4277,27 +4553,14 @@
         </w:rPr>
         <w:t>The parties, by mutual agreement, after carefully reading the registration rules and the terms contained in this agreement, acknowledging that each clause has been the subject and result of extensive and thorough negotiation, to the extent necessary and for all legal purposes, including the provisions of articles 1341 and 1342 of the Italian Civil Code, declare that they have read, approve and fully accept the provisions relating to:</w:t>
       </w:r>
-    </w:p>
-    <w:p>
-      <w:pPr>
-        <w:pStyle w:val="Normal"/>
-        <w:spacing w:before="0" w:after="0" w:line="230" w:lineRule="auto"/>
-        <w:jc w:val="both"/>
-        <w:rPr>
-          <w:rFonts w:ascii="Calibri" w:hAnsi="Calibri" w:cs="Calibri"/>
-          <w:b/>
-          <w:b/>
-          <w:bCs/>
-        </w:rPr>
-      </w:pPr>
-      <w:r>
-        <w:rPr>
-          <w:rFonts w:cs="Arial" w:ascii="Arial" w:hAnsi="Arial"/>
-          <w:b/>
-          <w:bCs/>
-          <w:sz w:val="18"/>
-        </w:rPr>
-        <w:t>3. Consideration, payment terms and cancellation terms; 4. Term and Termination of the Agreement; 5. Confidentiality and non-disclosure; 7. Miscellaneous; 8. Amendments or variations; 9. Governing law and jurisdiction;</w:t>
+      <w:r>
+        <w:rPr>
+          <w:rFonts w:cs="Arial" w:ascii="Arial" w:hAnsi="Arial"/>
+          <w:b w:val="0"/>
+          <w:iCs/>
+          <w:sz w:val="18"/>
+        </w:rPr>
+        <w:t xml:space="preserve"> 3. Consideration, payment terms and cancellation terms; 4. Term and Termination of the Agreement; 5. Confidentiality and non-disclosure; 7. Miscellaneous; 8. Loudspeakers - Sound broadcasts; 9. Promotional and advertising activities; 10. Return of the space - Damage to stand spaces - Waste disposal; 11. Amendments or variations; 12. Governing law and jurisdiction.</w:t>
       </w:r>
     </w:p>
     <w:p>

</xml_diff>

<commit_message>
Contratto: nuovo art. 4 Assegnazione degli spazi espositivi (4.1-4.3), reclami come 10.2, rinumerazione; termini unici Segreteria Organizzativa e Sponsor
- Contratto IT/EN: art. 4 nuovo (assegnazione, divieto di cessione,
  custodia e sorveglianza dal Regolamento tecnico); articoli successivi
  scalati di uno (Durata 5 ... Legge applicabile 13); 10.2 Reclami,
  vendite e dimostrazioni (dal Regolamento); modalita di risoluzione e
  dichiarazione 1341-1342 aggiornate.
- Contratto e Domanda IT/EN: Organizzatore/Espositore/azienda espositrice
  sostituiti da Segreteria Organizzativa e Sponsor, con gli articoli giusti.
- Allegato 2: riquadro con l etichetta Sponsor.

Co-Authored-By: Claude Opus 5.5 <noreply@anthropic.com>
</commit_message>
<xml_diff>
--- a/contracts/templates_pdf/template_contratto_sponsor_non_ecm_en.docx
+++ b/contracts/templates_pdf/template_contratto_sponsor_non_ecm_en.docx
@@ -2970,47 +2970,47 @@
           <w:iCs/>
           <w:sz w:val="18"/>
         </w:rPr>
-        <w:t>The Exhibitor's withdrawal from participation in the Event (and/or any total or partial changes or cancellations of the booking), for any reason whatsoever, must be notified by registered letter with return receipt or by certified e-mail (PEC) addressed to the Organiser at least 30 days before the start of the Event. In such case the Organiser shall be entitled to retain, as a penalty, an amount equal to {{ penale_percent }}% of the total amount of this agreement{% if has_deposit %} (corresponding to the security deposit/down payment){% endif %}. Should the withdrawal be received after the 30th day before the start of the Event, the Exhibitor shall be required to pay the full consideration of this agreement.</w:t>
-      </w:r>
-    </w:p>
-    <w:p>
-      <w:pPr>
-        <w:pStyle w:val="Normal"/>
-        <w:spacing w:before="0" w:after="0" w:line="230" w:lineRule="auto"/>
-        <w:jc w:val="both"/>
-        <w:rPr>
-          <w:rFonts w:ascii="Calibri" w:hAnsi="Calibri" w:cs="Calibri"/>
-          <w:b/>
-          <w:b/>
-          <w:bCs/>
-        </w:rPr>
-      </w:pPr>
-      <w:r>
-        <w:rPr>
-          <w:rFonts w:cs="Arial" w:ascii="Arial" w:hAnsi="Arial"/>
-          <w:b/>
-          <w:bCs/>
-          <w:sz w:val="18"/>
-        </w:rPr>
-      </w:r>
-    </w:p>
-    <w:p>
-      <w:pPr>
-        <w:pStyle w:val="Normal"/>
-        <w:spacing w:before="0" w:after="0" w:line="230" w:lineRule="auto"/>
-        <w:jc w:val="both"/>
-        <w:rPr>
-          <w:rFonts w:ascii="Calibri" w:hAnsi="Calibri" w:cs="Calibri"/>
-        </w:rPr>
-      </w:pPr>
-      <w:r>
-        <w:rPr>
-          <w:rFonts w:cs="Arial" w:ascii="Arial" w:hAnsi="Arial"/>
-          <w:b/>
-          <w:bCs/>
-          <w:sz w:val="18"/>
-        </w:rPr>
-        <w:t xml:space="preserve">4. Term and Termination of the Agreement </w:t>
+        <w:t>The Sponsor's withdrawal from participation in the Event (and/or any total or partial changes or cancellations of the booking), for any reason whatsoever, must be notified by registered letter with return receipt or by certified e-mail (PEC) addressed to the Organizing Secretariat at least 30 days before the start of the Event. In such case the Organizing Secretariat shall be entitled to retain, as a penalty, an amount equal to {{ penale_percent }}% of the total amount of this agreement{% if has_deposit %} (corresponding to the security deposit/down payment){% endif %}. Should the withdrawal be received after the 30th day before the start of the Event, the Sponsor shall be required to pay the full consideration of this agreement.</w:t>
+      </w:r>
+    </w:p>
+    <w:p>
+      <w:pPr>
+        <w:pStyle w:val="Normal"/>
+        <w:spacing w:before="0" w:after="0" w:line="230" w:lineRule="auto"/>
+        <w:jc w:val="both"/>
+        <w:rPr>
+          <w:rFonts w:ascii="Calibri" w:hAnsi="Calibri" w:cs="Calibri"/>
+          <w:b/>
+          <w:b/>
+          <w:bCs/>
+        </w:rPr>
+      </w:pPr>
+      <w:r>
+        <w:rPr>
+          <w:rFonts w:cs="Arial" w:ascii="Arial" w:hAnsi="Arial"/>
+          <w:b/>
+          <w:bCs/>
+          <w:sz w:val="18"/>
+        </w:rPr>
+      </w:r>
+    </w:p>
+    <w:p>
+      <w:pPr>
+        <w:pStyle w:val="Normal"/>
+        <w:spacing w:before="0" w:after="0" w:line="230" w:lineRule="auto"/>
+        <w:jc w:val="both"/>
+        <w:rPr>
+          <w:rFonts w:ascii="Calibri" w:hAnsi="Calibri" w:cs="Calibri"/>
+        </w:rPr>
+      </w:pPr>
+      <w:r>
+        <w:rPr>
+          <w:rFonts w:cs="Arial" w:ascii="Arial" w:hAnsi="Arial"/>
+          <w:b/>
+          <w:bCs/>
+          <w:sz w:val="18"/>
+        </w:rPr>
+        <w:t xml:space="preserve">4. Allocation of exhibition spaces </w:t>
       </w:r>
     </w:p>
     <w:p>
@@ -3034,6 +3034,118 @@
           <w:rFonts w:cs="Arial" w:ascii="Arial" w:hAnsi="Arial"/>
           <w:sz w:val="18"/>
         </w:rPr>
+        <w:t>Stands are allocated by agreement between the parties according to the availability of spaces.</w:t>
+      </w:r>
+    </w:p>
+    <w:p>
+      <w:pPr>
+        <w:pStyle w:val="Normal"/>
+        <w:spacing w:before="0" w:after="0" w:line="230" w:lineRule="auto"/>
+        <w:jc w:val="both"/>
+        <w:rPr/>
+      </w:pPr>
+      <w:r>
+        <w:rPr>
+          <w:rFonts w:cs="Arial" w:ascii="Arial" w:hAnsi="Arial"/>
+          <w:b/>
+          <w:bCs/>
+          <w:sz w:val="18"/>
+        </w:rPr>
+        <w:t xml:space="preserve">4.2 </w:t>
+      </w:r>
+      <w:r>
+        <w:rPr>
+          <w:rFonts w:cs="Arial" w:ascii="Arial" w:hAnsi="Arial"/>
+          <w:sz w:val="18"/>
+        </w:rPr>
+        <w:t>No total or partial transfer, even free of charge, of exhibition spaces or booked services is permitted. In the event of an ascertained infringement, the Organizing Secretariat may remove the goods introduced and displayed without authorisation, at the risk and expense of the holder of the space, with no possibility of recourse whatsoever.</w:t>
+      </w:r>
+    </w:p>
+    <w:p>
+      <w:pPr>
+        <w:pStyle w:val="Normal"/>
+        <w:spacing w:before="0" w:after="0" w:line="230" w:lineRule="auto"/>
+        <w:jc w:val="both"/>
+        <w:rPr/>
+      </w:pPr>
+      <w:r>
+        <w:rPr>
+          <w:rFonts w:cs="Arial" w:ascii="Arial" w:hAnsi="Arial"/>
+          <w:b/>
+          <w:bCs/>
+          <w:sz w:val="18"/>
+        </w:rPr>
+        <w:t xml:space="preserve">4.3 </w:t>
+      </w:r>
+      <w:r>
+        <w:rPr>
+          <w:rFonts w:cs="Arial" w:ascii="Arial" w:hAnsi="Arial"/>
+          <w:sz w:val="18"/>
+        </w:rPr>
+        <w:t>The custody and surveillance of the Exhibition Space, and of its contents, during set-up, during the Event and during dismantling are the responsibility of the Sponsor. The Organizing Secretariat is therefore not liable for objects or goods left unattended in the Exhibition Space during the opening and closing hours of the Event. Removing goods and structures during the event is strictly prohibited.</w:t>
+      </w:r>
+    </w:p>
+    <w:p>
+      <w:pPr>
+        <w:pStyle w:val="Normal"/>
+        <w:spacing w:before="0" w:after="0" w:line="230" w:lineRule="auto"/>
+        <w:jc w:val="both"/>
+        <w:rPr>
+          <w:rFonts w:ascii="Calibri" w:hAnsi="Calibri" w:cs="Calibri"/>
+          <w:b/>
+          <w:b/>
+          <w:bCs/>
+        </w:rPr>
+      </w:pPr>
+      <w:r>
+        <w:rPr>
+          <w:rFonts w:cs="Arial" w:ascii="Arial" w:hAnsi="Arial"/>
+          <w:b/>
+          <w:bCs/>
+          <w:sz w:val="18"/>
+        </w:rPr>
+      </w:r>
+    </w:p>
+    <w:p>
+      <w:pPr>
+        <w:pStyle w:val="Normal"/>
+        <w:spacing w:before="0" w:after="0" w:line="230" w:lineRule="auto"/>
+        <w:jc w:val="both"/>
+        <w:rPr>
+          <w:rFonts w:ascii="Calibri" w:hAnsi="Calibri" w:cs="Calibri"/>
+        </w:rPr>
+      </w:pPr>
+      <w:r>
+        <w:rPr>
+          <w:rFonts w:cs="Arial" w:ascii="Arial" w:hAnsi="Arial"/>
+          <w:b/>
+          <w:bCs/>
+          <w:sz w:val="18"/>
+        </w:rPr>
+        <w:t xml:space="preserve">5. Term and Termination of the Agreement </w:t>
+      </w:r>
+    </w:p>
+    <w:p>
+      <w:pPr>
+        <w:pStyle w:val="Normal"/>
+        <w:spacing w:before="0" w:after="0" w:line="230" w:lineRule="auto"/>
+        <w:jc w:val="both"/>
+        <w:rPr/>
+      </w:pPr>
+      <w:r>
+        <w:rPr>
+          <w:rFonts w:cs="Arial" w:ascii="Arial" w:hAnsi="Arial"/>
+          <w:b/>
+          <w:bCs/>
+          <w:sz w:val="18"/>
+        </w:rPr>
+        <w:t xml:space="preserve">5.1 </w:t>
+      </w:r>
+      <w:r>
+        <w:rPr>
+          <w:rFonts w:cs="Arial" w:ascii="Arial" w:hAnsi="Arial"/>
+          <w:sz w:val="18"/>
+        </w:rPr>
         <w:t xml:space="preserve">This Agreement is effective from the date of signing until the conclusion of all procedures relating to the Event. </w:t>
       </w:r>
     </w:p>
@@ -3053,7 +3165,7 @@
           <w:bCs/>
           <w:sz w:val="18"/>
         </w:rPr>
-        <w:t xml:space="preserve">4.2 </w:t>
+        <w:t xml:space="preserve">5.2 </w:t>
       </w:r>
       <w:r>
         <w:rPr>
@@ -3077,7 +3189,7 @@
           <w:bCs/>
           <w:sz w:val="18"/>
         </w:rPr>
-        <w:t xml:space="preserve">4.3 </w:t>
+        <w:t xml:space="preserve">5.3 </w:t>
       </w:r>
       <w:r>
         <w:rPr>
@@ -3101,7 +3213,7 @@
           <w:bCs/>
           <w:sz w:val="18"/>
         </w:rPr>
-        <w:t xml:space="preserve">4.4 </w:t>
+        <w:t xml:space="preserve">5.4 </w:t>
       </w:r>
       <w:r>
         <w:rPr>
@@ -3143,7 +3255,7 @@
           <w:bCs/>
           <w:sz w:val="18"/>
         </w:rPr>
-        <w:t xml:space="preserve">5. Confidentiality and non-disclosure </w:t>
+        <w:t xml:space="preserve">6. Confidentiality and non-disclosure </w:t>
       </w:r>
     </w:p>
     <w:p>
@@ -3160,7 +3272,7 @@
           <w:bCs/>
           <w:sz w:val="18"/>
         </w:rPr>
-        <w:t xml:space="preserve">5.1 </w:t>
+        <w:t xml:space="preserve">6.1 </w:t>
       </w:r>
       <w:r>
         <w:rPr>
@@ -3216,7 +3328,7 @@
           <w:bCs/>
           <w:sz w:val="18"/>
         </w:rPr>
-        <w:t xml:space="preserve">5.2 </w:t>
+        <w:t xml:space="preserve">6.2 </w:t>
       </w:r>
       <w:r>
         <w:rPr>
@@ -3258,7 +3370,7 @@
           <w:bCs/>
           <w:sz w:val="18"/>
         </w:rPr>
-        <w:t xml:space="preserve">6. Further obligations of the Parties </w:t>
+        <w:t xml:space="preserve">7. Further obligations of the Parties </w:t>
       </w:r>
     </w:p>
     <w:p>
@@ -3275,7 +3387,7 @@
           <w:bCs/>
           <w:sz w:val="18"/>
         </w:rPr>
-        <w:t xml:space="preserve">6.1 </w:t>
+        <w:t xml:space="preserve">7.1 </w:t>
       </w:r>
       <w:r>
         <w:rPr>
@@ -3317,26 +3429,26 @@
           <w:bCs/>
           <w:sz w:val="18"/>
         </w:rPr>
-        <w:t xml:space="preserve">7. Miscellaneous </w:t>
-      </w:r>
-    </w:p>
-    <w:p>
-      <w:pPr>
-        <w:pStyle w:val="Normal"/>
-        <w:spacing w:before="0" w:after="0" w:line="230" w:lineRule="auto"/>
-        <w:jc w:val="both"/>
-        <w:rPr>
-          <w:rFonts w:ascii="Calibri" w:hAnsi="Calibri" w:cs="Calibri"/>
-        </w:rPr>
-      </w:pPr>
-      <w:r>
-        <w:rPr>
-          <w:rFonts w:cs="Arial" w:ascii="Arial" w:hAnsi="Arial"/>
-          <w:b/>
-          <w:bCs/>
-          <w:sz w:val="18"/>
-        </w:rPr>
-        <w:t xml:space="preserve">7.1 </w:t>
+        <w:t xml:space="preserve">8. Miscellaneous </w:t>
+      </w:r>
+    </w:p>
+    <w:p>
+      <w:pPr>
+        <w:pStyle w:val="Normal"/>
+        <w:spacing w:before="0" w:after="0" w:line="230" w:lineRule="auto"/>
+        <w:jc w:val="both"/>
+        <w:rPr>
+          <w:rFonts w:ascii="Calibri" w:hAnsi="Calibri" w:cs="Calibri"/>
+        </w:rPr>
+      </w:pPr>
+      <w:r>
+        <w:rPr>
+          <w:rFonts w:cs="Arial" w:ascii="Arial" w:hAnsi="Arial"/>
+          <w:b/>
+          <w:bCs/>
+          <w:sz w:val="18"/>
+        </w:rPr>
+        <w:t xml:space="preserve">8.1 </w:t>
       </w:r>
       <w:r>
         <w:rPr>
@@ -3378,7 +3490,7 @@
           <w:bCs/>
           <w:sz w:val="18"/>
         </w:rPr>
-        <w:t xml:space="preserve">7.2 </w:t>
+        <w:t xml:space="preserve">8.2 </w:t>
       </w:r>
       <w:r>
         <w:rPr>
@@ -3437,7 +3549,7 @@
           <w:bCs/>
           <w:sz w:val="18"/>
         </w:rPr>
-        <w:t xml:space="preserve">7.3 </w:t>
+        <w:t xml:space="preserve">8.3 </w:t>
       </w:r>
       <w:r>
         <w:rPr>
@@ -3479,7 +3591,7 @@
           <w:bCs/>
           <w:sz w:val="18"/>
         </w:rPr>
-        <w:t xml:space="preserve">7.4 </w:t>
+        <w:t xml:space="preserve">8.4 </w:t>
       </w:r>
       <w:r>
         <w:rPr>
@@ -3529,7 +3641,7 @@
           <w:sz w:val="18"/>
           <w:szCs w:val="20"/>
         </w:rPr>
-        <w:t xml:space="preserve">7.5 </w:t>
+        <w:t xml:space="preserve">8.5 </w:t>
       </w:r>
       <w:r>
         <w:rPr>
@@ -3622,7 +3734,7 @@
           <w:bCs/>
           <w:sz w:val="18"/>
         </w:rPr>
-        <w:t>7.6 TERMINATION</w:t>
+        <w:t>8.6 TERMINATION</w:t>
       </w:r>
     </w:p>
     <w:p>
@@ -3643,7 +3755,7 @@
           <w:iCs/>
           <w:sz w:val="18"/>
         </w:rPr>
-        <w:t>Any breach of the provisions of articles 2, 3, 4, 5, 7, 8, 9, 10, 11 and 12 shall entitle the Organiser to unilaterally terminate this agreement with immediate effect pursuant to art. 1456 of the Italian Civil Code, by notice sent by registered letter with return receipt and/or certified e-mail (PEC), declaring its intention to avail itself of this express termination clause, without prejudice to compensation for any damages suffered.</w:t>
+        <w:t>Any breach of the provisions of articles 2, 3, 4, 5, 6, 8, 9, 10, 11, 12 and 13 shall entitle the Organizing Secretariat to unilaterally terminate this agreement with immediate effect pursuant to art. 1456 of the Italian Civil Code, by notice sent by registered letter with return receipt and/or certified e-mail (PEC), declaring its intention to avail itself of this express termination clause, without prejudice to compensation for any damages suffered.</w:t>
       </w:r>
     </w:p>
     <w:p>
@@ -3664,42 +3776,42 @@
           <w:iCs/>
           <w:sz w:val="18"/>
         </w:rPr>
-        <w:t>Should the Organiser exercise its right of termination during the Event, the Exhibitor shall immediately cease all activities within the Exhibition Space and vacate it within the time indicated by the Organiser. In this regard the Exhibitor waives any objection, reserving the protection of its rights to any subsequent legal proceedings.</w:t>
-      </w:r>
-    </w:p>
-    <w:p>
-      <w:pPr>
-        <w:pStyle w:val="Normal"/>
-        <w:spacing w:before="0" w:after="0" w:line="230" w:lineRule="auto"/>
-        <w:jc w:val="both"/>
-        <w:rPr>
-          <w:rFonts w:ascii="Calibri" w:hAnsi="Calibri" w:cs="Calibri"/>
-          <w:b/>
-          <w:b/>
-          <w:bCs/>
-        </w:rPr>
-      </w:pPr>
-    </w:p>
-    <w:p>
-      <w:pPr>
-        <w:pStyle w:val="Normal"/>
-        <w:spacing w:before="0" w:after="0" w:line="230" w:lineRule="auto"/>
-        <w:jc w:val="both"/>
-        <w:rPr>
-          <w:rFonts w:ascii="Calibri" w:hAnsi="Calibri" w:cs="Calibri"/>
-          <w:b/>
-          <w:b/>
-          <w:bCs/>
-        </w:rPr>
-      </w:pPr>
-      <w:r>
-        <w:rPr>
-          <w:rFonts w:cs="Arial" w:ascii="Arial" w:hAnsi="Arial"/>
-          <w:b/>
-          <w:bCs/>
-          <w:sz w:val="18"/>
-        </w:rPr>
-        <w:t>7.7 REPRODUCTION RIGHTS</w:t>
+        <w:t>Should the Organizing Secretariat exercise its right of termination during the Event, the Sponsor shall immediately cease all activities within the Exhibition Space and vacate it within the time indicated by the Organizing Secretariat. In this regard the Sponsor waives any objection, reserving the protection of its rights to any subsequent legal proceedings.</w:t>
+      </w:r>
+    </w:p>
+    <w:p>
+      <w:pPr>
+        <w:pStyle w:val="Normal"/>
+        <w:spacing w:before="0" w:after="0" w:line="230" w:lineRule="auto"/>
+        <w:jc w:val="both"/>
+        <w:rPr>
+          <w:rFonts w:ascii="Calibri" w:hAnsi="Calibri" w:cs="Calibri"/>
+          <w:b/>
+          <w:b/>
+          <w:bCs/>
+        </w:rPr>
+      </w:pPr>
+    </w:p>
+    <w:p>
+      <w:pPr>
+        <w:pStyle w:val="Normal"/>
+        <w:spacing w:before="0" w:after="0" w:line="230" w:lineRule="auto"/>
+        <w:jc w:val="both"/>
+        <w:rPr>
+          <w:rFonts w:ascii="Calibri" w:hAnsi="Calibri" w:cs="Calibri"/>
+          <w:b/>
+          <w:b/>
+          <w:bCs/>
+        </w:rPr>
+      </w:pPr>
+      <w:r>
+        <w:rPr>
+          <w:rFonts w:cs="Arial" w:ascii="Arial" w:hAnsi="Arial"/>
+          <w:b/>
+          <w:bCs/>
+          <w:sz w:val="18"/>
+        </w:rPr>
+        <w:t>8.7 REPRODUCTION RIGHTS</w:t>
       </w:r>
     </w:p>
     <w:p>
@@ -3720,61 +3832,61 @@
           <w:iCs/>
           <w:sz w:val="18"/>
         </w:rPr>
-        <w:t>The Exhibitor gives its prior consent to the Organiser making graphic, photographic and/or film reproductions of the exhibition area of the halls and of everything contained therein.</w:t>
-      </w:r>
-    </w:p>
-    <w:p>
-      <w:pPr>
-        <w:pStyle w:val="Normal"/>
-        <w:spacing w:before="0" w:after="0" w:line="230" w:lineRule="auto"/>
-        <w:jc w:val="both"/>
-        <w:rPr>
-          <w:rFonts w:ascii="Calibri" w:hAnsi="Calibri" w:cs="Calibri"/>
-          <w:b/>
-          <w:b/>
-          <w:bCs/>
-        </w:rPr>
-      </w:pPr>
-    </w:p>
-    <w:p>
-      <w:pPr>
-        <w:pStyle w:val="Normal"/>
-        <w:spacing w:before="0" w:after="0" w:line="230" w:lineRule="auto"/>
-        <w:jc w:val="both"/>
-        <w:rPr>
-          <w:rFonts w:ascii="Calibri" w:hAnsi="Calibri" w:cs="Calibri"/>
-        </w:rPr>
-      </w:pPr>
-      <w:r>
-        <w:rPr>
-          <w:rFonts w:cs="Arial" w:ascii="Arial" w:hAnsi="Arial"/>
-          <w:b/>
-          <w:bCs/>
-          <w:sz w:val="18"/>
-        </w:rPr>
-        <w:t xml:space="preserve">8. Loudspeakers - Sound broadcasts </w:t>
-      </w:r>
-    </w:p>
-    <w:p>
-      <w:pPr>
-        <w:pStyle w:val="Normal"/>
-        <w:spacing w:before="0" w:after="0" w:line="230" w:lineRule="auto"/>
-        <w:jc w:val="both"/>
-        <w:rPr>
-          <w:rFonts w:ascii="Calibri" w:hAnsi="Calibri" w:cs="Calibri"/>
-          <w:b/>
-          <w:b/>
-          <w:bCs/>
-        </w:rPr>
-      </w:pPr>
-      <w:r>
-        <w:rPr>
-          <w:rFonts w:cs="Arial" w:ascii="Arial" w:hAnsi="Arial"/>
-          <w:b/>
-          <w:bCs/>
-          <w:sz w:val="18"/>
-        </w:rPr>
-        <w:t xml:space="preserve">8.1 </w:t>
+        <w:t>The Sponsor gives its prior consent to the Organizing Secretariat making graphic, photographic and/or film reproductions of the exhibition area of the halls and of everything contained therein.</w:t>
+      </w:r>
+    </w:p>
+    <w:p>
+      <w:pPr>
+        <w:pStyle w:val="Normal"/>
+        <w:spacing w:before="0" w:after="0" w:line="230" w:lineRule="auto"/>
+        <w:jc w:val="both"/>
+        <w:rPr>
+          <w:rFonts w:ascii="Calibri" w:hAnsi="Calibri" w:cs="Calibri"/>
+          <w:b/>
+          <w:b/>
+          <w:bCs/>
+        </w:rPr>
+      </w:pPr>
+    </w:p>
+    <w:p>
+      <w:pPr>
+        <w:pStyle w:val="Normal"/>
+        <w:spacing w:before="0" w:after="0" w:line="230" w:lineRule="auto"/>
+        <w:jc w:val="both"/>
+        <w:rPr>
+          <w:rFonts w:ascii="Calibri" w:hAnsi="Calibri" w:cs="Calibri"/>
+        </w:rPr>
+      </w:pPr>
+      <w:r>
+        <w:rPr>
+          <w:rFonts w:cs="Arial" w:ascii="Arial" w:hAnsi="Arial"/>
+          <w:b/>
+          <w:bCs/>
+          <w:sz w:val="18"/>
+        </w:rPr>
+        <w:t xml:space="preserve">9. Loudspeakers - Sound broadcasts </w:t>
+      </w:r>
+    </w:p>
+    <w:p>
+      <w:pPr>
+        <w:pStyle w:val="Normal"/>
+        <w:spacing w:before="0" w:after="0" w:line="230" w:lineRule="auto"/>
+        <w:jc w:val="both"/>
+        <w:rPr>
+          <w:rFonts w:ascii="Calibri" w:hAnsi="Calibri" w:cs="Calibri"/>
+          <w:b/>
+          <w:b/>
+          <w:bCs/>
+        </w:rPr>
+      </w:pPr>
+      <w:r>
+        <w:rPr>
+          <w:rFonts w:cs="Arial" w:ascii="Arial" w:hAnsi="Arial"/>
+          <w:b/>
+          <w:bCs/>
+          <w:sz w:val="18"/>
+        </w:rPr>
+        <w:t xml:space="preserve">9.1 </w:t>
       </w:r>
       <w:r>
         <w:rPr>
@@ -3782,29 +3894,29 @@
           <w:iCs/>
           <w:sz w:val="18"/>
         </w:rPr>
-        <w:t>Sound broadcasts are permitted within the Exhibitor's own space, including the use of radio receivers and television sets, provided they do not cause disturbance (SIAE fees payable by the exhibiting company). To this end the Organiser reserves the right to determine the volume of sound broadcasts.</w:t>
-      </w:r>
-    </w:p>
-    <w:p>
-      <w:pPr>
-        <w:pStyle w:val="Normal"/>
-        <w:spacing w:before="0" w:after="0" w:line="230" w:lineRule="auto"/>
-        <w:jc w:val="both"/>
-        <w:rPr>
-          <w:rFonts w:ascii="Calibri" w:hAnsi="Calibri" w:cs="Calibri"/>
-          <w:b/>
-          <w:b/>
-          <w:bCs/>
-        </w:rPr>
-      </w:pPr>
-      <w:r>
-        <w:rPr>
-          <w:rFonts w:cs="Arial" w:ascii="Arial" w:hAnsi="Arial"/>
-          <w:b/>
-          <w:bCs/>
-          <w:sz w:val="18"/>
-        </w:rPr>
-        <w:t xml:space="preserve">8.2 </w:t>
+        <w:t>Sound broadcasts are permitted within the Sponsor's own space, including the use of radio receivers and television sets, provided they do not cause disturbance (SIAE fees payable by the Sponsor). To this end the Organizing Secretariat reserves the right to determine the volume of sound broadcasts.</w:t>
+      </w:r>
+    </w:p>
+    <w:p>
+      <w:pPr>
+        <w:pStyle w:val="Normal"/>
+        <w:spacing w:before="0" w:after="0" w:line="230" w:lineRule="auto"/>
+        <w:jc w:val="both"/>
+        <w:rPr>
+          <w:rFonts w:ascii="Calibri" w:hAnsi="Calibri" w:cs="Calibri"/>
+          <w:b/>
+          <w:b/>
+          <w:bCs/>
+        </w:rPr>
+      </w:pPr>
+      <w:r>
+        <w:rPr>
+          <w:rFonts w:cs="Arial" w:ascii="Arial" w:hAnsi="Arial"/>
+          <w:b/>
+          <w:bCs/>
+          <w:sz w:val="18"/>
+        </w:rPr>
+        <w:t xml:space="preserve">9.2 </w:t>
       </w:r>
       <w:r>
         <w:rPr>
@@ -3812,61 +3924,61 @@
           <w:iCs/>
           <w:sz w:val="18"/>
         </w:rPr>
-        <w:t>The Organiser may use the loudspeakers installed in the exhibition centre for official announcements or in case of emergency.</w:t>
-      </w:r>
-    </w:p>
-    <w:p>
-      <w:pPr>
-        <w:pStyle w:val="Normal"/>
-        <w:spacing w:before="0" w:after="0" w:line="230" w:lineRule="auto"/>
-        <w:jc w:val="both"/>
-        <w:rPr>
-          <w:rFonts w:ascii="Calibri" w:hAnsi="Calibri" w:cs="Calibri"/>
-          <w:b/>
-          <w:b/>
-          <w:bCs/>
-        </w:rPr>
-      </w:pPr>
-    </w:p>
-    <w:p>
-      <w:pPr>
-        <w:pStyle w:val="Normal"/>
-        <w:spacing w:before="0" w:after="0" w:line="230" w:lineRule="auto"/>
-        <w:jc w:val="both"/>
-        <w:rPr>
-          <w:rFonts w:ascii="Calibri" w:hAnsi="Calibri" w:cs="Calibri"/>
-        </w:rPr>
-      </w:pPr>
-      <w:r>
-        <w:rPr>
-          <w:rFonts w:cs="Arial" w:ascii="Arial" w:hAnsi="Arial"/>
-          <w:b/>
-          <w:bCs/>
-          <w:sz w:val="18"/>
-        </w:rPr>
-        <w:t xml:space="preserve">9. Promotional and advertising activities </w:t>
-      </w:r>
-    </w:p>
-    <w:p>
-      <w:pPr>
-        <w:pStyle w:val="Normal"/>
-        <w:spacing w:before="0" w:after="0" w:line="230" w:lineRule="auto"/>
-        <w:jc w:val="both"/>
-        <w:rPr>
-          <w:rFonts w:ascii="Calibri" w:hAnsi="Calibri" w:cs="Calibri"/>
-          <w:b/>
-          <w:b/>
-          <w:bCs/>
-        </w:rPr>
-      </w:pPr>
-      <w:r>
-        <w:rPr>
-          <w:rFonts w:cs="Arial" w:ascii="Arial" w:hAnsi="Arial"/>
-          <w:b/>
-          <w:bCs/>
-          <w:sz w:val="18"/>
-        </w:rPr>
-        <w:t xml:space="preserve">9.1 </w:t>
+        <w:t>The Organizing Secretariat may use the loudspeakers installed in the exhibition centre for official announcements or in case of emergency.</w:t>
+      </w:r>
+    </w:p>
+    <w:p>
+      <w:pPr>
+        <w:pStyle w:val="Normal"/>
+        <w:spacing w:before="0" w:after="0" w:line="230" w:lineRule="auto"/>
+        <w:jc w:val="both"/>
+        <w:rPr>
+          <w:rFonts w:ascii="Calibri" w:hAnsi="Calibri" w:cs="Calibri"/>
+          <w:b/>
+          <w:b/>
+          <w:bCs/>
+        </w:rPr>
+      </w:pPr>
+    </w:p>
+    <w:p>
+      <w:pPr>
+        <w:pStyle w:val="Normal"/>
+        <w:spacing w:before="0" w:after="0" w:line="230" w:lineRule="auto"/>
+        <w:jc w:val="both"/>
+        <w:rPr>
+          <w:rFonts w:ascii="Calibri" w:hAnsi="Calibri" w:cs="Calibri"/>
+        </w:rPr>
+      </w:pPr>
+      <w:r>
+        <w:rPr>
+          <w:rFonts w:cs="Arial" w:ascii="Arial" w:hAnsi="Arial"/>
+          <w:b/>
+          <w:bCs/>
+          <w:sz w:val="18"/>
+        </w:rPr>
+        <w:t xml:space="preserve">10. Promotional and advertising activities </w:t>
+      </w:r>
+    </w:p>
+    <w:p>
+      <w:pPr>
+        <w:pStyle w:val="Normal"/>
+        <w:spacing w:before="0" w:after="0" w:line="230" w:lineRule="auto"/>
+        <w:jc w:val="both"/>
+        <w:rPr>
+          <w:rFonts w:ascii="Calibri" w:hAnsi="Calibri" w:cs="Calibri"/>
+          <w:b/>
+          <w:b/>
+          <w:bCs/>
+        </w:rPr>
+      </w:pPr>
+      <w:r>
+        <w:rPr>
+          <w:rFonts w:cs="Arial" w:ascii="Arial" w:hAnsi="Arial"/>
+          <w:b/>
+          <w:bCs/>
+          <w:sz w:val="18"/>
+        </w:rPr>
+        <w:t xml:space="preserve">10.1 </w:t>
       </w:r>
       <w:r>
         <w:rPr>
@@ -3874,29 +3986,29 @@
           <w:iCs/>
           <w:sz w:val="18"/>
         </w:rPr>
-        <w:t>As regards advertising, except for advertising within the Exhibitor's own space, the Organiser reserves the exclusive right to promote and manage advertising for the event, also with the collaboration of specialised agencies.</w:t>
-      </w:r>
-    </w:p>
-    <w:p>
-      <w:pPr>
-        <w:pStyle w:val="Normal"/>
-        <w:spacing w:before="0" w:after="0" w:line="230" w:lineRule="auto"/>
-        <w:jc w:val="both"/>
-        <w:rPr>
-          <w:rFonts w:ascii="Calibri" w:hAnsi="Calibri" w:cs="Calibri"/>
-          <w:b/>
-          <w:b/>
-          <w:bCs/>
-        </w:rPr>
-      </w:pPr>
-      <w:r>
-        <w:rPr>
-          <w:rFonts w:cs="Arial" w:ascii="Arial" w:hAnsi="Arial"/>
-          <w:b/>
-          <w:bCs/>
-          <w:sz w:val="18"/>
-        </w:rPr>
-        <w:t xml:space="preserve">9.2 </w:t>
+        <w:t>As regards advertising, except for advertising within the Sponsor's own space, the Organizing Secretariat reserves the exclusive right to promote and manage advertising for the event, also with the collaboration of specialised agencies.</w:t>
+      </w:r>
+    </w:p>
+    <w:p>
+      <w:pPr>
+        <w:pStyle w:val="Normal"/>
+        <w:spacing w:before="0" w:after="0" w:line="230" w:lineRule="auto"/>
+        <w:jc w:val="both"/>
+        <w:rPr>
+          <w:rFonts w:ascii="Calibri" w:hAnsi="Calibri" w:cs="Calibri"/>
+          <w:b/>
+          <w:b/>
+          <w:bCs/>
+        </w:rPr>
+      </w:pPr>
+      <w:r>
+        <w:rPr>
+          <w:rFonts w:cs="Arial" w:ascii="Arial" w:hAnsi="Arial"/>
+          <w:b/>
+          <w:bCs/>
+          <w:sz w:val="18"/>
+        </w:rPr>
+        <w:t xml:space="preserve">10.2 </w:t>
       </w:r>
       <w:r>
         <w:rPr>
@@ -3904,61 +4016,29 @@
           <w:iCs/>
           <w:sz w:val="18"/>
         </w:rPr>
-        <w:t>The Exhibitor consents to the graphic reproduction of photographs and video footage taken during the event for the purpose of promoting the congress in the media.</w:t>
-      </w:r>
-    </w:p>
-    <w:p>
-      <w:pPr>
-        <w:pStyle w:val="Normal"/>
-        <w:spacing w:before="0" w:after="0" w:line="230" w:lineRule="auto"/>
-        <w:jc w:val="both"/>
-        <w:rPr>
-          <w:rFonts w:ascii="Calibri" w:hAnsi="Calibri" w:cs="Calibri"/>
-          <w:b/>
-          <w:b/>
-          <w:bCs/>
-        </w:rPr>
-      </w:pPr>
-    </w:p>
-    <w:p>
-      <w:pPr>
-        <w:pStyle w:val="Normal"/>
-        <w:spacing w:before="0" w:after="0" w:line="230" w:lineRule="auto"/>
-        <w:jc w:val="both"/>
-        <w:rPr>
-          <w:rFonts w:ascii="Calibri" w:hAnsi="Calibri" w:cs="Calibri"/>
-        </w:rPr>
-      </w:pPr>
-      <w:r>
-        <w:rPr>
-          <w:rFonts w:cs="Arial" w:ascii="Arial" w:hAnsi="Arial"/>
-          <w:b/>
-          <w:bCs/>
-          <w:sz w:val="18"/>
-        </w:rPr>
-        <w:t xml:space="preserve">10. Return of the space - Damage to stand spaces - Waste disposal </w:t>
-      </w:r>
-    </w:p>
-    <w:p>
-      <w:pPr>
-        <w:pStyle w:val="Normal"/>
-        <w:spacing w:before="0" w:after="0" w:line="230" w:lineRule="auto"/>
-        <w:jc w:val="both"/>
-        <w:rPr>
-          <w:rFonts w:ascii="Calibri" w:hAnsi="Calibri" w:cs="Calibri"/>
-          <w:b/>
-          <w:b/>
-          <w:bCs/>
-        </w:rPr>
-      </w:pPr>
-      <w:r>
-        <w:rPr>
-          <w:rFonts w:cs="Arial" w:ascii="Arial" w:hAnsi="Arial"/>
-          <w:b/>
-          <w:bCs/>
-          <w:sz w:val="18"/>
-        </w:rPr>
-        <w:t xml:space="preserve">10.1 </w:t>
+        <w:t>Any complaints must be submitted in writing to the Organizing Secretariat. Any form of sale or demonstration of products outside the limits of the Sponsor's own space is strictly prohibited.</w:t>
+      </w:r>
+    </w:p>
+    <w:p>
+      <w:pPr>
+        <w:pStyle w:val="Normal"/>
+        <w:spacing w:before="0" w:after="0" w:line="230" w:lineRule="auto"/>
+        <w:jc w:val="both"/>
+        <w:rPr>
+          <w:rFonts w:ascii="Calibri" w:hAnsi="Calibri" w:cs="Calibri"/>
+          <w:b/>
+          <w:b/>
+          <w:bCs/>
+        </w:rPr>
+      </w:pPr>
+      <w:r>
+        <w:rPr>
+          <w:rFonts w:cs="Arial" w:ascii="Arial" w:hAnsi="Arial"/>
+          <w:b/>
+          <w:bCs/>
+          <w:sz w:val="18"/>
+        </w:rPr>
+        <w:t xml:space="preserve">10.3 </w:t>
       </w:r>
       <w:r>
         <w:rPr>
@@ -3966,29 +4046,61 @@
           <w:iCs/>
           <w:sz w:val="18"/>
         </w:rPr>
-        <w:t>At the end of the event the exhibition space must be returned in the same condition in which it was taken over by the Exhibitor. All materials and set-up residues must be removed from the Exhibition Space.</w:t>
-      </w:r>
-    </w:p>
-    <w:p>
-      <w:pPr>
-        <w:pStyle w:val="Normal"/>
-        <w:spacing w:before="0" w:after="0" w:line="230" w:lineRule="auto"/>
-        <w:jc w:val="both"/>
-        <w:rPr>
-          <w:rFonts w:ascii="Calibri" w:hAnsi="Calibri" w:cs="Calibri"/>
-          <w:b/>
-          <w:b/>
-          <w:bCs/>
-        </w:rPr>
-      </w:pPr>
-      <w:r>
-        <w:rPr>
-          <w:rFonts w:cs="Arial" w:ascii="Arial" w:hAnsi="Arial"/>
-          <w:b/>
-          <w:bCs/>
-          <w:sz w:val="18"/>
-        </w:rPr>
-        <w:t xml:space="preserve">10.2 </w:t>
+        <w:t>The Sponsor consents to the graphic reproduction of photographs and video footage taken during the event for the purpose of promoting the congress in the media.</w:t>
+      </w:r>
+    </w:p>
+    <w:p>
+      <w:pPr>
+        <w:pStyle w:val="Normal"/>
+        <w:spacing w:before="0" w:after="0" w:line="230" w:lineRule="auto"/>
+        <w:jc w:val="both"/>
+        <w:rPr>
+          <w:rFonts w:ascii="Calibri" w:hAnsi="Calibri" w:cs="Calibri"/>
+          <w:b/>
+          <w:b/>
+          <w:bCs/>
+        </w:rPr>
+      </w:pPr>
+    </w:p>
+    <w:p>
+      <w:pPr>
+        <w:pStyle w:val="Normal"/>
+        <w:spacing w:before="0" w:after="0" w:line="230" w:lineRule="auto"/>
+        <w:jc w:val="both"/>
+        <w:rPr>
+          <w:rFonts w:ascii="Calibri" w:hAnsi="Calibri" w:cs="Calibri"/>
+        </w:rPr>
+      </w:pPr>
+      <w:r>
+        <w:rPr>
+          <w:rFonts w:cs="Arial" w:ascii="Arial" w:hAnsi="Arial"/>
+          <w:b/>
+          <w:bCs/>
+          <w:sz w:val="18"/>
+        </w:rPr>
+        <w:t xml:space="preserve">11. Return of the space - Damage to stand spaces - Waste disposal </w:t>
+      </w:r>
+    </w:p>
+    <w:p>
+      <w:pPr>
+        <w:pStyle w:val="Normal"/>
+        <w:spacing w:before="0" w:after="0" w:line="230" w:lineRule="auto"/>
+        <w:jc w:val="both"/>
+        <w:rPr>
+          <w:rFonts w:ascii="Calibri" w:hAnsi="Calibri" w:cs="Calibri"/>
+          <w:b/>
+          <w:b/>
+          <w:bCs/>
+        </w:rPr>
+      </w:pPr>
+      <w:r>
+        <w:rPr>
+          <w:rFonts w:cs="Arial" w:ascii="Arial" w:hAnsi="Arial"/>
+          <w:b/>
+          <w:bCs/>
+          <w:sz w:val="18"/>
+        </w:rPr>
+        <w:t xml:space="preserve">11.1 </w:t>
       </w:r>
       <w:r>
         <w:rPr>
@@ -3996,61 +4108,29 @@
           <w:iCs/>
           <w:sz w:val="18"/>
         </w:rPr>
-        <w:t>All waste produced during set-up/dismantling and during the event must be disposed of by the Exhibitor in compliance with the regulations in force. Should any materials not be taken to the landfill but be abandoned on the premises, or should waste not be disposed of correctly, the Organiser reserves the right to clear, at the Exhibitor's risk and expense, all materials, equipment and anything else not collected within the prescribed time limits, and to restore the occupied space. The Organiser assumes no obligation to store the materials and goods of Exhibitors cleared directly. All restoration costs and expenses, for any damage caused and for waste disposal, shall be borne by the Exhibitor.</w:t>
-      </w:r>
-    </w:p>
-    <w:p>
-      <w:pPr>
-        <w:pStyle w:val="Normal"/>
-        <w:spacing w:before="0" w:after="0" w:line="230" w:lineRule="auto"/>
-        <w:jc w:val="both"/>
-        <w:rPr>
-          <w:rFonts w:ascii="Calibri" w:hAnsi="Calibri" w:cs="Calibri"/>
-          <w:b/>
-          <w:b/>
-          <w:bCs/>
-        </w:rPr>
-      </w:pPr>
-    </w:p>
-    <w:p>
-      <w:pPr>
-        <w:pStyle w:val="Normal"/>
-        <w:spacing w:before="0" w:after="0" w:line="230" w:lineRule="auto"/>
-        <w:jc w:val="both"/>
-        <w:rPr>
-          <w:rFonts w:ascii="Calibri" w:hAnsi="Calibri" w:cs="Calibri"/>
-        </w:rPr>
-      </w:pPr>
-      <w:r>
-        <w:rPr>
-          <w:rFonts w:cs="Arial" w:ascii="Arial" w:hAnsi="Arial"/>
-          <w:b/>
-          <w:bCs/>
-          <w:sz w:val="18"/>
-        </w:rPr>
-        <w:t xml:space="preserve">11. Amendments or variations </w:t>
-      </w:r>
-    </w:p>
-    <w:p>
-      <w:pPr>
-        <w:pStyle w:val="Normal"/>
-        <w:spacing w:before="0" w:after="0" w:line="230" w:lineRule="auto"/>
-        <w:jc w:val="both"/>
-        <w:rPr>
-          <w:rFonts w:ascii="Calibri" w:hAnsi="Calibri" w:cs="Calibri"/>
-          <w:b/>
-          <w:b/>
-          <w:bCs/>
-        </w:rPr>
-      </w:pPr>
-      <w:r>
-        <w:rPr>
-          <w:rFonts w:cs="Arial" w:ascii="Arial" w:hAnsi="Arial"/>
-          <w:b/>
-          <w:bCs/>
-          <w:sz w:val="18"/>
-        </w:rPr>
-        <w:t xml:space="preserve">11.1 </w:t>
+        <w:t>At the end of the event the exhibition space must be returned in the same condition in which it was taken over by the Sponsor. All materials and set-up residues must be removed from the Exhibition Space.</w:t>
+      </w:r>
+    </w:p>
+    <w:p>
+      <w:pPr>
+        <w:pStyle w:val="Normal"/>
+        <w:spacing w:before="0" w:after="0" w:line="230" w:lineRule="auto"/>
+        <w:jc w:val="both"/>
+        <w:rPr>
+          <w:rFonts w:ascii="Calibri" w:hAnsi="Calibri" w:cs="Calibri"/>
+          <w:b/>
+          <w:b/>
+          <w:bCs/>
+        </w:rPr>
+      </w:pPr>
+      <w:r>
+        <w:rPr>
+          <w:rFonts w:cs="Arial" w:ascii="Arial" w:hAnsi="Arial"/>
+          <w:b/>
+          <w:bCs/>
+          <w:sz w:val="18"/>
+        </w:rPr>
+        <w:t xml:space="preserve">11.2 </w:t>
       </w:r>
       <w:r>
         <w:rPr>
@@ -4058,6 +4138,68 @@
           <w:iCs/>
           <w:sz w:val="18"/>
         </w:rPr>
+        <w:t>All waste produced during set-up/dismantling and during the event must be disposed of by the Sponsor in compliance with the regulations in force. Should any materials not be taken to the landfill but be abandoned on the premises, or should waste not be disposed of correctly, the Organizing Secretariat reserves the right to clear, at the Sponsor's risk and expense, all materials, equipment and anything else not collected within the prescribed time limits, and to restore the occupied space. The Organizing Secretariat assumes no obligation to store the materials and goods of Sponsors cleared directly. All restoration costs and expenses, for any damage caused and for waste disposal, shall be borne by the Sponsor.</w:t>
+      </w:r>
+    </w:p>
+    <w:p>
+      <w:pPr>
+        <w:pStyle w:val="Normal"/>
+        <w:spacing w:before="0" w:after="0" w:line="230" w:lineRule="auto"/>
+        <w:jc w:val="both"/>
+        <w:rPr>
+          <w:rFonts w:ascii="Calibri" w:hAnsi="Calibri" w:cs="Calibri"/>
+          <w:b/>
+          <w:b/>
+          <w:bCs/>
+        </w:rPr>
+      </w:pPr>
+    </w:p>
+    <w:p>
+      <w:pPr>
+        <w:pStyle w:val="Normal"/>
+        <w:spacing w:before="0" w:after="0" w:line="230" w:lineRule="auto"/>
+        <w:jc w:val="both"/>
+        <w:rPr>
+          <w:rFonts w:ascii="Calibri" w:hAnsi="Calibri" w:cs="Calibri"/>
+        </w:rPr>
+      </w:pPr>
+      <w:r>
+        <w:rPr>
+          <w:rFonts w:cs="Arial" w:ascii="Arial" w:hAnsi="Arial"/>
+          <w:b/>
+          <w:bCs/>
+          <w:sz w:val="18"/>
+        </w:rPr>
+        <w:t xml:space="preserve">12. Amendments or variations </w:t>
+      </w:r>
+    </w:p>
+    <w:p>
+      <w:pPr>
+        <w:pStyle w:val="Normal"/>
+        <w:spacing w:before="0" w:after="0" w:line="230" w:lineRule="auto"/>
+        <w:jc w:val="both"/>
+        <w:rPr>
+          <w:rFonts w:ascii="Calibri" w:hAnsi="Calibri" w:cs="Calibri"/>
+          <w:b/>
+          <w:b/>
+          <w:bCs/>
+        </w:rPr>
+      </w:pPr>
+      <w:r>
+        <w:rPr>
+          <w:rFonts w:cs="Arial" w:ascii="Arial" w:hAnsi="Arial"/>
+          <w:b/>
+          <w:bCs/>
+          <w:sz w:val="18"/>
+        </w:rPr>
+        <w:t xml:space="preserve">12.1 </w:t>
+      </w:r>
+      <w:r>
+        <w:rPr>
+          <w:rFonts w:cs="Arial" w:ascii="Arial" w:hAnsi="Arial"/>
+          <w:iCs/>
+          <w:sz w:val="18"/>
+        </w:rPr>
         <w:t>Any derogation from this Agreement/Regulations shall be null and void and in any case without effect unless made in writing.</w:t>
       </w:r>
     </w:p>
@@ -4100,61 +4242,61 @@
           <w:iCs/>
           <w:sz w:val="18"/>
         </w:rPr>
-        <w:t>By signing these regulations, the Exhibitor declares to have read them and specifically approves their clauses.</w:t>
-      </w:r>
-    </w:p>
-    <w:p>
-      <w:pPr>
-        <w:pStyle w:val="Normal"/>
-        <w:spacing w:before="0" w:after="0" w:line="230" w:lineRule="auto"/>
-        <w:jc w:val="both"/>
-        <w:rPr>
-          <w:rFonts w:ascii="Calibri" w:hAnsi="Calibri" w:cs="Calibri"/>
-          <w:b/>
-          <w:b/>
-          <w:bCs/>
-        </w:rPr>
-      </w:pPr>
-    </w:p>
-    <w:p>
-      <w:pPr>
-        <w:pStyle w:val="Normal"/>
-        <w:spacing w:before="0" w:after="0" w:line="230" w:lineRule="auto"/>
-        <w:jc w:val="both"/>
-        <w:rPr>
-          <w:rFonts w:ascii="Calibri" w:hAnsi="Calibri" w:cs="Calibri"/>
-        </w:rPr>
-      </w:pPr>
-      <w:r>
-        <w:rPr>
-          <w:rFonts w:cs="Arial" w:ascii="Arial" w:hAnsi="Arial"/>
-          <w:b/>
-          <w:bCs/>
-          <w:sz w:val="18"/>
-        </w:rPr>
-        <w:t xml:space="preserve">12. Governing law and jurisdiction </w:t>
-      </w:r>
-    </w:p>
-    <w:p>
-      <w:pPr>
-        <w:pStyle w:val="Normal"/>
-        <w:spacing w:before="0" w:after="0" w:line="230" w:lineRule="auto"/>
-        <w:jc w:val="both"/>
-        <w:rPr>
-          <w:rFonts w:ascii="Calibri" w:hAnsi="Calibri" w:cs="Calibri"/>
-          <w:b/>
-          <w:b/>
-          <w:bCs/>
-        </w:rPr>
-      </w:pPr>
-      <w:r>
-        <w:rPr>
-          <w:rFonts w:cs="Arial" w:ascii="Arial" w:hAnsi="Arial"/>
-          <w:b/>
-          <w:bCs/>
-          <w:sz w:val="18"/>
-        </w:rPr>
-        <w:t xml:space="preserve">12.1 </w:t>
+        <w:t>By signing these regulations, the Sponsor declares to have read them and specifically approves their clauses.</w:t>
+      </w:r>
+    </w:p>
+    <w:p>
+      <w:pPr>
+        <w:pStyle w:val="Normal"/>
+        <w:spacing w:before="0" w:after="0" w:line="230" w:lineRule="auto"/>
+        <w:jc w:val="both"/>
+        <w:rPr>
+          <w:rFonts w:ascii="Calibri" w:hAnsi="Calibri" w:cs="Calibri"/>
+          <w:b/>
+          <w:b/>
+          <w:bCs/>
+        </w:rPr>
+      </w:pPr>
+    </w:p>
+    <w:p>
+      <w:pPr>
+        <w:pStyle w:val="Normal"/>
+        <w:spacing w:before="0" w:after="0" w:line="230" w:lineRule="auto"/>
+        <w:jc w:val="both"/>
+        <w:rPr>
+          <w:rFonts w:ascii="Calibri" w:hAnsi="Calibri" w:cs="Calibri"/>
+        </w:rPr>
+      </w:pPr>
+      <w:r>
+        <w:rPr>
+          <w:rFonts w:cs="Arial" w:ascii="Arial" w:hAnsi="Arial"/>
+          <w:b/>
+          <w:bCs/>
+          <w:sz w:val="18"/>
+        </w:rPr>
+        <w:t xml:space="preserve">13. Governing law and jurisdiction </w:t>
+      </w:r>
+    </w:p>
+    <w:p>
+      <w:pPr>
+        <w:pStyle w:val="Normal"/>
+        <w:spacing w:before="0" w:after="0" w:line="230" w:lineRule="auto"/>
+        <w:jc w:val="both"/>
+        <w:rPr>
+          <w:rFonts w:ascii="Calibri" w:hAnsi="Calibri" w:cs="Calibri"/>
+          <w:b/>
+          <w:b/>
+          <w:bCs/>
+        </w:rPr>
+      </w:pPr>
+      <w:r>
+        <w:rPr>
+          <w:rFonts w:cs="Arial" w:ascii="Arial" w:hAnsi="Arial"/>
+          <w:b/>
+          <w:bCs/>
+          <w:sz w:val="18"/>
+        </w:rPr>
+        <w:t xml:space="preserve">13.1 </w:t>
       </w:r>
       <w:r>
         <w:rPr>
@@ -4162,7 +4304,7 @@
           <w:iCs/>
           <w:sz w:val="18"/>
         </w:rPr>
-        <w:t>This agreement is governed by Italian law. The Court of Bologna shall have exclusive jurisdiction over any legal disputes relating to or connected with the interpretation, performance and termination of this agreement or arising from the Exhibitor's participation in the Event.</w:t>
+        <w:t>This agreement is governed by Italian law. The Court of Bologna shall have exclusive jurisdiction over any legal disputes relating to or connected with the interpretation, performance and termination of this agreement or arising from the Sponsor's participation in the Event.</w:t>
       </w:r>
     </w:p>
     <w:p>
@@ -4560,7 +4702,7 @@
           <w:iCs/>
           <w:sz w:val="18"/>
         </w:rPr>
-        <w:t xml:space="preserve"> 3. Consideration, payment terms and cancellation terms; 4. Term and Termination of the Agreement; 5. Confidentiality and non-disclosure; 7. Miscellaneous; 8. Loudspeakers - Sound broadcasts; 9. Promotional and advertising activities; 10. Return of the space - Damage to stand spaces - Waste disposal; 11. Amendments or variations; 12. Governing law and jurisdiction.</w:t>
+        <w:t xml:space="preserve"> 3. Consideration, payment terms and cancellation terms; 4. Allocation of exhibition spaces; 5. Term and Termination of the Agreement; 6. Confidentiality and non-disclosure; 8. Miscellaneous; 9. Loudspeakers - Sound broadcasts; 10. Promotional and advertising activities; 11. Return of the space - Damage to stand spaces - Waste disposal; 12. Amendments or variations; 13. Governing law and jurisdiction.</w:t>
       </w:r>
     </w:p>
     <w:p>

</xml_diff>

<commit_message>
Contratto: tolto l 8.3 sul foro di Bologna (resta il 13.1), 8.4-8.7 rinumerati 8.3-8.6
Co-Authored-By: Claude Opus 5.5 <noreply@anthropic.com>
</commit_message>
<xml_diff>
--- a/contracts/templates_pdf/template_contratto_sponsor_non_ecm_en.docx
+++ b/contracts/templates_pdf/template_contratto_sponsor_non_ecm_en.docx
@@ -3556,48 +3556,6 @@
           <w:rFonts w:cs="Arial" w:ascii="Arial" w:hAnsi="Arial"/>
           <w:sz w:val="18"/>
         </w:rPr>
-        <w:t xml:space="preserve">Any dispute that may arise in relation to this Agreement, its interpretation, performance or termination shall be subject to the exclusive jurisdiction of the Court of Bologna. </w:t>
-      </w:r>
-    </w:p>
-    <w:p>
-      <w:pPr>
-        <w:pStyle w:val="Normal"/>
-        <w:spacing w:before="0" w:after="0" w:line="230" w:lineRule="auto"/>
-        <w:jc w:val="both"/>
-        <w:rPr>
-          <w:rFonts w:ascii="Calibri" w:hAnsi="Calibri" w:cs="Calibri"/>
-        </w:rPr>
-      </w:pPr>
-      <w:r>
-        <w:rPr>
-          <w:rFonts w:cs="Arial" w:ascii="Arial" w:hAnsi="Arial"/>
-          <w:sz w:val="18"/>
-        </w:rPr>
-      </w:r>
-    </w:p>
-    <w:p>
-      <w:pPr>
-        <w:pStyle w:val="Normal"/>
-        <w:spacing w:before="0" w:after="0" w:line="230" w:lineRule="auto"/>
-        <w:jc w:val="both"/>
-        <w:rPr>
-          <w:rFonts w:ascii="Calibri" w:hAnsi="Calibri" w:cs="Calibri"/>
-        </w:rPr>
-      </w:pPr>
-      <w:r>
-        <w:rPr>
-          <w:rFonts w:cs="Arial" w:ascii="Arial" w:hAnsi="Arial"/>
-          <w:b/>
-          <w:bCs/>
-          <w:sz w:val="18"/>
-        </w:rPr>
-        <w:t xml:space="preserve">8.4 </w:t>
-      </w:r>
-      <w:r>
-        <w:rPr>
-          <w:rFonts w:cs="Arial" w:ascii="Arial" w:hAnsi="Arial"/>
-          <w:sz w:val="18"/>
-        </w:rPr>
         <w:t xml:space="preserve">The Organizing Secretariat undertakes not to disclose to third parties and/or use information of a confidential nature relating to the Sponsor, meaning by such the data, news and information relating to the Sponsor's analyses, products, activities, projects, technologies, know-how, organization, industrial processes and customers.</w:t>
       </w:r>
     </w:p>
@@ -3641,7 +3599,7 @@
           <w:sz w:val="18"/>
           <w:szCs w:val="20"/>
         </w:rPr>
-        <w:t xml:space="preserve">8.5 </w:t>
+        <w:t xml:space="preserve">8.4 </w:t>
       </w:r>
       <w:r>
         <w:rPr>
@@ -3734,7 +3692,7 @@
           <w:bCs/>
           <w:sz w:val="18"/>
         </w:rPr>
-        <w:t>8.6 TERMINATION</w:t>
+        <w:t>8.5 TERMINATION</w:t>
       </w:r>
     </w:p>
     <w:p>
@@ -3811,7 +3769,7 @@
           <w:bCs/>
           <w:sz w:val="18"/>
         </w:rPr>
-        <w:t>8.7 REPRODUCTION RIGHTS</w:t>
+        <w:t>8.6 REPRODUCTION RIGHTS</w:t>
       </w:r>
     </w:p>
     <w:p>

</xml_diff>

<commit_message>
Contratto: art. 7 Rinvio, riduzione o sospensione della manifestazione; documentazione 5 anni in 8.3
L ex 8.4 (manifestazione che non ha luogo) diventa il testo dell art. 7,
l ex 7.1 diventa 8.3, la confidenzialita 8.4; art. 7 nella dichiarazione 1341-1342.

Co-Authored-By: Claude Opus 5.5 <noreply@anthropic.com>
</commit_message>
<xml_diff>
--- a/contracts/templates_pdf/template_contratto_sponsor_non_ecm_en.docx
+++ b/contracts/templates_pdf/template_contratto_sponsor_non_ecm_en.docx
@@ -3370,209 +3370,7 @@
           <w:bCs/>
           <w:sz w:val="18"/>
         </w:rPr>
-        <w:t xml:space="preserve">7. Further obligations of the Parties </w:t>
-      </w:r>
-    </w:p>
-    <w:p>
-      <w:pPr>
-        <w:pStyle w:val="Normal"/>
-        <w:spacing w:before="0" w:after="0" w:line="230" w:lineRule="auto"/>
-        <w:jc w:val="both"/>
-        <w:rPr/>
-      </w:pPr>
-      <w:r>
-        <w:rPr>
-          <w:rFonts w:cs="Arial" w:ascii="Arial" w:hAnsi="Arial"/>
-          <w:b/>
-          <w:bCs/>
-          <w:sz w:val="18"/>
-        </w:rPr>
-        <w:t xml:space="preserve">7.1 </w:t>
-      </w:r>
-      <w:r>
-        <w:rPr>
-          <w:rFonts w:cs="Arial" w:ascii="Arial" w:hAnsi="Arial"/>
-          <w:sz w:val="18"/>
-        </w:rPr>
-        <w:t xml:space="preserve">The Organizing Secretariat undertakes to keep complete and accurate documentation concerning its relations with the Sponsor for a period of no less than five years. </w:t>
-      </w:r>
-    </w:p>
-    <w:p>
-      <w:pPr>
-        <w:pStyle w:val="Normal"/>
-        <w:spacing w:before="0" w:after="0" w:line="230" w:lineRule="auto"/>
-        <w:jc w:val="both"/>
-        <w:rPr>
-          <w:rFonts w:ascii="Calibri" w:hAnsi="Calibri" w:cs="Calibri"/>
-        </w:rPr>
-      </w:pPr>
-      <w:r>
-        <w:rPr>
-          <w:rFonts w:cs="Arial" w:ascii="Arial" w:hAnsi="Arial"/>
-          <w:sz w:val="18"/>
-        </w:rPr>
-      </w:r>
-    </w:p>
-    <w:p>
-      <w:pPr>
-        <w:pStyle w:val="Normal"/>
-        <w:spacing w:before="0" w:after="0" w:line="230" w:lineRule="auto"/>
-        <w:jc w:val="both"/>
-        <w:rPr>
-          <w:rFonts w:ascii="Calibri" w:hAnsi="Calibri" w:cs="Calibri"/>
-        </w:rPr>
-      </w:pPr>
-      <w:r>
-        <w:rPr>
-          <w:rFonts w:cs="Arial" w:ascii="Arial" w:hAnsi="Arial"/>
-          <w:b/>
-          <w:bCs/>
-          <w:sz w:val="18"/>
-        </w:rPr>
-        <w:t xml:space="preserve">8. Miscellaneous </w:t>
-      </w:r>
-    </w:p>
-    <w:p>
-      <w:pPr>
-        <w:pStyle w:val="Normal"/>
-        <w:spacing w:before="0" w:after="0" w:line="230" w:lineRule="auto"/>
-        <w:jc w:val="both"/>
-        <w:rPr>
-          <w:rFonts w:ascii="Calibri" w:hAnsi="Calibri" w:cs="Calibri"/>
-        </w:rPr>
-      </w:pPr>
-      <w:r>
-        <w:rPr>
-          <w:rFonts w:cs="Arial" w:ascii="Arial" w:hAnsi="Arial"/>
-          <w:b/>
-          <w:bCs/>
-          <w:sz w:val="18"/>
-        </w:rPr>
-        <w:t xml:space="preserve">8.1 </w:t>
-      </w:r>
-      <w:r>
-        <w:rPr>
-          <w:rFonts w:cs="Arial" w:ascii="Arial" w:hAnsi="Arial"/>
-          <w:sz w:val="18"/>
-        </w:rPr>
-        <w:t xml:space="preserve">The recitals and the Annexes form an integral and substantial part of this agreement. </w:t>
-      </w:r>
-    </w:p>
-    <w:p>
-      <w:pPr>
-        <w:pStyle w:val="Normal"/>
-        <w:spacing w:before="0" w:after="0" w:line="230" w:lineRule="auto"/>
-        <w:jc w:val="both"/>
-        <w:rPr>
-          <w:rFonts w:ascii="Calibri" w:hAnsi="Calibri" w:cs="Calibri"/>
-        </w:rPr>
-      </w:pPr>
-      <w:r>
-        <w:rPr>
-          <w:rFonts w:cs="Arial" w:ascii="Arial" w:hAnsi="Arial"/>
-          <w:sz w:val="18"/>
-        </w:rPr>
-      </w:r>
-    </w:p>
-    <w:p>
-      <w:pPr>
-        <w:pStyle w:val="Normal"/>
-        <w:spacing w:before="0" w:after="0" w:line="230" w:lineRule="auto"/>
-        <w:jc w:val="both"/>
-        <w:rPr>
-          <w:rFonts w:ascii="Calibri" w:hAnsi="Calibri" w:cs="Calibri"/>
-        </w:rPr>
-      </w:pPr>
-      <w:r>
-        <w:rPr>
-          <w:rFonts w:cs="Arial" w:ascii="Arial" w:hAnsi="Arial"/>
-          <w:b/>
-          <w:bCs/>
-          <w:sz w:val="18"/>
-        </w:rPr>
-        <w:t xml:space="preserve">8.2 </w:t>
-      </w:r>
-      <w:r>
-        <w:rPr>
-          <w:rFonts w:cs="Arial" w:ascii="Arial" w:hAnsi="Arial"/>
-          <w:sz w:val="18"/>
-        </w:rPr>
-        <w:t xml:space="preserve">No amendment to this Agreement shall be effective unless made in writing and duly signed by all the Parties. </w:t>
-      </w:r>
-    </w:p>
-    <w:p>
-      <w:pPr>
-        <w:pStyle w:val="Normal"/>
-        <w:spacing w:before="0" w:after="0" w:line="230" w:lineRule="auto"/>
-        <w:jc w:val="both"/>
-        <w:rPr>
-          <w:rFonts w:ascii="Calibri" w:hAnsi="Calibri" w:cs="Calibri"/>
-        </w:rPr>
-      </w:pPr>
-      <w:r>
-        <w:rPr>
-          <w:rFonts w:cs="Arial" w:ascii="Arial" w:hAnsi="Arial"/>
-          <w:sz w:val="18"/>
-        </w:rPr>
-        <w:t xml:space="preserve">Any communication between the Parties shall be made in writing and shall be sent solely to the respective addresses indicated in the first part of this agreement</w:t>
-      </w:r>
-    </w:p>
-    <w:p>
-      <w:pPr>
-        <w:pStyle w:val="Normal"/>
-        <w:spacing w:before="0" w:after="0" w:line="230" w:lineRule="auto"/>
-        <w:jc w:val="both"/>
-        <w:rPr>
-          <w:rFonts w:ascii="Calibri" w:hAnsi="Calibri" w:cs="Calibri"/>
-        </w:rPr>
-      </w:pPr>
-      <w:r>
-        <w:rPr>
-          <w:rFonts w:cs="Arial" w:ascii="Arial" w:hAnsi="Arial"/>
-          <w:sz w:val="18"/>
-        </w:rPr>
-      </w:r>
-    </w:p>
-    <w:p>
-      <w:pPr>
-        <w:pStyle w:val="Normal"/>
-        <w:spacing w:before="0" w:after="0" w:line="230" w:lineRule="auto"/>
-        <w:jc w:val="both"/>
-        <w:rPr>
-          <w:rFonts w:ascii="Calibri" w:hAnsi="Calibri" w:cs="Calibri"/>
-        </w:rPr>
-      </w:pPr>
-      <w:r>
-        <w:rPr>
-          <w:rFonts w:cs="Arial" w:ascii="Arial" w:hAnsi="Arial"/>
-          <w:b/>
-          <w:bCs/>
-          <w:sz w:val="18"/>
-        </w:rPr>
-        <w:t xml:space="preserve">8.3 </w:t>
-      </w:r>
-      <w:r>
-        <w:rPr>
-          <w:rFonts w:cs="Arial" w:ascii="Arial" w:hAnsi="Arial"/>
-          <w:sz w:val="18"/>
-        </w:rPr>
-        <w:t xml:space="preserve">The Organizing Secretariat undertakes not to disclose to third parties and/or use information of a confidential nature relating to the Sponsor, meaning by such the data, news and information relating to the Sponsor's analyses, products, activities, projects, technologies, know-how, organization, industrial processes and customers.</w:t>
-      </w:r>
-    </w:p>
-    <w:p>
-      <w:pPr>
-        <w:pStyle w:val="Normal"/>
-        <w:spacing w:before="0" w:after="0" w:line="230" w:lineRule="auto"/>
-        <w:jc w:val="both"/>
-        <w:rPr>
-          <w:rFonts w:ascii="Calibri" w:hAnsi="Calibri" w:cs="Calibri"/>
-        </w:rPr>
-      </w:pPr>
-      <w:r>
-        <w:rPr>
-          <w:rFonts w:cs="Arial" w:ascii="Arial" w:hAnsi="Arial"/>
-          <w:sz w:val="18"/>
-        </w:rPr>
+        <w:t xml:space="preserve">7. Postponement, reduction or suspension of the Event </w:t>
       </w:r>
     </w:p>
     <w:p>
@@ -3594,16 +3392,6 @@
       <w:r>
         <w:rPr>
           <w:rFonts w:cs="Arial" w:ascii="Arial" w:hAnsi="Arial"/>
-          <w:b/>
-          <w:bCs/>
-          <w:sz w:val="18"/>
-          <w:szCs w:val="20"/>
-        </w:rPr>
-        <w:t xml:space="preserve">8.4 </w:t>
-      </w:r>
-      <w:r>
-        <w:rPr>
-          <w:rFonts w:cs="Arial" w:ascii="Arial" w:hAnsi="Arial"/>
           <w:sz w:val="18"/>
           <w:szCs w:val="20"/>
         </w:rPr>
@@ -3667,11 +3455,216 @@
         <w:jc w:val="both"/>
         <w:rPr>
           <w:rFonts w:ascii="Calibri" w:hAnsi="Calibri" w:cs="Calibri"/>
-          <w:b/>
-          <w:b/>
-          <w:bCs/>
-        </w:rPr>
-      </w:pPr>
+        </w:rPr>
+      </w:pPr>
+      <w:r>
+        <w:rPr>
+          <w:rFonts w:cs="Arial" w:ascii="Arial" w:hAnsi="Arial"/>
+          <w:sz w:val="18"/>
+        </w:rPr>
+      </w:r>
+    </w:p>
+    <w:p>
+      <w:pPr>
+        <w:pStyle w:val="Normal"/>
+        <w:spacing w:before="0" w:after="0" w:line="230" w:lineRule="auto"/>
+        <w:jc w:val="both"/>
+        <w:rPr>
+          <w:rFonts w:ascii="Calibri" w:hAnsi="Calibri" w:cs="Calibri"/>
+        </w:rPr>
+      </w:pPr>
+      <w:r>
+        <w:rPr>
+          <w:rFonts w:cs="Arial" w:ascii="Arial" w:hAnsi="Arial"/>
+          <w:b/>
+          <w:bCs/>
+          <w:sz w:val="18"/>
+        </w:rPr>
+        <w:t xml:space="preserve">8. Miscellaneous </w:t>
+      </w:r>
+    </w:p>
+    <w:p>
+      <w:pPr>
+        <w:pStyle w:val="Normal"/>
+        <w:spacing w:before="0" w:after="0" w:line="230" w:lineRule="auto"/>
+        <w:jc w:val="both"/>
+        <w:rPr>
+          <w:rFonts w:ascii="Calibri" w:hAnsi="Calibri" w:cs="Calibri"/>
+        </w:rPr>
+      </w:pPr>
+      <w:r>
+        <w:rPr>
+          <w:rFonts w:cs="Arial" w:ascii="Arial" w:hAnsi="Arial"/>
+          <w:b/>
+          <w:bCs/>
+          <w:sz w:val="18"/>
+        </w:rPr>
+        <w:t xml:space="preserve">8.1 </w:t>
+      </w:r>
+      <w:r>
+        <w:rPr>
+          <w:rFonts w:cs="Arial" w:ascii="Arial" w:hAnsi="Arial"/>
+          <w:sz w:val="18"/>
+        </w:rPr>
+        <w:t xml:space="preserve">The recitals and the Annexes form an integral and substantial part of this agreement. </w:t>
+      </w:r>
+    </w:p>
+    <w:p>
+      <w:pPr>
+        <w:pStyle w:val="Normal"/>
+        <w:spacing w:before="0" w:after="0" w:line="230" w:lineRule="auto"/>
+        <w:jc w:val="both"/>
+        <w:rPr>
+          <w:rFonts w:ascii="Calibri" w:hAnsi="Calibri" w:cs="Calibri"/>
+        </w:rPr>
+      </w:pPr>
+      <w:r>
+        <w:rPr>
+          <w:rFonts w:cs="Arial" w:ascii="Arial" w:hAnsi="Arial"/>
+          <w:sz w:val="18"/>
+        </w:rPr>
+      </w:r>
+    </w:p>
+    <w:p>
+      <w:pPr>
+        <w:pStyle w:val="Normal"/>
+        <w:spacing w:before="0" w:after="0" w:line="230" w:lineRule="auto"/>
+        <w:jc w:val="both"/>
+        <w:rPr>
+          <w:rFonts w:ascii="Calibri" w:hAnsi="Calibri" w:cs="Calibri"/>
+        </w:rPr>
+      </w:pPr>
+      <w:r>
+        <w:rPr>
+          <w:rFonts w:cs="Arial" w:ascii="Arial" w:hAnsi="Arial"/>
+          <w:b/>
+          <w:bCs/>
+          <w:sz w:val="18"/>
+        </w:rPr>
+        <w:t xml:space="preserve">8.2 </w:t>
+      </w:r>
+      <w:r>
+        <w:rPr>
+          <w:rFonts w:cs="Arial" w:ascii="Arial" w:hAnsi="Arial"/>
+          <w:sz w:val="18"/>
+        </w:rPr>
+        <w:t xml:space="preserve">No amendment to this Agreement shall be effective unless made in writing and duly signed by all the Parties. </w:t>
+      </w:r>
+    </w:p>
+    <w:p>
+      <w:pPr>
+        <w:pStyle w:val="Normal"/>
+        <w:spacing w:before="0" w:after="0" w:line="230" w:lineRule="auto"/>
+        <w:jc w:val="both"/>
+        <w:rPr>
+          <w:rFonts w:ascii="Calibri" w:hAnsi="Calibri" w:cs="Calibri"/>
+        </w:rPr>
+      </w:pPr>
+      <w:r>
+        <w:rPr>
+          <w:rFonts w:cs="Arial" w:ascii="Arial" w:hAnsi="Arial"/>
+          <w:sz w:val="18"/>
+        </w:rPr>
+        <w:t xml:space="preserve">Any communication between the Parties shall be made in writing and shall be sent solely to the respective addresses indicated in the first part of this agreement</w:t>
+      </w:r>
+    </w:p>
+    <w:p>
+      <w:pPr>
+        <w:pStyle w:val="Normal"/>
+        <w:spacing w:before="0" w:after="0" w:line="230" w:lineRule="auto"/>
+        <w:jc w:val="both"/>
+        <w:rPr>
+          <w:rFonts w:ascii="Calibri" w:hAnsi="Calibri" w:cs="Calibri"/>
+        </w:rPr>
+      </w:pPr>
+      <w:r>
+        <w:rPr>
+          <w:rFonts w:cs="Arial" w:ascii="Arial" w:hAnsi="Arial"/>
+          <w:sz w:val="18"/>
+        </w:rPr>
+      </w:r>
+    </w:p>
+    <w:p>
+      <w:pPr>
+        <w:pStyle w:val="Normal"/>
+        <w:spacing w:before="0" w:after="0" w:line="230" w:lineRule="auto"/>
+        <w:jc w:val="both"/>
+        <w:rPr/>
+      </w:pPr>
+      <w:r>
+        <w:rPr>
+          <w:rFonts w:cs="Arial" w:ascii="Arial" w:hAnsi="Arial"/>
+          <w:b/>
+          <w:bCs/>
+          <w:sz w:val="18"/>
+        </w:rPr>
+        <w:t xml:space="preserve">8.3 </w:t>
+      </w:r>
+      <w:r>
+        <w:rPr>
+          <w:rFonts w:cs="Arial" w:ascii="Arial" w:hAnsi="Arial"/>
+          <w:sz w:val="18"/>
+        </w:rPr>
+        <w:t xml:space="preserve">The Organizing Secretariat undertakes to keep complete and accurate documentation concerning its relations with the Sponsor for a period of no less than five years. </w:t>
+      </w:r>
+    </w:p>
+    <w:p>
+      <w:pPr>
+        <w:pStyle w:val="Normal"/>
+        <w:spacing w:before="0" w:after="0" w:line="230" w:lineRule="auto"/>
+        <w:jc w:val="both"/>
+        <w:rPr>
+          <w:rFonts w:ascii="Calibri" w:hAnsi="Calibri" w:cs="Calibri"/>
+        </w:rPr>
+      </w:pPr>
+      <w:r>
+        <w:rPr>
+          <w:rFonts w:cs="Arial" w:ascii="Arial" w:hAnsi="Arial"/>
+          <w:sz w:val="18"/>
+        </w:rPr>
+      </w:r>
+    </w:p>
+    <w:p>
+      <w:pPr>
+        <w:pStyle w:val="Normal"/>
+        <w:spacing w:before="0" w:after="0" w:line="230" w:lineRule="auto"/>
+        <w:jc w:val="both"/>
+        <w:rPr>
+          <w:rFonts w:ascii="Calibri" w:hAnsi="Calibri" w:cs="Calibri"/>
+        </w:rPr>
+      </w:pPr>
+      <w:r>
+        <w:rPr>
+          <w:rFonts w:cs="Arial" w:ascii="Arial" w:hAnsi="Arial"/>
+          <w:b/>
+          <w:bCs/>
+          <w:sz w:val="18"/>
+        </w:rPr>
+        <w:t xml:space="preserve">8.4 </w:t>
+      </w:r>
+      <w:r>
+        <w:rPr>
+          <w:rFonts w:cs="Arial" w:ascii="Arial" w:hAnsi="Arial"/>
+          <w:sz w:val="18"/>
+        </w:rPr>
+        <w:t xml:space="preserve">The Organizing Secretariat undertakes not to disclose to third parties and/or use information of a confidential nature relating to the Sponsor, meaning by such the data, news and information relating to the Sponsor's analyses, products, activities, projects, technologies, know-how, organization, industrial processes and customers.</w:t>
+      </w:r>
+    </w:p>
+    <w:p>
+      <w:pPr>
+        <w:pStyle w:val="Normal"/>
+        <w:spacing w:before="0" w:after="0" w:line="230" w:lineRule="auto"/>
+        <w:jc w:val="both"/>
+        <w:rPr>
+          <w:rFonts w:ascii="Calibri" w:hAnsi="Calibri" w:cs="Calibri"/>
+        </w:rPr>
+      </w:pPr>
+      <w:r>
+        <w:rPr>
+          <w:rFonts w:cs="Arial" w:ascii="Arial" w:hAnsi="Arial"/>
+          <w:sz w:val="18"/>
+        </w:rPr>
+      </w:r>
     </w:p>
     <w:p>
       <w:pPr>
@@ -4660,7 +4653,7 @@
           <w:iCs/>
           <w:sz w:val="18"/>
         </w:rPr>
-        <w:t xml:space="preserve"> 3. Consideration, payment terms and cancellation terms; 4. Allocation of exhibition spaces; 5. Term and Termination of the Agreement; 6. Confidentiality and non-disclosure; 8. Miscellaneous; 9. Loudspeakers - Sound broadcasts; 10. Promotional and advertising activities; 11. Return of the space - Damage to stand spaces - Waste disposal; 12. Amendments or variations; 13. Governing law and jurisdiction.</w:t>
+        <w:t xml:space="preserve"> 3. Consideration, payment terms and cancellation terms; 4. Allocation of exhibition spaces; 5. Term and Termination of the Agreement; 6. Confidentiality and non-disclosure; 7. Postponement, reduction or suspension of the Event; 8. Miscellaneous; 9. Loudspeakers - Sound broadcasts; 10. Promotional and advertising activities; 11. Return of the space - Damage to stand spaces - Waste disposal; 12. Amendments or variations; 13. Governing law and jurisdiction.</w:t>
       </w:r>
     </w:p>
     <w:p>

</xml_diff>

<commit_message>
Contratto: art. 12 Esonero di responsabilita ed obblighi assicurativi; 12-13 diventano 13-14
Aggiornati la clausola risolutiva (8.5) e l elenco della dichiarazione
1341-1342, in italiano e in inglese.

Co-Authored-By: Claude Opus 5.5 <noreply@anthropic.com>
</commit_message>
<xml_diff>
--- a/contracts/templates_pdf/template_contratto_sponsor_non_ecm_en.docx
+++ b/contracts/templates_pdf/template_contratto_sponsor_non_ecm_en.docx
@@ -3706,7 +3706,7 @@
           <w:iCs/>
           <w:sz w:val="18"/>
         </w:rPr>
-        <w:t>Any breach of the provisions of articles 2, 3, 4, 5, 6, 8, 9, 10, 11, 12 and 13 shall entitle the Organizing Secretariat to unilaterally terminate this agreement with immediate effect pursuant to art. 1456 of the Italian Civil Code, by notice sent by registered letter with return receipt and/or certified e-mail (PEC), declaring its intention to avail itself of this express termination clause, without prejudice to compensation for any damages suffered.</w:t>
+        <w:t>Any breach of the provisions of articles 2, 3, 4, 5, 6, 8, 9, 10, 11, 12, 13 and 14 shall entitle the Organizing Secretariat to unilaterally terminate this agreement with immediate effect pursuant to art. 1456 of the Italian Civil Code, by notice sent by registered letter with return receipt and/or certified e-mail (PEC), declaring its intention to avail itself of this express termination clause, without prejudice to compensation for any damages suffered.</w:t>
       </w:r>
     </w:p>
     <w:p>
@@ -4121,7 +4121,7 @@
           <w:bCs/>
           <w:sz w:val="18"/>
         </w:rPr>
-        <w:t xml:space="preserve">12. Amendments or variations </w:t>
+        <w:t xml:space="preserve">12. Exemption from liability and insurance obligations </w:t>
       </w:r>
     </w:p>
     <w:p>
@@ -4151,6 +4151,221 @@
           <w:iCs/>
           <w:sz w:val="18"/>
         </w:rPr>
+        <w:t>In addition to the provisions above, the Organizing Secretariat and the Congress Centre are expressly exempted from any liability, whether contractual or non-contractual, towards the Sponsors (including their employees or collaborators and the suppliers/stand builders appointed by them), the carriers of goods, the participants in the event and third parties in general for:</w:t>
+      </w:r>
+    </w:p>
+    <w:p>
+      <w:pPr>
+        <w:pStyle w:val="Normal"/>
+        <w:spacing w:before="0" w:after="0" w:line="230" w:lineRule="auto"/>
+        <w:jc w:val="both"/>
+        <w:rPr>
+          <w:rFonts w:ascii="Calibri" w:hAnsi="Calibri" w:cs="Calibri"/>
+          <w:b/>
+          <w:b/>
+          <w:bCs/>
+        </w:rPr>
+      </w:pPr>
+      <w:r>
+        <w:rPr>
+          <w:rFonts w:cs="Arial" w:ascii="Arial" w:hAnsi="Arial"/>
+          <w:iCs/>
+          <w:sz w:val="18"/>
+        </w:rPr>
+        <w:t>– theft of materials;</w:t>
+      </w:r>
+    </w:p>
+    <w:p>
+      <w:pPr>
+        <w:pStyle w:val="Normal"/>
+        <w:spacing w:before="0" w:after="0" w:line="230" w:lineRule="auto"/>
+        <w:jc w:val="both"/>
+        <w:rPr>
+          <w:rFonts w:ascii="Calibri" w:hAnsi="Calibri" w:cs="Calibri"/>
+          <w:b/>
+          <w:b/>
+          <w:bCs/>
+        </w:rPr>
+      </w:pPr>
+      <w:r>
+        <w:rPr>
+          <w:rFonts w:cs="Arial" w:ascii="Arial" w:hAnsi="Arial"/>
+          <w:iCs/>
+          <w:sz w:val="18"/>
+        </w:rPr>
+        <w:t>– damage resulting from theft or damage from any cause (including fire) to materials of any kind;</w:t>
+      </w:r>
+    </w:p>
+    <w:p>
+      <w:pPr>
+        <w:pStyle w:val="Normal"/>
+        <w:spacing w:before="0" w:after="0" w:line="230" w:lineRule="auto"/>
+        <w:jc w:val="both"/>
+        <w:rPr>
+          <w:rFonts w:ascii="Calibri" w:hAnsi="Calibri" w:cs="Calibri"/>
+          <w:b/>
+          <w:b/>
+          <w:bCs/>
+        </w:rPr>
+      </w:pPr>
+      <w:r>
+        <w:rPr>
+          <w:rFonts w:cs="Arial" w:ascii="Arial" w:hAnsi="Arial"/>
+          <w:iCs/>
+          <w:sz w:val="18"/>
+        </w:rPr>
+        <w:t>– improper and unauthorised use of equipment, furnishings, machinery and systems of the Organizing Secretariat and of the Congress Centre during the period of stay in their facilities.</w:t>
+      </w:r>
+    </w:p>
+    <w:p>
+      <w:pPr>
+        <w:pStyle w:val="Normal"/>
+        <w:spacing w:before="0" w:after="0" w:line="230" w:lineRule="auto"/>
+        <w:jc w:val="both"/>
+        <w:rPr>
+          <w:rFonts w:ascii="Calibri" w:hAnsi="Calibri" w:cs="Calibri"/>
+          <w:b/>
+          <w:b/>
+          <w:bCs/>
+        </w:rPr>
+      </w:pPr>
+      <w:r>
+        <w:rPr>
+          <w:rFonts w:cs="Arial" w:ascii="Arial" w:hAnsi="Arial"/>
+          <w:b/>
+          <w:bCs/>
+          <w:sz w:val="18"/>
+        </w:rPr>
+        <w:t xml:space="preserve">12.2 </w:t>
+      </w:r>
+      <w:r>
+        <w:rPr>
+          <w:rFonts w:cs="Arial" w:ascii="Arial" w:hAnsi="Arial"/>
+          <w:iCs/>
+          <w:sz w:val="18"/>
+        </w:rPr>
+        <w:t>The Sponsor shall be liable for all damage directly or indirectly caused to the Organizing Secretariat, the Congress Centre, the Sponsors and any other third party by the Sponsor, its employees, auxiliaries and/or collaborators during the Event.</w:t>
+      </w:r>
+    </w:p>
+    <w:p>
+      <w:pPr>
+        <w:pStyle w:val="Normal"/>
+        <w:spacing w:before="0" w:after="0" w:line="230" w:lineRule="auto"/>
+        <w:jc w:val="both"/>
+        <w:rPr>
+          <w:rFonts w:ascii="Calibri" w:hAnsi="Calibri" w:cs="Calibri"/>
+          <w:b/>
+          <w:b/>
+          <w:bCs/>
+        </w:rPr>
+      </w:pPr>
+      <w:r>
+        <w:rPr>
+          <w:rFonts w:cs="Arial" w:ascii="Arial" w:hAnsi="Arial"/>
+          <w:b/>
+          <w:bCs/>
+          <w:sz w:val="18"/>
+        </w:rPr>
+        <w:t xml:space="preserve">12.3 </w:t>
+      </w:r>
+      <w:r>
+        <w:rPr>
+          <w:rFonts w:cs="Arial" w:ascii="Arial" w:hAnsi="Arial"/>
+          <w:iCs/>
+          <w:sz w:val="18"/>
+        </w:rPr>
+        <w:t>Compensation for damage that the Sponsors and the Contractors (including their employees and/or collaborators), the participants and third parties in general may suffer and/or cause, directly or indirectly, shall be covered exclusively by an adequate insurance policy which the Sponsor undertakes to take out from the start of the relationship and to keep in force for its entire duration, with a leading insurance company, expressly including in the policy the insurer’s waiver of any action of recourse, subrogation and/or indemnity against the Organizing Secretariat (VALET Srl) and the Congress Centre and their employees or collaborators.</w:t>
+      </w:r>
+    </w:p>
+    <w:p>
+      <w:pPr>
+        <w:pStyle w:val="Normal"/>
+        <w:spacing w:before="0" w:after="0" w:line="230" w:lineRule="auto"/>
+        <w:jc w:val="both"/>
+        <w:rPr>
+          <w:rFonts w:ascii="Calibri" w:hAnsi="Calibri" w:cs="Calibri"/>
+          <w:b/>
+          <w:b/>
+          <w:bCs/>
+        </w:rPr>
+      </w:pPr>
+      <w:r>
+        <w:rPr>
+          <w:rFonts w:cs="Arial" w:ascii="Arial" w:hAnsi="Arial"/>
+          <w:b/>
+          <w:bCs/>
+          <w:sz w:val="18"/>
+        </w:rPr>
+        <w:t xml:space="preserve">12.4 </w:t>
+      </w:r>
+      <w:r>
+        <w:rPr>
+          <w:rFonts w:cs="Arial" w:ascii="Arial" w:hAnsi="Arial"/>
+          <w:iCs/>
+          <w:sz w:val="18"/>
+        </w:rPr>
+        <w:t>The Sponsor shall provide the Organizing Secretariat, upon simple request, with a copy of the insurance policies.</w:t>
+      </w:r>
+    </w:p>
+    <w:p>
+      <w:pPr>
+        <w:pStyle w:val="Normal"/>
+        <w:spacing w:before="0" w:after="0" w:line="230" w:lineRule="auto"/>
+        <w:jc w:val="both"/>
+        <w:rPr>
+          <w:rFonts w:ascii="Calibri" w:hAnsi="Calibri" w:cs="Calibri"/>
+          <w:b/>
+          <w:b/>
+          <w:bCs/>
+        </w:rPr>
+      </w:pPr>
+    </w:p>
+    <w:p>
+      <w:pPr>
+        <w:pStyle w:val="Normal"/>
+        <w:spacing w:before="0" w:after="0" w:line="230" w:lineRule="auto"/>
+        <w:jc w:val="both"/>
+        <w:rPr>
+          <w:rFonts w:ascii="Calibri" w:hAnsi="Calibri" w:cs="Calibri"/>
+        </w:rPr>
+      </w:pPr>
+      <w:r>
+        <w:rPr>
+          <w:rFonts w:cs="Arial" w:ascii="Arial" w:hAnsi="Arial"/>
+          <w:b/>
+          <w:bCs/>
+          <w:sz w:val="18"/>
+        </w:rPr>
+        <w:t xml:space="preserve">13. Amendments or variations </w:t>
+      </w:r>
+    </w:p>
+    <w:p>
+      <w:pPr>
+        <w:pStyle w:val="Normal"/>
+        <w:spacing w:before="0" w:after="0" w:line="230" w:lineRule="auto"/>
+        <w:jc w:val="both"/>
+        <w:rPr>
+          <w:rFonts w:ascii="Calibri" w:hAnsi="Calibri" w:cs="Calibri"/>
+          <w:b/>
+          <w:b/>
+          <w:bCs/>
+        </w:rPr>
+      </w:pPr>
+      <w:r>
+        <w:rPr>
+          <w:rFonts w:cs="Arial" w:ascii="Arial" w:hAnsi="Arial"/>
+          <w:b/>
+          <w:bCs/>
+          <w:sz w:val="18"/>
+        </w:rPr>
+        <w:t xml:space="preserve">13.1 </w:t>
+      </w:r>
+      <w:r>
+        <w:rPr>
+          <w:rFonts w:cs="Arial" w:ascii="Arial" w:hAnsi="Arial"/>
+          <w:iCs/>
+          <w:sz w:val="18"/>
+        </w:rPr>
         <w:t>Any derogation from this Agreement/Regulations shall be null and void and in any case without effect unless made in writing.</w:t>
       </w:r>
     </w:p>
@@ -4225,29 +4440,29 @@
           <w:bCs/>
           <w:sz w:val="18"/>
         </w:rPr>
-        <w:t xml:space="preserve">13. Governing law and jurisdiction </w:t>
-      </w:r>
-    </w:p>
-    <w:p>
-      <w:pPr>
-        <w:pStyle w:val="Normal"/>
-        <w:spacing w:before="0" w:after="0" w:line="230" w:lineRule="auto"/>
-        <w:jc w:val="both"/>
-        <w:rPr>
-          <w:rFonts w:ascii="Calibri" w:hAnsi="Calibri" w:cs="Calibri"/>
-          <w:b/>
-          <w:b/>
-          <w:bCs/>
-        </w:rPr>
-      </w:pPr>
-      <w:r>
-        <w:rPr>
-          <w:rFonts w:cs="Arial" w:ascii="Arial" w:hAnsi="Arial"/>
-          <w:b/>
-          <w:bCs/>
-          <w:sz w:val="18"/>
-        </w:rPr>
-        <w:t xml:space="preserve">13.1 </w:t>
+        <w:t xml:space="preserve">14. Governing law and jurisdiction </w:t>
+      </w:r>
+    </w:p>
+    <w:p>
+      <w:pPr>
+        <w:pStyle w:val="Normal"/>
+        <w:spacing w:before="0" w:after="0" w:line="230" w:lineRule="auto"/>
+        <w:jc w:val="both"/>
+        <w:rPr>
+          <w:rFonts w:ascii="Calibri" w:hAnsi="Calibri" w:cs="Calibri"/>
+          <w:b/>
+          <w:b/>
+          <w:bCs/>
+        </w:rPr>
+      </w:pPr>
+      <w:r>
+        <w:rPr>
+          <w:rFonts w:cs="Arial" w:ascii="Arial" w:hAnsi="Arial"/>
+          <w:b/>
+          <w:bCs/>
+          <w:sz w:val="18"/>
+        </w:rPr>
+        <w:t xml:space="preserve">14.1 </w:t>
       </w:r>
       <w:r>
         <w:rPr>
@@ -4653,7 +4868,7 @@
           <w:iCs/>
           <w:sz w:val="18"/>
         </w:rPr>
-        <w:t xml:space="preserve"> 3. Consideration, payment terms and cancellation terms; 4. Allocation of exhibition spaces; 5. Term and Termination of the Agreement; 6. Confidentiality and non-disclosure; 7. Postponement, reduction or suspension of the Event; 8. Miscellaneous; 9. Loudspeakers - Sound broadcasts; 10. Promotional and advertising activities; 11. Return of the space - Damage to stand spaces - Waste disposal; 12. Amendments or variations; 13. Governing law and jurisdiction.</w:t>
+        <w:t xml:space="preserve"> 3. Consideration, payment terms and cancellation terms; 4. Allocation of exhibition spaces; 5. Term and Termination of the Agreement; 6. Confidentiality and non-disclosure; 7. Postponement, reduction or suspension of the Event; 8. Miscellaneous; 9. Loudspeakers - Sound broadcasts; 10. Promotional and advertising activities; 11. Return of the space - Damage to stand spaces - Waste disposal; 12. Exemption from liability and insurance obligations; 13. Amendments or variations; 14. Governing law and jurisdiction.</w:t>
       </w:r>
     </w:p>
     <w:p>

</xml_diff>

<commit_message>
Allegato 1: riepilogo tecnico prima di data e firme; indicazioni specifiche in riquadro; premessa a) non in grassetto
Co-Authored-By: Claude Opus 5.5 <noreply@anthropic.com>
</commit_message>
<xml_diff>
--- a/contracts/templates_pdf/template_contratto_sponsor_non_ecm_en.docx
+++ b/contracts/templates_pdf/template_contratto_sponsor_non_ecm_en.docx
@@ -1947,7 +1947,15 @@
           <w:bCs/>
           <w:sz w:val="18"/>
         </w:rPr>
-        <w:t xml:space="preserve">a) The Organizing Secretariat, an entity with proven experience, active in the field of the organization and/or production of events in compliance with art. 124 of D. Lgs. 24 April 2006, n. 219 (Italian Legislative Decree), intends to acquire sponsorships in order to secure funding for the realization of the event {{ event.name }}{% if event.sede_completa %}, {{ event.sede_completa }}{% endif %} which will take place on {{ event.start_date|format_date }}{% if event.end_date and event.end_date != event.start_date %} – {{ event.end_date|format_date }}{% endif %} and is intended for the training of healthcare professionals; </w:t>
+        <w:t xml:space="preserve">a) </w:t>
+      </w:r>
+      <w:r>
+        <w:rPr>
+          <w:rFonts w:cs="Arial" w:ascii="Arial" w:hAnsi="Arial"/>
+          <w:bCs/>
+          <w:sz w:val="18"/>
+        </w:rPr>
+        <w:t xml:space="preserve">The Organizing Secretariat, an entity with proven experience, active in the field of the organization and/or production of events in compliance with art. 124 of D. Lgs. 24 April 2006, n. 219 (Italian Legislative Decree), intends to acquire sponsorships in order to secure funding for the realization of the event {{ event.name }}{% if event.sede_completa %}, {{ event.sede_completa }}{% endif %} which will take place on {{ event.start_date|format_date }}{% if event.end_date and event.end_date != event.start_date %} – {{ event.end_date|format_date }}{% endif %} and is intended for the training of healthcare professionals; </w:t>
       </w:r>
     </w:p>
     <w:p>

</xml_diff>

<commit_message>
Contratto 3.3: caparra confirmatoria ai sensi dell art. 1385 c.c.
Co-Authored-By: Claude Opus 5.5 <noreply@anthropic.com>
</commit_message>
<xml_diff>
--- a/contracts/templates_pdf/template_contratto_sponsor_non_ecm_en.docx
+++ b/contracts/templates_pdf/template_contratto_sponsor_non_ecm_en.docx
@@ -2978,7 +2978,28 @@
           <w:iCs/>
           <w:sz w:val="18"/>
         </w:rPr>
-        <w:t>The Sponsor's withdrawal from participation in the Event (and/or any total or partial changes or cancellations of the booking), for any reason whatsoever, must be notified by registered letter with return receipt or by certified e-mail (PEC) addressed to the Organizing Secretariat at least 30 days before the start of the Event. In such case the Organizing Secretariat shall be entitled to retain, as a penalty, an amount equal to {{ penale_percent }}% of the total amount of this agreement{% if has_deposit %} (corresponding to the security deposit/down payment){% endif %}. Should the withdrawal be received after the 30th day before the start of the Event, the Sponsor shall be required to pay the full consideration of this agreement.</w:t>
+        <w:t>Upon signing the agreement, the Sponsor shall pay an amount equal to {{ penale_percent }}% of the total amount indicated in Annex 1, calculated on the total including VAT, as a confirmatory deposit pursuant to art. 1385 of the Italian Civil Code. In the event of due performance, this amount shall be credited against the consideration due and deducted from the balance payable.</w:t>
+      </w:r>
+    </w:p>
+    <w:p>
+      <w:pPr>
+        <w:pStyle w:val="Normal"/>
+        <w:spacing w:before="0" w:after="0" w:line="230" w:lineRule="auto"/>
+        <w:jc w:val="both"/>
+        <w:rPr>
+          <w:rFonts w:ascii="Calibri" w:hAnsi="Calibri" w:cs="Calibri"/>
+          <w:b/>
+          <w:b/>
+          <w:bCs/>
+        </w:rPr>
+      </w:pPr>
+      <w:r>
+        <w:rPr>
+          <w:rFonts w:cs="Arial" w:ascii="Arial" w:hAnsi="Arial"/>
+          <w:iCs/>
+          <w:sz w:val="18"/>
+        </w:rPr>
+        <w:t>In the event of withdrawal from participation constituting a breach attributable to the Sponsor, the Organizing Secretariat may withdraw from the agreement by written notice to the Sponsor and retain the confirmatory deposit as agreed liquidation of damages, pursuant to art. 1385 of the Italian Civil Code.</w:t>
       </w:r>
     </w:p>
     <w:p>

</xml_diff>

<commit_message>
Contratto 5.3: clausola risolutiva espressa con i casi a)-e)
Co-Authored-By: Claude Opus 5.5 <noreply@anthropic.com>
</commit_message>
<xml_diff>
--- a/contracts/templates_pdf/template_contratto_sponsor_non_ecm_en.docx
+++ b/contracts/templates_pdf/template_contratto_sponsor_non_ecm_en.docx
@@ -3218,14 +3218,127 @@
           <w:bCs/>
           <w:sz w:val="18"/>
         </w:rPr>
-        <w:t xml:space="preserve">5.3 </w:t>
-      </w:r>
-      <w:r>
-        <w:rPr>
-          <w:rFonts w:cs="Arial" w:ascii="Arial" w:hAnsi="Arial"/>
-          <w:sz w:val="18"/>
-        </w:rPr>
-        <w:t xml:space="preserve">The Organizing Secretariat shall be entitled to terminate this agreement by operation of law, vis-à-vis the Sponsor, pursuant to and for the purposes of Art. 1456 of the Italian Civil Code (cod. civ.), by PEC to: valet@pec.it, declaring its intention to avail itself of this clause, should the latter breach any of the commitments undertaken in the recitals and pursuant to artt. 1 et seq. of this Agreement. </w:t>
+        <w:t>5.3 EXPRESS TERMINATION CLAUSE</w:t>
+      </w:r>
+    </w:p>
+    <w:p>
+      <w:pPr>
+        <w:pStyle w:val="Normal"/>
+        <w:spacing w:before="0" w:after="0" w:line="230" w:lineRule="auto"/>
+        <w:jc w:val="both"/>
+        <w:rPr/>
+      </w:pPr>
+      <w:r>
+        <w:rPr>
+          <w:rFonts w:cs="Arial" w:ascii="Arial" w:hAnsi="Arial"/>
+          <w:sz w:val="18"/>
+        </w:rPr>
+        <w:t>The Organizing Secretariat may terminate the agreement pursuant to art. 1456 of the Italian Civil Code should the Sponsor:</w:t>
+      </w:r>
+    </w:p>
+    <w:p>
+      <w:pPr>
+        <w:pStyle w:val="Normal"/>
+        <w:spacing w:before="0" w:after="0" w:line="230" w:lineRule="auto"/>
+        <w:jc w:val="both"/>
+        <w:rPr/>
+      </w:pPr>
+      <w:r>
+        <w:rPr>
+          <w:rFonts w:cs="Arial" w:ascii="Arial" w:hAnsi="Arial"/>
+          <w:sz w:val="18"/>
+        </w:rPr>
+        <w:t>a) fail to pay the confirmatory deposit or the balance within the terms expressly indicated in Annex 1;</w:t>
+      </w:r>
+    </w:p>
+    <w:p>
+      <w:pPr>
+        <w:pStyle w:val="Normal"/>
+        <w:spacing w:before="0" w:after="0" w:line="230" w:lineRule="auto"/>
+        <w:jc w:val="both"/>
+        <w:rPr/>
+      </w:pPr>
+      <w:r>
+        <w:rPr>
+          <w:rFonts w:cs="Arial" w:ascii="Arial" w:hAnsi="Arial"/>
+          <w:sz w:val="18"/>
+        </w:rPr>
+        <w:t>b) transfer to third parties, in whole or in part, even free of charge and without the written authorisation of the Organizing Secretariat, the exhibition spaces or the services booked, in breach of art. 4.2 of the agreement;</w:t>
+      </w:r>
+    </w:p>
+    <w:p>
+      <w:pPr>
+        <w:pStyle w:val="Normal"/>
+        <w:spacing w:before="0" w:after="0" w:line="230" w:lineRule="auto"/>
+        <w:jc w:val="both"/>
+        <w:rPr/>
+      </w:pPr>
+      <w:r>
+        <w:rPr>
+          <w:rFonts w:cs="Arial" w:ascii="Arial" w:hAnsi="Arial"/>
+          <w:sz w:val="18"/>
+        </w:rPr>
+        <w:t>c) activate or tamper with the general electrical network systems without authorisation, in breach of art. 11.01 of Annex 2;</w:t>
+      </w:r>
+    </w:p>
+    <w:p>
+      <w:pPr>
+        <w:pStyle w:val="Normal"/>
+        <w:spacing w:before="0" w:after="0" w:line="230" w:lineRule="auto"/>
+        <w:jc w:val="both"/>
+        <w:rPr/>
+      </w:pPr>
+      <w:r>
+        <w:rPr>
+          <w:rFonts w:cs="Arial" w:ascii="Arial" w:hAnsi="Arial"/>
+          <w:sz w:val="18"/>
+        </w:rPr>
+        <w:t>d) fail to remove, within the term indicated in the written notice, materials or fittings obstructing escape routes or emergency exits, in breach of art. 7.14 of Annex 2;</w:t>
+      </w:r>
+    </w:p>
+    <w:p>
+      <w:pPr>
+        <w:pStyle w:val="Normal"/>
+        <w:spacing w:before="0" w:after="0" w:line="230" w:lineRule="auto"/>
+        <w:jc w:val="both"/>
+        <w:rPr/>
+      </w:pPr>
+      <w:r>
+        <w:rPr>
+          <w:rFonts w:cs="Arial" w:ascii="Arial" w:hAnsi="Arial"/>
+          <w:sz w:val="18"/>
+        </w:rPr>
+        <w:t>e) continue or resume the activities affected by a suspension order adopted pursuant to art. 6 of Annex 2, without the conditions communicated for their resumption having been met.</w:t>
+      </w:r>
+    </w:p>
+    <w:p>
+      <w:pPr>
+        <w:pStyle w:val="Normal"/>
+        <w:spacing w:before="0" w:after="0" w:line="230" w:lineRule="auto"/>
+        <w:jc w:val="both"/>
+        <w:rPr/>
+      </w:pPr>
+      <w:r>
+        <w:rPr>
+          <w:rFonts w:cs="Arial" w:ascii="Arial" w:hAnsi="Arial"/>
+          <w:sz w:val="18"/>
+        </w:rPr>
+        <w:t>Termination shall take effect when the Sponsor receives, by PEC or registered letter with return receipt, the declaration of the Organizing Secretariat that it intends to avail itself of this clause, indicating the specific breach contested.</w:t>
+      </w:r>
+    </w:p>
+    <w:p>
+      <w:pPr>
+        <w:pStyle w:val="Normal"/>
+        <w:spacing w:before="0" w:after="0" w:line="230" w:lineRule="auto"/>
+        <w:jc w:val="both"/>
+        <w:rPr/>
+      </w:pPr>
+      <w:r>
+        <w:rPr>
+          <w:rFonts w:cs="Arial" w:ascii="Arial" w:hAnsi="Arial"/>
+          <w:sz w:val="18"/>
+        </w:rPr>
+        <w:t>In the event of termination during the event, the Sponsor shall cease its activities and vacate the exhibition space according to the times and methods communicated by the Organizing Secretariat, in compliance with safety conditions. The rights of the parties relating to the sums paid or due and to compensation for damages remain unaffected, in accordance with the agreement and the law.</w:t>
       </w:r>
     </w:p>
     <w:p>

</xml_diff>

<commit_message>
Contratto: 3.3 Rinuncia alla partecipazione e cancellazioni; 4.3 movimentazione a mano non consente lo smontaggio anticipato
Co-Authored-By: Claude Opus 5.5 <noreply@anthropic.com>
</commit_message>
<xml_diff>
--- a/contracts/templates_pdf/template_contratto_sponsor_non_ecm_en.docx
+++ b/contracts/templates_pdf/template_contratto_sponsor_non_ecm_en.docx
@@ -2970,15 +2970,28 @@
           <w:bCs/>
           <w:sz w:val="18"/>
         </w:rPr>
-        <w:t xml:space="preserve">3.3 </w:t>
-      </w:r>
+        <w:t>3.3 Withdrawal from participation and cancellations</w:t>
+      </w:r>
+    </w:p>
+    <w:p>
+      <w:pPr>
+        <w:pStyle w:val="Normal"/>
+        <w:spacing w:before="0" w:after="0" w:line="230" w:lineRule="auto"/>
+        <w:jc w:val="both"/>
+        <w:rPr>
+          <w:rFonts w:ascii="Calibri" w:hAnsi="Calibri" w:cs="Calibri"/>
+          <w:b/>
+          <w:b/>
+          <w:bCs/>
+        </w:rPr>
+      </w:pPr>
       <w:r>
         <w:rPr>
           <w:rFonts w:cs="Arial" w:ascii="Arial" w:hAnsi="Arial"/>
           <w:iCs/>
           <w:sz w:val="18"/>
         </w:rPr>
-        <w:t>Upon signing the agreement, the Sponsor shall pay an amount equal to {{ penale_percent }}% of the total amount indicated in Annex 1, calculated on the total including VAT, as a confirmatory deposit pursuant to art. 1385 of the Italian Civil Code. In the event of due performance, this amount shall be credited against the consideration due and deducted from the balance payable.</w:t>
+        <w:t>The Sponsor's withdrawal from participation in the event must be notified to the Organizing Secretariat by PEC or registered letter with return receipt to the addresses indicated in this agreement. For the purposes of the terms set out below, the date of receipt of the notice shall prevail.</w:t>
       </w:r>
     </w:p>
     <w:p>
@@ -2999,7 +3012,70 @@
           <w:iCs/>
           <w:sz w:val="18"/>
         </w:rPr>
-        <w:t>In the event of withdrawal from participation constituting a breach attributable to the Sponsor, the Organizing Secretariat may withdraw from the agreement by written notice to the Sponsor and retain the confirmatory deposit as agreed liquidation of damages, pursuant to art. 1385 of the Italian Civil Code.</w:t>
+        <w:t>Should the total withdrawal be received at least 30 days before the start of the event and constitute a breach attributable to the Sponsor, the Organizing Secretariat may withdraw from the agreement by written notice and retain the confirmatory deposit provided for in Annex 1 as agreed liquidation of damages pursuant to art. 1385, second paragraph, of the Italian Civil Code. In such case, any sums already paid in excess of the deposit shall be refunded to the Sponsor.</w:t>
+      </w:r>
+    </w:p>
+    <w:p>
+      <w:pPr>
+        <w:pStyle w:val="Normal"/>
+        <w:spacing w:before="0" w:after="0" w:line="230" w:lineRule="auto"/>
+        <w:jc w:val="both"/>
+        <w:rPr>
+          <w:rFonts w:ascii="Calibri" w:hAnsi="Calibri" w:cs="Calibri"/>
+          <w:b/>
+          <w:b/>
+          <w:bCs/>
+        </w:rPr>
+      </w:pPr>
+      <w:r>
+        <w:rPr>
+          <w:rFonts w:cs="Arial" w:ascii="Arial" w:hAnsi="Arial"/>
+          <w:iCs/>
+          <w:sz w:val="18"/>
+        </w:rPr>
+        <w:t>Should the total withdrawal be received less than 30 days before the start of the event and constitute a breach attributable to the Sponsor, the Organizing Secretariat may request the termination of the agreement and the payment, as a penalty pursuant to art. 1382 of the Italian Civil Code, of an amount equal to 100% of the total amount indicated in Annex 1, taken as the calculation basis including VAT. All sums already paid by the Sponsor in relation to the agreement, including the confirmatory deposit, shall be deducted from the penalty; only any remaining difference shall therefore be due. The application of this penalty is an alternative to withdrawal with retention of the confirmatory deposit and shall not be cumulated with it.</w:t>
+      </w:r>
+    </w:p>
+    <w:p>
+      <w:pPr>
+        <w:pStyle w:val="Normal"/>
+        <w:spacing w:before="0" w:after="0" w:line="230" w:lineRule="auto"/>
+        <w:jc w:val="both"/>
+        <w:rPr>
+          <w:rFonts w:ascii="Calibri" w:hAnsi="Calibri" w:cs="Calibri"/>
+          <w:b/>
+          <w:b/>
+          <w:bCs/>
+        </w:rPr>
+      </w:pPr>
+      <w:r>
+        <w:rPr>
+          <w:rFonts w:cs="Arial" w:ascii="Arial" w:hAnsi="Arial"/>
+          <w:iCs/>
+          <w:sz w:val="18"/>
+        </w:rPr>
+        <w:t>Requests to reduce the spaces or cancel individual services must be agreed in writing with the Organizing Secretariat, specifying their economic effects. In the absence of a written agreement, the services and amounts originally agreed shall remain unchanged.</w:t>
+      </w:r>
+    </w:p>
+    <w:p>
+      <w:pPr>
+        <w:pStyle w:val="Normal"/>
+        <w:spacing w:before="0" w:after="0" w:line="230" w:lineRule="auto"/>
+        <w:jc w:val="both"/>
+        <w:rPr>
+          <w:rFonts w:ascii="Calibri" w:hAnsi="Calibri" w:cs="Calibri"/>
+          <w:b/>
+          <w:b/>
+          <w:bCs/>
+        </w:rPr>
+      </w:pPr>
+      <w:r>
+        <w:rPr>
+          <w:rFonts w:cs="Arial" w:ascii="Arial" w:hAnsi="Arial"/>
+          <w:iCs/>
+          <w:sz w:val="18"/>
+        </w:rPr>
+        <w:t>The provisions of art. 7 concerning the postponement, reduction or suspension of the event remain unaffected.</w:t>
       </w:r>
     </w:p>
     <w:p>
@@ -3111,7 +3187,7 @@
           <w:rFonts w:cs="Arial" w:ascii="Arial" w:hAnsi="Arial"/>
           <w:sz w:val="18"/>
         </w:rPr>
-        <w:t>The custody and surveillance of the Exhibition Space, and of its contents, during set-up, during the Event and during dismantling are the responsibility of the Sponsor. The Organizing Secretariat is therefore not liable for objects or goods left unattended in the Exhibition Space during the opening and closing hours of the Event. Removing goods and structures during the event is strictly prohibited.</w:t>
+        <w:t>The custody and surveillance of the Exhibition Space, and of its contents, during set-up, during the Event and during dismantling are the responsibility of the Sponsor. The Organizing Secretariat is therefore not liable for objects or goods left unattended in the Exhibition Space during the opening and closing hours of the Event. Removing goods and structures during the event is strictly prohibited. Any authorised manual handling of packages does not in any case allow the early dismantling or emptying of the stand.</w:t>
       </w:r>
     </w:p>
     <w:p>

</xml_diff>

<commit_message>
Contratto 5.3: risoluzione di diritto via PEC per violazione degli impegni (art. 1456 c.c.)
Co-Authored-By: Claude Opus 5.5 <noreply@anthropic.com>
</commit_message>
<xml_diff>
--- a/contracts/templates_pdf/template_contratto_sponsor_non_ecm_en.docx
+++ b/contracts/templates_pdf/template_contratto_sponsor_non_ecm_en.docx
@@ -3294,127 +3294,14 @@
           <w:bCs/>
           <w:sz w:val="18"/>
         </w:rPr>
-        <w:t>5.3 EXPRESS TERMINATION CLAUSE</w:t>
-      </w:r>
-    </w:p>
-    <w:p>
-      <w:pPr>
-        <w:pStyle w:val="Normal"/>
-        <w:spacing w:before="0" w:after="0" w:line="230" w:lineRule="auto"/>
-        <w:jc w:val="both"/>
-        <w:rPr/>
-      </w:pPr>
-      <w:r>
-        <w:rPr>
-          <w:rFonts w:cs="Arial" w:ascii="Arial" w:hAnsi="Arial"/>
-          <w:sz w:val="18"/>
-        </w:rPr>
-        <w:t>The Organizing Secretariat may terminate the agreement pursuant to art. 1456 of the Italian Civil Code should the Sponsor:</w:t>
-      </w:r>
-    </w:p>
-    <w:p>
-      <w:pPr>
-        <w:pStyle w:val="Normal"/>
-        <w:spacing w:before="0" w:after="0" w:line="230" w:lineRule="auto"/>
-        <w:jc w:val="both"/>
-        <w:rPr/>
-      </w:pPr>
-      <w:r>
-        <w:rPr>
-          <w:rFonts w:cs="Arial" w:ascii="Arial" w:hAnsi="Arial"/>
-          <w:sz w:val="18"/>
-        </w:rPr>
-        <w:t>a) fail to pay the confirmatory deposit or the balance within the terms expressly indicated in Annex 1;</w:t>
-      </w:r>
-    </w:p>
-    <w:p>
-      <w:pPr>
-        <w:pStyle w:val="Normal"/>
-        <w:spacing w:before="0" w:after="0" w:line="230" w:lineRule="auto"/>
-        <w:jc w:val="both"/>
-        <w:rPr/>
-      </w:pPr>
-      <w:r>
-        <w:rPr>
-          <w:rFonts w:cs="Arial" w:ascii="Arial" w:hAnsi="Arial"/>
-          <w:sz w:val="18"/>
-        </w:rPr>
-        <w:t>b) transfer to third parties, in whole or in part, even free of charge and without the written authorisation of the Organizing Secretariat, the exhibition spaces or the services booked, in breach of art. 4.2 of the agreement;</w:t>
-      </w:r>
-    </w:p>
-    <w:p>
-      <w:pPr>
-        <w:pStyle w:val="Normal"/>
-        <w:spacing w:before="0" w:after="0" w:line="230" w:lineRule="auto"/>
-        <w:jc w:val="both"/>
-        <w:rPr/>
-      </w:pPr>
-      <w:r>
-        <w:rPr>
-          <w:rFonts w:cs="Arial" w:ascii="Arial" w:hAnsi="Arial"/>
-          <w:sz w:val="18"/>
-        </w:rPr>
-        <w:t>c) activate or tamper with the general electrical network systems without authorisation, in breach of art. 11.01 of Annex 2;</w:t>
-      </w:r>
-    </w:p>
-    <w:p>
-      <w:pPr>
-        <w:pStyle w:val="Normal"/>
-        <w:spacing w:before="0" w:after="0" w:line="230" w:lineRule="auto"/>
-        <w:jc w:val="both"/>
-        <w:rPr/>
-      </w:pPr>
-      <w:r>
-        <w:rPr>
-          <w:rFonts w:cs="Arial" w:ascii="Arial" w:hAnsi="Arial"/>
-          <w:sz w:val="18"/>
-        </w:rPr>
-        <w:t>d) fail to remove, within the term indicated in the written notice, materials or fittings obstructing escape routes or emergency exits, in breach of art. 7.14 of Annex 2;</w:t>
-      </w:r>
-    </w:p>
-    <w:p>
-      <w:pPr>
-        <w:pStyle w:val="Normal"/>
-        <w:spacing w:before="0" w:after="0" w:line="230" w:lineRule="auto"/>
-        <w:jc w:val="both"/>
-        <w:rPr/>
-      </w:pPr>
-      <w:r>
-        <w:rPr>
-          <w:rFonts w:cs="Arial" w:ascii="Arial" w:hAnsi="Arial"/>
-          <w:sz w:val="18"/>
-        </w:rPr>
-        <w:t>e) continue or resume the activities affected by a suspension order adopted pursuant to art. 6 of Annex 2, without the conditions communicated for their resumption having been met.</w:t>
-      </w:r>
-    </w:p>
-    <w:p>
-      <w:pPr>
-        <w:pStyle w:val="Normal"/>
-        <w:spacing w:before="0" w:after="0" w:line="230" w:lineRule="auto"/>
-        <w:jc w:val="both"/>
-        <w:rPr/>
-      </w:pPr>
-      <w:r>
-        <w:rPr>
-          <w:rFonts w:cs="Arial" w:ascii="Arial" w:hAnsi="Arial"/>
-          <w:sz w:val="18"/>
-        </w:rPr>
-        <w:t>Termination shall take effect when the Sponsor receives, by PEC or registered letter with return receipt, the declaration of the Organizing Secretariat that it intends to avail itself of this clause, indicating the specific breach contested.</w:t>
-      </w:r>
-    </w:p>
-    <w:p>
-      <w:pPr>
-        <w:pStyle w:val="Normal"/>
-        <w:spacing w:before="0" w:after="0" w:line="230" w:lineRule="auto"/>
-        <w:jc w:val="both"/>
-        <w:rPr/>
-      </w:pPr>
-      <w:r>
-        <w:rPr>
-          <w:rFonts w:cs="Arial" w:ascii="Arial" w:hAnsi="Arial"/>
-          <w:sz w:val="18"/>
-        </w:rPr>
-        <w:t>In the event of termination during the event, the Sponsor shall cease its activities and vacate the exhibition space according to the times and methods communicated by the Organizing Secretariat, in compliance with safety conditions. The rights of the parties relating to the sums paid or due and to compensation for damages remain unaffected, in accordance with the agreement and the law.</w:t>
+        <w:t xml:space="preserve">5.3 </w:t>
+      </w:r>
+      <w:r>
+        <w:rPr>
+          <w:rFonts w:cs="Arial" w:ascii="Arial" w:hAnsi="Arial"/>
+          <w:sz w:val="18"/>
+        </w:rPr>
+        <w:t>The Organizing Secretariat shall be entitled to terminate this agreement by operation of law vis-à-vis the Sponsor, pursuant to and for the purposes of art. 1456 of the Italian Civil Code, by notice sent from its PEC address valet@pec.it to the Sponsor's PEC address indicated in this agreement, declaring its intention to avail itself of this clause, should the latter breach any of the undertakings made in the recitals and in articles 1 et seq. of this agreement. Termination shall take effect upon receipt of the notice by the Sponsor.</w:t>
       </w:r>
     </w:p>
     <w:p>

</xml_diff>

<commit_message>
Contratto 8.5: modalita di contestazione, sospensione e risoluzione (rimandi all art. 6 All. 2 e al 5.3)
Co-Authored-By: Claude Opus 5.5 <noreply@anthropic.com>
</commit_message>
<xml_diff>
--- a/contracts/templates_pdf/template_contratto_sponsor_non_ecm_en.docx
+++ b/contracts/templates_pdf/template_contratto_sponsor_non_ecm_en.docx
@@ -3790,7 +3790,7 @@
           <w:bCs/>
           <w:sz w:val="18"/>
         </w:rPr>
-        <w:t>8.5 TERMINATION</w:t>
+        <w:t>8.5 METHODS OF CONTESTATION, SUSPENSION AND TERMINATION</w:t>
       </w:r>
     </w:p>
     <w:p>
@@ -3811,7 +3811,7 @@
           <w:iCs/>
           <w:sz w:val="18"/>
         </w:rPr>
-        <w:t>Any breach of the provisions of articles 2, 3, 4, 5, 6, 8, 9, 10, 11, 12, 13 and 14 shall entitle the Organizing Secretariat to unilaterally terminate this agreement with immediate effect pursuant to art. 1456 of the Italian Civil Code, by notice sent by registered letter with return receipt and/or certified e-mail (PEC), declaring its intention to avail itself of this express termination clause, without prejudice to compensation for any damages suffered.</w:t>
+        <w:t>Art. 6 of Annex 2 applies to the contestation of irregularities and the suspension of activities. The cases and methods of termination by means of the express termination clause in favour of the Organizing Secretariat are governed by art. 5.3 of this agreement.</w:t>
       </w:r>
     </w:p>
     <w:p>
@@ -3832,7 +3832,28 @@
           <w:iCs/>
           <w:sz w:val="18"/>
         </w:rPr>
-        <w:t>Should the Organizing Secretariat exercise its right of termination during the Event, the Sponsor shall immediately cease all activities within the Exhibition Space and vacate it within the time indicated by the Organizing Secretariat. In this regard the Sponsor waives any objection, reserving the protection of its rights to any subsequent legal proceedings.</w:t>
+        <w:t>Should termination become effective during the event, the Sponsor shall immediately cease its activities within the exhibition space and vacate it according to the times and methods communicated by the Organizing Secretariat, in compliance with safety conditions.</w:t>
+      </w:r>
+    </w:p>
+    <w:p>
+      <w:pPr>
+        <w:pStyle w:val="Normal"/>
+        <w:spacing w:before="0" w:after="0" w:line="230" w:lineRule="auto"/>
+        <w:jc w:val="both"/>
+        <w:rPr>
+          <w:rFonts w:ascii="Calibri" w:hAnsi="Calibri" w:cs="Calibri"/>
+          <w:b/>
+          <w:b/>
+          <w:bCs/>
+        </w:rPr>
+      </w:pPr>
+      <w:r>
+        <w:rPr>
+          <w:rFonts w:cs="Arial" w:ascii="Arial" w:hAnsi="Arial"/>
+          <w:iCs/>
+          <w:sz w:val="18"/>
+        </w:rPr>
+        <w:t>The other remedies provided for by law and the right to compensation for damages remain unaffected, within the limits and according to the methods provided for by the agreement and by law, without duplication of the sums claimed for the same damage.</w:t>
       </w:r>
     </w:p>
     <w:p>

</xml_diff>

<commit_message>
Contratto 10.4: dispositivi medici esposti (Regolamento UE 2017/745, art. 21.3)
Co-Authored-By: Claude Opus 5.5 <noreply@anthropic.com>
</commit_message>
<xml_diff>
--- a/contracts/templates_pdf/template_contratto_sponsor_non_ecm_en.docx
+++ b/contracts/templates_pdf/template_contratto_sponsor_non_ecm_en.docx
@@ -4124,6 +4124,36 @@
           <w:sz w:val="18"/>
         </w:rPr>
         <w:t>The Sponsor consents to the graphic reproduction of photographs and video footage taken during the event for the purpose of promoting the congress in the media.</w:t>
+      </w:r>
+    </w:p>
+    <w:p>
+      <w:pPr>
+        <w:pStyle w:val="Normal"/>
+        <w:spacing w:before="0" w:after="0" w:line="230" w:lineRule="auto"/>
+        <w:jc w:val="both"/>
+        <w:rPr>
+          <w:rFonts w:ascii="Calibri" w:hAnsi="Calibri" w:cs="Calibri"/>
+          <w:b/>
+          <w:b/>
+          <w:bCs/>
+        </w:rPr>
+      </w:pPr>
+      <w:r>
+        <w:rPr>
+          <w:rFonts w:cs="Arial" w:ascii="Arial" w:hAnsi="Arial"/>
+          <w:b/>
+          <w:bCs/>
+          <w:sz w:val="18"/>
+        </w:rPr>
+        <w:t xml:space="preserve">10.4 </w:t>
+      </w:r>
+      <w:r>
+        <w:rPr>
+          <w:rFonts w:cs="Arial" w:ascii="Arial" w:hAnsi="Arial"/>
+          <w:iCs/>
+          <w:sz w:val="18"/>
+        </w:rPr>
+        <w:t>The Sponsor guarantees compliance with the legislation on medical devices and in particular with art. 21, paragraph 3, of Regulation (EU) 2017/745 of the European Parliament and of the Council of 5 April 2017. Any medical devices that do not comply with the legislation or do not bear the CE marking may be exhibited or presented during the event only if accompanied by a clearly visible sign indicating that they are intended solely for presentation or demonstration purposes and cannot be made available until they have been brought into compliance.</w:t>
       </w:r>
     </w:p>
     <w:p>

</xml_diff>

<commit_message>
Domanda: testo 2 punti piu piccolo, sede non ripetuta; contratto 1.6: stesso stile e b) senza a capo forzato
Co-Authored-By: Claude Opus 5.5 <noreply@anthropic.com>
</commit_message>
<xml_diff>
--- a/contracts/templates_pdf/template_contratto_sponsor_non_ecm_en.docx
+++ b/contracts/templates_pdf/template_contratto_sponsor_non_ecm_en.docx
@@ -2619,7 +2619,7 @@
     </w:p>
     <w:p>
       <w:pPr>
-        <w:pStyle w:val="Default"/>
+        <w:pStyle w:val="Normal"/>
         <w:tabs>
           <w:tab w:val="clear" w:pos="709"/>
           <w:tab w:val="left" w:pos="284" w:leader="none"/>
@@ -2639,7 +2639,7 @@
     </w:p>
     <w:p>
       <w:pPr>
-        <w:pStyle w:val="Default"/>
+        <w:pStyle w:val="Normal"/>
         <w:tabs>
           <w:tab w:val="clear" w:pos="709"/>
           <w:tab w:val="left" w:pos="284" w:leader="none"/>
@@ -2655,13 +2655,13 @@
           <w:szCs w:val="20"/>
         </w:rPr>
         <w:t xml:space="preserve">b) make available to the Sponsor what is indicated in Annex 1) for the display and illustration, by qualified personnel authorized by the Sponsor, of the technical-scientific characteristics of the products falling within the product sector relevant to the event, which will take place as specified at the beginning of this agreement.</w:t>
-        <w:br/>
+        <w:t xml:space="preserve"> </w:t>
         <w:t xml:space="preserve">The Organizing Secretariat also undertakes to allow personnel authorized by the Sponsor access to the Stand outside the event opening hours as well, exclusively for practical-organizational purposes and in any case within the limits of the hours made available by the Secretariat for Sponsors.</w:t>
       </w:r>
     </w:p>
     <w:p>
       <w:pPr>
-        <w:pStyle w:val="Default"/>
+        <w:pStyle w:val="Normal"/>
         <w:spacing w:before="0" w:after="0" w:line="230" w:lineRule="auto"/>
         <w:jc w:val="both"/>
         <w:rPr/>

</xml_diff>

<commit_message>
Contratto 4.3: custodia e sorveglianza dello spazio espositivo
Co-Authored-By: Claude Opus 5.5 <noreply@anthropic.com>
</commit_message>
<xml_diff>
--- a/contracts/templates_pdf/template_contratto_sponsor_non_ecm_en.docx
+++ b/contracts/templates_pdf/template_contratto_sponsor_non_ecm_en.docx
@@ -3187,7 +3187,52 @@
           <w:rFonts w:cs="Arial" w:ascii="Arial" w:hAnsi="Arial"/>
           <w:sz w:val="18"/>
         </w:rPr>
-        <w:t>The custody and surveillance of the Exhibition Space, and of its contents, during set-up, during the Event and during dismantling are the responsibility of the Sponsor. The Organizing Secretariat is therefore not liable for objects or goods left unattended in the Exhibition Space during the opening and closing hours of the Event. Removing goods and structures during the event is strictly prohibited. Any authorised manual handling of packages does not in any case allow the early dismantling or emptying of the stand.</w:t>
+        <w:t>During the set-up, opening and dismantling phases of the event, the custody and surveillance of the exhibition space and of the goods contained therein are the responsibility of the Sponsor.</w:t>
+      </w:r>
+    </w:p>
+    <w:p>
+      <w:pPr>
+        <w:pStyle w:val="Normal"/>
+        <w:spacing w:before="0" w:after="0" w:line="230" w:lineRule="auto"/>
+        <w:jc w:val="both"/>
+        <w:rPr/>
+      </w:pPr>
+      <w:r>
+        <w:rPr>
+          <w:rFonts w:cs="Arial" w:ascii="Arial" w:hAnsi="Arial"/>
+          <w:sz w:val="18"/>
+        </w:rPr>
+        <w:t>Before leaving the stand and during the closing hours of the event, the Sponsor shall take adequate measures to prevent goods, equipment and other items from remaining freely accessible or easily removable. In particular, cash, valuables, portable devices and small products must be removed or stored in lockable cabinets, containers or compartments. For items that must remain on display, fastening, locking or other protective measures appropriate to their nature must be adopted.</w:t>
+      </w:r>
+    </w:p>
+    <w:p>
+      <w:pPr>
+        <w:pStyle w:val="Normal"/>
+        <w:spacing w:before="0" w:after="0" w:line="230" w:lineRule="auto"/>
+        <w:jc w:val="both"/>
+        <w:rPr/>
+      </w:pPr>
+      <w:r>
+        <w:rPr>
+          <w:rFonts w:cs="Arial" w:ascii="Arial" w:hAnsi="Arial"/>
+          <w:sz w:val="18"/>
+        </w:rPr>
+        <w:t>Any general surveillance of the venue does not constitute a custody service for individual stands or the goods therein. The Organizing Secretariat assumes no custody obligations for such goods; liability for wilful misconduct or gross negligence and any mandatory liability provided for by law remain unaffected.</w:t>
+      </w:r>
+    </w:p>
+    <w:p>
+      <w:pPr>
+        <w:pStyle w:val="Normal"/>
+        <w:spacing w:before="0" w:after="0" w:line="230" w:lineRule="auto"/>
+        <w:jc w:val="both"/>
+        <w:rPr/>
+      </w:pPr>
+      <w:r>
+        <w:rPr>
+          <w:rFonts w:cs="Arial" w:ascii="Arial" w:hAnsi="Arial"/>
+          <w:sz w:val="18"/>
+        </w:rPr>
+        <w:t>Dismantling or emptying the stand before the time scheduled for dismantling is prohibited. The removal of goods for security reasons and any manual handling of packages are permitted, according to the times and methods authorised by the Organizing Secretariat, provided that they do not involve the early dismantling of the exhibition space.</w:t>
       </w:r>
     </w:p>
     <w:p>

</xml_diff>

<commit_message>
Contratto: titoli degli articoli tutti maiuscoli e in grassetto
Co-Authored-By: Claude Opus 5.5 <noreply@anthropic.com>
</commit_message>
<xml_diff>
--- a/contracts/templates_pdf/template_contratto_sponsor_non_ecm_en.docx
+++ b/contracts/templates_pdf/template_contratto_sponsor_non_ecm_en.docx
@@ -2276,7 +2276,7 @@
           <w:bCs/>
           <w:sz w:val="18"/>
         </w:rPr>
-        <w:t xml:space="preserve">Subject of the Agreement and general provisions</w:t>
+        <w:t>SUBJECT OF THE AGREEMENT AND GENERAL PROVISIONS</w:t>
       </w:r>
     </w:p>
     <w:p>
@@ -2328,7 +2328,7 @@
           <w:bCs/>
           <w:sz w:val="18"/>
         </w:rPr>
-        <w:t xml:space="preserve">1. Obligations of the Organizing Secretariat </w:t>
+        <w:t xml:space="preserve">1. OBLIGATIONS OF THE ORGANIZING SECRETARIAT </w:t>
       </w:r>
     </w:p>
     <w:p>
@@ -2782,7 +2782,7 @@
           <w:bCs/>
           <w:sz w:val="18"/>
         </w:rPr>
-        <w:t xml:space="preserve">2. Obligations of the Sponsor </w:t>
+        <w:t xml:space="preserve">2. OBLIGATIONS OF THE SPONSOR </w:t>
       </w:r>
     </w:p>
     <w:p>
@@ -2885,7 +2885,7 @@
           <w:bCs/>
           <w:sz w:val="18"/>
         </w:rPr>
-        <w:t xml:space="preserve">3. Consideration, payment terms and cancellation terms </w:t>
+        <w:t xml:space="preserve">3. CONSIDERATION, PAYMENT TERMS AND CANCELLATION TERMS </w:t>
       </w:r>
     </w:p>
     <w:p>
@@ -2970,7 +2970,7 @@
           <w:bCs/>
           <w:sz w:val="18"/>
         </w:rPr>
-        <w:t>3.3 Withdrawal from participation and cancellations</w:t>
+        <w:t>3.3 WITHDRAWAL FROM PARTICIPATION AND CANCELLATIONS</w:t>
       </w:r>
     </w:p>
     <w:p>
@@ -3115,7 +3115,7 @@
           <w:bCs/>
           <w:sz w:val="18"/>
         </w:rPr>
-        <w:t xml:space="preserve">4. Allocation of exhibition spaces </w:t>
+        <w:t xml:space="preserve">4. ALLOCATION OF EXHIBITION SPACES </w:t>
       </w:r>
     </w:p>
     <w:p>
@@ -3272,7 +3272,7 @@
           <w:bCs/>
           <w:sz w:val="18"/>
         </w:rPr>
-        <w:t xml:space="preserve">5. Term and Termination of the Agreement </w:t>
+        <w:t xml:space="preserve">5. TERM AND TERMINATION OF THE AGREEMENT </w:t>
       </w:r>
     </w:p>
     <w:p>
@@ -3405,7 +3405,7 @@
           <w:bCs/>
           <w:sz w:val="18"/>
         </w:rPr>
-        <w:t xml:space="preserve">6. Confidentiality and non-disclosure </w:t>
+        <w:t xml:space="preserve">6. CONFIDENTIALITY AND NON-DISCLOSURE </w:t>
       </w:r>
     </w:p>
     <w:p>
@@ -3520,7 +3520,7 @@
           <w:bCs/>
           <w:sz w:val="18"/>
         </w:rPr>
-        <w:t xml:space="preserve">7. Postponement, reduction or suspension of the Event </w:t>
+        <w:t xml:space="preserve">7. POSTPONEMENT, REDUCTION OR SUSPENSION OF THE EVENT </w:t>
       </w:r>
     </w:p>
     <w:p>
@@ -3630,7 +3630,7 @@
           <w:bCs/>
           <w:sz w:val="18"/>
         </w:rPr>
-        <w:t xml:space="preserve">8. Miscellaneous </w:t>
+        <w:t xml:space="preserve">8. MISCELLANEOUS </w:t>
       </w:r>
     </w:p>
     <w:p>
@@ -3986,7 +3986,7 @@
           <w:bCs/>
           <w:sz w:val="18"/>
         </w:rPr>
-        <w:t xml:space="preserve">9. Loudspeakers - Sound broadcasts </w:t>
+        <w:t xml:space="preserve">9. LOUDSPEAKERS - SOUND BROADCASTS </w:t>
       </w:r>
     </w:p>
     <w:p>
@@ -4078,7 +4078,7 @@
           <w:bCs/>
           <w:sz w:val="18"/>
         </w:rPr>
-        <w:t xml:space="preserve">10. Promotional and advertising activities </w:t>
+        <w:t xml:space="preserve">10. PROMOTIONAL AND ADVERTISING ACTIVITIES </w:t>
       </w:r>
     </w:p>
     <w:p>
@@ -4230,7 +4230,7 @@
           <w:bCs/>
           <w:sz w:val="18"/>
         </w:rPr>
-        <w:t xml:space="preserve">11. Return of the space - Damage to stand spaces - Waste disposal </w:t>
+        <w:t xml:space="preserve">11. RETURN OF THE SPACE - DAMAGE TO STAND SPACES - WASTE DISPOSAL </w:t>
       </w:r>
     </w:p>
     <w:p>
@@ -4322,7 +4322,7 @@
           <w:bCs/>
           <w:sz w:val="18"/>
         </w:rPr>
-        <w:t xml:space="preserve">12. Exemption from liability and insurance obligations </w:t>
+        <w:t xml:space="preserve">12. EXEMPTION FROM LIABILITY AND INSURANCE OBLIGATIONS </w:t>
       </w:r>
     </w:p>
     <w:p>
@@ -4537,7 +4537,7 @@
           <w:bCs/>
           <w:sz w:val="18"/>
         </w:rPr>
-        <w:t xml:space="preserve">13. Amendments or variations </w:t>
+        <w:t xml:space="preserve">13. AMENDMENTS OR VARIATIONS </w:t>
       </w:r>
     </w:p>
     <w:p>
@@ -4641,7 +4641,7 @@
           <w:bCs/>
           <w:sz w:val="18"/>
         </w:rPr>
-        <w:t xml:space="preserve">14. Governing law and jurisdiction </w:t>
+        <w:t xml:space="preserve">14. GOVERNING LAW AND JURISDICTION </w:t>
       </w:r>
     </w:p>
     <w:p>

</xml_diff>

<commit_message>
Revisione contratto e Domanda: prevalenza dei documenti, caparra confirmatoria, via 8.6 doppione, refusi e rimandi
Co-Authored-By: Claude Opus 5.5 <noreply@anthropic.com>
</commit_message>
<xml_diff>
--- a/contracts/templates_pdf/template_contratto_sponsor_non_ecm_en.docx
+++ b/contracts/templates_pdf/template_contratto_sponsor_non_ecm_en.docx
@@ -1955,7 +1955,7 @@
           <w:bCs/>
           <w:sz w:val="18"/>
         </w:rPr>
-        <w:t xml:space="preserve">The Organizing Secretariat, an entity with proven experience, active in the field of the organization and/or production of events in compliance with art. 124 of D. Lgs. 24 April 2006, n. 219 (Italian Legislative Decree), intends to acquire sponsorships in order to secure funding for the realization of the event {{ event.name }}{% if event.sede_completa %}, {{ event.sede_completa }}{% endif %} which will take place on {{ event.start_date|format_date }}{% if event.end_date and event.end_date != event.start_date %} – {{ event.end_date|format_date }}{% endif %} and is intended for the training of healthcare professionals; </w:t>
+        <w:t xml:space="preserve">The Organizing Secretariat, an entity with proven experience, active in the field of the organization and/or production of events in compliance with art. 124 of D. Lgs. 24 April 2006, n. 219 (Italian Legislative Decree), intends to acquire sponsorships in order to secure funding for the realization of the event {{ event.name }}{% if event.sede_completa %}, {{ event.sede_completa }}{% endif %} which will take place {% if event.end_date and event.end_date != event.start_date %}from {{ event.start_date|format_date }} to {{ event.end_date|format_date }}{% else %}on {{ event.start_date|format_date }}{% endif %} and is intended for the training of healthcare professionals; </w:t>
       </w:r>
     </w:p>
     <w:p>
@@ -2392,7 +2392,7 @@
           <w:rFonts w:cs="Arial" w:ascii="Arial" w:hAnsi="Arial"/>
           <w:sz w:val="18"/>
         </w:rPr>
-        <w:t xml:space="preserve">The Organizing Secretariat designates as scientific director of the Event {{ event.scientific_director|default('________________', true) }}  hereinafter the “Scientific Director”), while, for the purposes of this Agreement, the Sponsor's contact person will be {{ signer.full_name }}  (hereinafter the “Contact Person”)</w:t>
+        <w:t>The Organizing Secretariat designates as scientific director of the Event {{ event.scientific_director|default('________________', true) }} (hereinafter the “Scientific Director”), while, for the purposes of this Agreement, the Sponsor's contact person will be {{ signer.full_name }}  (hereinafter the “Contact Person”)</w:t>
       </w:r>
     </w:p>
     <w:p>
@@ -2948,7 +2948,7 @@
           <w:iCs/>
           <w:sz w:val="18"/>
         </w:rPr>
-        <w:t xml:space="preserve">The Organizing Secretariat guarantees and declares that the fee paid by the Sponsor, indicated in this Agreement, as regards its amount and payment terms, does not condition the content of the activities, but is intended to provide the financial support necessary for the success of the event itself</w:t>
+        <w:t>The Organizing Secretariat guarantees and declares that the fee paid by the Sponsor, indicated in this Agreement, as regards its amount and payment terms, does not condition the content of the activities, but is intended to provide the financial support necessary for the success of the event itself.</w:t>
       </w:r>
     </w:p>
     <w:p>
@@ -3322,7 +3322,7 @@
           <w:rFonts w:cs="Arial" w:ascii="Arial" w:hAnsi="Arial"/>
           <w:sz w:val="18"/>
         </w:rPr>
-        <w:t xml:space="preserve">The Sponsor shall be entitled to terminate this agreement by operation of law, pursuant to and for the purposes of Art. 1456 of the Italian Civil Code (cod. civ.), by PEC, should the Organizing Secretariat fail to comply with the arrangements established by this agreement.</w:t>
+        <w:t>The Sponsor shall be entitled to terminate this agreement by operation of law, pursuant to and for the purposes of art. 1456 of the Italian Civil Code, by PEC, should the Organizing Secretariat fail to comply with the arrangements established by this agreement.</w:t>
       </w:r>
     </w:p>
     <w:p>
@@ -3656,7 +3656,7 @@
           <w:rFonts w:cs="Arial" w:ascii="Arial" w:hAnsi="Arial"/>
           <w:sz w:val="18"/>
         </w:rPr>
-        <w:t>The agreement consists of this Agreement, Annex 1 – Application for admission and Annex 2 – Technical Regulations, including the technical forms attached to it (set-up declaration and declaration of conformity of the electrical system). The recitals and the Annexes form an integral and substantial part of the agreement.</w:t>
+        <w:t>The agreement consists of this Agreement, Annex 1 – Application for admission and Annex 2 – Technical Regulations, including the technical forms attached to it (set-up declaration and declaration of conformity of the electrical system). The recitals and the Annexes form an integral and substantial part of the agreement. In the event of conflict between the documents, this Agreement, Annex 1 and Annex 2 shall prevail in that order.</w:t>
       </w:r>
     </w:p>
     <w:p>
@@ -3926,89 +3926,76 @@
           <w:bCs/>
         </w:rPr>
       </w:pPr>
-      <w:r>
-        <w:rPr>
-          <w:rFonts w:cs="Arial" w:ascii="Arial" w:hAnsi="Arial"/>
-          <w:b/>
-          <w:bCs/>
-          <w:sz w:val="18"/>
-        </w:rPr>
-        <w:t>8.6 REPRODUCTION RIGHTS</w:t>
-      </w:r>
-    </w:p>
-    <w:p>
-      <w:pPr>
-        <w:pStyle w:val="Normal"/>
-        <w:spacing w:before="0" w:after="0" w:line="230" w:lineRule="auto"/>
-        <w:jc w:val="both"/>
-        <w:rPr>
-          <w:rFonts w:ascii="Calibri" w:hAnsi="Calibri" w:cs="Calibri"/>
-          <w:b/>
-          <w:b/>
-          <w:bCs/>
-        </w:rPr>
-      </w:pPr>
+    </w:p>
+    <w:p>
+      <w:pPr>
+        <w:pStyle w:val="Normal"/>
+        <w:spacing w:before="0" w:after="0" w:line="230" w:lineRule="auto"/>
+        <w:jc w:val="both"/>
+        <w:rPr>
+          <w:rFonts w:ascii="Calibri" w:hAnsi="Calibri" w:cs="Calibri"/>
+        </w:rPr>
+      </w:pPr>
+      <w:r>
+        <w:rPr>
+          <w:rFonts w:cs="Arial" w:ascii="Arial" w:hAnsi="Arial"/>
+          <w:b/>
+          <w:bCs/>
+          <w:sz w:val="18"/>
+        </w:rPr>
+        <w:t xml:space="preserve">9. LOUDSPEAKERS - SOUND BROADCASTS </w:t>
+      </w:r>
+    </w:p>
+    <w:p>
+      <w:pPr>
+        <w:pStyle w:val="Normal"/>
+        <w:spacing w:before="0" w:after="0" w:line="230" w:lineRule="auto"/>
+        <w:jc w:val="both"/>
+        <w:rPr>
+          <w:rFonts w:ascii="Calibri" w:hAnsi="Calibri" w:cs="Calibri"/>
+          <w:b/>
+          <w:b/>
+          <w:bCs/>
+        </w:rPr>
+      </w:pPr>
+      <w:r>
+        <w:rPr>
+          <w:rFonts w:cs="Arial" w:ascii="Arial" w:hAnsi="Arial"/>
+          <w:b/>
+          <w:bCs/>
+          <w:sz w:val="18"/>
+        </w:rPr>
+        <w:t xml:space="preserve">9.1 </w:t>
+      </w:r>
       <w:r>
         <w:rPr>
           <w:rFonts w:cs="Arial" w:ascii="Arial" w:hAnsi="Arial"/>
           <w:iCs/>
           <w:sz w:val="18"/>
         </w:rPr>
-        <w:t>The Sponsor gives its prior consent to the Organizing Secretariat making graphic, photographic and/or film reproductions of the exhibition area of the halls and of everything contained therein.</w:t>
-      </w:r>
-    </w:p>
-    <w:p>
-      <w:pPr>
-        <w:pStyle w:val="Normal"/>
-        <w:spacing w:before="0" w:after="0" w:line="230" w:lineRule="auto"/>
-        <w:jc w:val="both"/>
-        <w:rPr>
-          <w:rFonts w:ascii="Calibri" w:hAnsi="Calibri" w:cs="Calibri"/>
-          <w:b/>
-          <w:b/>
-          <w:bCs/>
-        </w:rPr>
-      </w:pPr>
-    </w:p>
-    <w:p>
-      <w:pPr>
-        <w:pStyle w:val="Normal"/>
-        <w:spacing w:before="0" w:after="0" w:line="230" w:lineRule="auto"/>
-        <w:jc w:val="both"/>
-        <w:rPr>
-          <w:rFonts w:ascii="Calibri" w:hAnsi="Calibri" w:cs="Calibri"/>
-        </w:rPr>
-      </w:pPr>
-      <w:r>
-        <w:rPr>
-          <w:rFonts w:cs="Arial" w:ascii="Arial" w:hAnsi="Arial"/>
-          <w:b/>
-          <w:bCs/>
-          <w:sz w:val="18"/>
-        </w:rPr>
-        <w:t xml:space="preserve">9. LOUDSPEAKERS - SOUND BROADCASTS </w:t>
-      </w:r>
-    </w:p>
-    <w:p>
-      <w:pPr>
-        <w:pStyle w:val="Normal"/>
-        <w:spacing w:before="0" w:after="0" w:line="230" w:lineRule="auto"/>
-        <w:jc w:val="both"/>
-        <w:rPr>
-          <w:rFonts w:ascii="Calibri" w:hAnsi="Calibri" w:cs="Calibri"/>
-          <w:b/>
-          <w:b/>
-          <w:bCs/>
-        </w:rPr>
-      </w:pPr>
-      <w:r>
-        <w:rPr>
-          <w:rFonts w:cs="Arial" w:ascii="Arial" w:hAnsi="Arial"/>
-          <w:b/>
-          <w:bCs/>
-          <w:sz w:val="18"/>
-        </w:rPr>
-        <w:t xml:space="preserve">9.1 </w:t>
+        <w:t>Sound broadcasts are permitted within the Sponsor's own space, including the use of radio receivers and television sets, provided they do not cause disturbance (SIAE fees payable by the Sponsor). To this end the Organizing Secretariat reserves the right to determine the volume of sound broadcasts.</w:t>
+      </w:r>
+    </w:p>
+    <w:p>
+      <w:pPr>
+        <w:pStyle w:val="Normal"/>
+        <w:spacing w:before="0" w:after="0" w:line="230" w:lineRule="auto"/>
+        <w:jc w:val="both"/>
+        <w:rPr>
+          <w:rFonts w:ascii="Calibri" w:hAnsi="Calibri" w:cs="Calibri"/>
+          <w:b/>
+          <w:b/>
+          <w:bCs/>
+        </w:rPr>
+      </w:pPr>
+      <w:r>
+        <w:rPr>
+          <w:rFonts w:cs="Arial" w:ascii="Arial" w:hAnsi="Arial"/>
+          <w:b/>
+          <w:bCs/>
+          <w:sz w:val="18"/>
+        </w:rPr>
+        <w:t xml:space="preserve">9.2 </w:t>
       </w:r>
       <w:r>
         <w:rPr>
@@ -4016,29 +4003,61 @@
           <w:iCs/>
           <w:sz w:val="18"/>
         </w:rPr>
-        <w:t>Sound broadcasts are permitted within the Sponsor's own space, including the use of radio receivers and television sets, provided they do not cause disturbance (SIAE fees payable by the Sponsor). To this end the Organizing Secretariat reserves the right to determine the volume of sound broadcasts.</w:t>
-      </w:r>
-    </w:p>
-    <w:p>
-      <w:pPr>
-        <w:pStyle w:val="Normal"/>
-        <w:spacing w:before="0" w:after="0" w:line="230" w:lineRule="auto"/>
-        <w:jc w:val="both"/>
-        <w:rPr>
-          <w:rFonts w:ascii="Calibri" w:hAnsi="Calibri" w:cs="Calibri"/>
-          <w:b/>
-          <w:b/>
-          <w:bCs/>
-        </w:rPr>
-      </w:pPr>
-      <w:r>
-        <w:rPr>
-          <w:rFonts w:cs="Arial" w:ascii="Arial" w:hAnsi="Arial"/>
-          <w:b/>
-          <w:bCs/>
-          <w:sz w:val="18"/>
-        </w:rPr>
-        <w:t xml:space="preserve">9.2 </w:t>
+        <w:t>The Organizing Secretariat may use the loudspeakers installed in the Congress Centre for official announcements or in case of emergency.</w:t>
+      </w:r>
+    </w:p>
+    <w:p>
+      <w:pPr>
+        <w:pStyle w:val="Normal"/>
+        <w:spacing w:before="0" w:after="0" w:line="230" w:lineRule="auto"/>
+        <w:jc w:val="both"/>
+        <w:rPr>
+          <w:rFonts w:ascii="Calibri" w:hAnsi="Calibri" w:cs="Calibri"/>
+          <w:b/>
+          <w:b/>
+          <w:bCs/>
+        </w:rPr>
+      </w:pPr>
+    </w:p>
+    <w:p>
+      <w:pPr>
+        <w:pStyle w:val="Normal"/>
+        <w:spacing w:before="0" w:after="0" w:line="230" w:lineRule="auto"/>
+        <w:jc w:val="both"/>
+        <w:rPr>
+          <w:rFonts w:ascii="Calibri" w:hAnsi="Calibri" w:cs="Calibri"/>
+        </w:rPr>
+      </w:pPr>
+      <w:r>
+        <w:rPr>
+          <w:rFonts w:cs="Arial" w:ascii="Arial" w:hAnsi="Arial"/>
+          <w:b/>
+          <w:bCs/>
+          <w:sz w:val="18"/>
+        </w:rPr>
+        <w:t xml:space="preserve">10. PROMOTIONAL AND ADVERTISING ACTIVITIES </w:t>
+      </w:r>
+    </w:p>
+    <w:p>
+      <w:pPr>
+        <w:pStyle w:val="Normal"/>
+        <w:spacing w:before="0" w:after="0" w:line="230" w:lineRule="auto"/>
+        <w:jc w:val="both"/>
+        <w:rPr>
+          <w:rFonts w:ascii="Calibri" w:hAnsi="Calibri" w:cs="Calibri"/>
+          <w:b/>
+          <w:b/>
+          <w:bCs/>
+        </w:rPr>
+      </w:pPr>
+      <w:r>
+        <w:rPr>
+          <w:rFonts w:cs="Arial" w:ascii="Arial" w:hAnsi="Arial"/>
+          <w:b/>
+          <w:bCs/>
+          <w:sz w:val="18"/>
+        </w:rPr>
+        <w:t xml:space="preserve">10.1 </w:t>
       </w:r>
       <w:r>
         <w:rPr>
@@ -4046,61 +4065,29 @@
           <w:iCs/>
           <w:sz w:val="18"/>
         </w:rPr>
-        <w:t>The Organizing Secretariat may use the loudspeakers installed in the exhibition centre for official announcements or in case of emergency.</w:t>
-      </w:r>
-    </w:p>
-    <w:p>
-      <w:pPr>
-        <w:pStyle w:val="Normal"/>
-        <w:spacing w:before="0" w:after="0" w:line="230" w:lineRule="auto"/>
-        <w:jc w:val="both"/>
-        <w:rPr>
-          <w:rFonts w:ascii="Calibri" w:hAnsi="Calibri" w:cs="Calibri"/>
-          <w:b/>
-          <w:b/>
-          <w:bCs/>
-        </w:rPr>
-      </w:pPr>
-    </w:p>
-    <w:p>
-      <w:pPr>
-        <w:pStyle w:val="Normal"/>
-        <w:spacing w:before="0" w:after="0" w:line="230" w:lineRule="auto"/>
-        <w:jc w:val="both"/>
-        <w:rPr>
-          <w:rFonts w:ascii="Calibri" w:hAnsi="Calibri" w:cs="Calibri"/>
-        </w:rPr>
-      </w:pPr>
-      <w:r>
-        <w:rPr>
-          <w:rFonts w:cs="Arial" w:ascii="Arial" w:hAnsi="Arial"/>
-          <w:b/>
-          <w:bCs/>
-          <w:sz w:val="18"/>
-        </w:rPr>
-        <w:t xml:space="preserve">10. PROMOTIONAL AND ADVERTISING ACTIVITIES </w:t>
-      </w:r>
-    </w:p>
-    <w:p>
-      <w:pPr>
-        <w:pStyle w:val="Normal"/>
-        <w:spacing w:before="0" w:after="0" w:line="230" w:lineRule="auto"/>
-        <w:jc w:val="both"/>
-        <w:rPr>
-          <w:rFonts w:ascii="Calibri" w:hAnsi="Calibri" w:cs="Calibri"/>
-          <w:b/>
-          <w:b/>
-          <w:bCs/>
-        </w:rPr>
-      </w:pPr>
-      <w:r>
-        <w:rPr>
-          <w:rFonts w:cs="Arial" w:ascii="Arial" w:hAnsi="Arial"/>
-          <w:b/>
-          <w:bCs/>
-          <w:sz w:val="18"/>
-        </w:rPr>
-        <w:t xml:space="preserve">10.1 </w:t>
+        <w:t>As regards advertising, except for advertising within the Sponsor's own space, the Organizing Secretariat reserves the exclusive right to promote and manage advertising for the event, also with the collaboration of specialised agencies.</w:t>
+      </w:r>
+    </w:p>
+    <w:p>
+      <w:pPr>
+        <w:pStyle w:val="Normal"/>
+        <w:spacing w:before="0" w:after="0" w:line="230" w:lineRule="auto"/>
+        <w:jc w:val="both"/>
+        <w:rPr>
+          <w:rFonts w:ascii="Calibri" w:hAnsi="Calibri" w:cs="Calibri"/>
+          <w:b/>
+          <w:b/>
+          <w:bCs/>
+        </w:rPr>
+      </w:pPr>
+      <w:r>
+        <w:rPr>
+          <w:rFonts w:cs="Arial" w:ascii="Arial" w:hAnsi="Arial"/>
+          <w:b/>
+          <w:bCs/>
+          <w:sz w:val="18"/>
+        </w:rPr>
+        <w:t xml:space="preserve">10.2 </w:t>
       </w:r>
       <w:r>
         <w:rPr>
@@ -4108,29 +4095,29 @@
           <w:iCs/>
           <w:sz w:val="18"/>
         </w:rPr>
-        <w:t>As regards advertising, except for advertising within the Sponsor's own space, the Organizing Secretariat reserves the exclusive right to promote and manage advertising for the event, also with the collaboration of specialised agencies.</w:t>
-      </w:r>
-    </w:p>
-    <w:p>
-      <w:pPr>
-        <w:pStyle w:val="Normal"/>
-        <w:spacing w:before="0" w:after="0" w:line="230" w:lineRule="auto"/>
-        <w:jc w:val="both"/>
-        <w:rPr>
-          <w:rFonts w:ascii="Calibri" w:hAnsi="Calibri" w:cs="Calibri"/>
-          <w:b/>
-          <w:b/>
-          <w:bCs/>
-        </w:rPr>
-      </w:pPr>
-      <w:r>
-        <w:rPr>
-          <w:rFonts w:cs="Arial" w:ascii="Arial" w:hAnsi="Arial"/>
-          <w:b/>
-          <w:bCs/>
-          <w:sz w:val="18"/>
-        </w:rPr>
-        <w:t xml:space="preserve">10.2 </w:t>
+        <w:t>Any complaints must be submitted in writing to the Organizing Secretariat. Any form of sale or demonstration of products outside the limits of the Sponsor's own space is strictly prohibited, except for the activities expressly provided for in Annex 1 or authorised in writing by the Organizing Secretariat.</w:t>
+      </w:r>
+    </w:p>
+    <w:p>
+      <w:pPr>
+        <w:pStyle w:val="Normal"/>
+        <w:spacing w:before="0" w:after="0" w:line="230" w:lineRule="auto"/>
+        <w:jc w:val="both"/>
+        <w:rPr>
+          <w:rFonts w:ascii="Calibri" w:hAnsi="Calibri" w:cs="Calibri"/>
+          <w:b/>
+          <w:b/>
+          <w:bCs/>
+        </w:rPr>
+      </w:pPr>
+      <w:r>
+        <w:rPr>
+          <w:rFonts w:cs="Arial" w:ascii="Arial" w:hAnsi="Arial"/>
+          <w:b/>
+          <w:bCs/>
+          <w:sz w:val="18"/>
+        </w:rPr>
+        <w:t xml:space="preserve">10.3 </w:t>
       </w:r>
       <w:r>
         <w:rPr>
@@ -4138,29 +4125,29 @@
           <w:iCs/>
           <w:sz w:val="18"/>
         </w:rPr>
-        <w:t>Any complaints must be submitted in writing to the Organizing Secretariat. Any form of sale or demonstration of products outside the limits of the Sponsor's own space is strictly prohibited, except for the activities expressly provided for in Annex 1 or authorised in writing by the Organizing Secretariat.</w:t>
-      </w:r>
-    </w:p>
-    <w:p>
-      <w:pPr>
-        <w:pStyle w:val="Normal"/>
-        <w:spacing w:before="0" w:after="0" w:line="230" w:lineRule="auto"/>
-        <w:jc w:val="both"/>
-        <w:rPr>
-          <w:rFonts w:ascii="Calibri" w:hAnsi="Calibri" w:cs="Calibri"/>
-          <w:b/>
-          <w:b/>
-          <w:bCs/>
-        </w:rPr>
-      </w:pPr>
-      <w:r>
-        <w:rPr>
-          <w:rFonts w:cs="Arial" w:ascii="Arial" w:hAnsi="Arial"/>
-          <w:b/>
-          <w:bCs/>
-          <w:sz w:val="18"/>
-        </w:rPr>
-        <w:t xml:space="preserve">10.3 </w:t>
+        <w:t>The Sponsor consents to the graphic reproduction of photographs and video footage taken during the event for the purpose of promoting the congress in the media.</w:t>
+      </w:r>
+    </w:p>
+    <w:p>
+      <w:pPr>
+        <w:pStyle w:val="Normal"/>
+        <w:spacing w:before="0" w:after="0" w:line="230" w:lineRule="auto"/>
+        <w:jc w:val="both"/>
+        <w:rPr>
+          <w:rFonts w:ascii="Calibri" w:hAnsi="Calibri" w:cs="Calibri"/>
+          <w:b/>
+          <w:b/>
+          <w:bCs/>
+        </w:rPr>
+      </w:pPr>
+      <w:r>
+        <w:rPr>
+          <w:rFonts w:cs="Arial" w:ascii="Arial" w:hAnsi="Arial"/>
+          <w:b/>
+          <w:bCs/>
+          <w:sz w:val="18"/>
+        </w:rPr>
+        <w:t xml:space="preserve">10.4 </w:t>
       </w:r>
       <w:r>
         <w:rPr>
@@ -4168,29 +4155,61 @@
           <w:iCs/>
           <w:sz w:val="18"/>
         </w:rPr>
-        <w:t>The Sponsor consents to the graphic reproduction of photographs and video footage taken during the event for the purpose of promoting the congress in the media.</w:t>
-      </w:r>
-    </w:p>
-    <w:p>
-      <w:pPr>
-        <w:pStyle w:val="Normal"/>
-        <w:spacing w:before="0" w:after="0" w:line="230" w:lineRule="auto"/>
-        <w:jc w:val="both"/>
-        <w:rPr>
-          <w:rFonts w:ascii="Calibri" w:hAnsi="Calibri" w:cs="Calibri"/>
-          <w:b/>
-          <w:b/>
-          <w:bCs/>
-        </w:rPr>
-      </w:pPr>
-      <w:r>
-        <w:rPr>
-          <w:rFonts w:cs="Arial" w:ascii="Arial" w:hAnsi="Arial"/>
-          <w:b/>
-          <w:bCs/>
-          <w:sz w:val="18"/>
-        </w:rPr>
-        <w:t xml:space="preserve">10.4 </w:t>
+        <w:t>The Sponsor guarantees compliance with the legislation on medical devices and in particular with art. 21, paragraph 3, of Regulation (EU) 2017/745 of the European Parliament and of the Council of 5 April 2017. Any medical devices that do not comply with the legislation or do not bear the CE marking may be exhibited or presented during the event only if accompanied by a clearly visible sign indicating that they are intended solely for presentation or demonstration purposes and cannot be made available until they have been brought into compliance.</w:t>
+      </w:r>
+    </w:p>
+    <w:p>
+      <w:pPr>
+        <w:pStyle w:val="Normal"/>
+        <w:spacing w:before="0" w:after="0" w:line="230" w:lineRule="auto"/>
+        <w:jc w:val="both"/>
+        <w:rPr>
+          <w:rFonts w:ascii="Calibri" w:hAnsi="Calibri" w:cs="Calibri"/>
+          <w:b/>
+          <w:b/>
+          <w:bCs/>
+        </w:rPr>
+      </w:pPr>
+    </w:p>
+    <w:p>
+      <w:pPr>
+        <w:pStyle w:val="Normal"/>
+        <w:spacing w:before="0" w:after="0" w:line="230" w:lineRule="auto"/>
+        <w:jc w:val="both"/>
+        <w:rPr>
+          <w:rFonts w:ascii="Calibri" w:hAnsi="Calibri" w:cs="Calibri"/>
+        </w:rPr>
+      </w:pPr>
+      <w:r>
+        <w:rPr>
+          <w:rFonts w:cs="Arial" w:ascii="Arial" w:hAnsi="Arial"/>
+          <w:b/>
+          <w:bCs/>
+          <w:sz w:val="18"/>
+        </w:rPr>
+        <w:t xml:space="preserve">11. RETURN OF THE SPACE - DAMAGE TO STAND SPACES - WASTE DISPOSAL </w:t>
+      </w:r>
+    </w:p>
+    <w:p>
+      <w:pPr>
+        <w:pStyle w:val="Normal"/>
+        <w:spacing w:before="0" w:after="0" w:line="230" w:lineRule="auto"/>
+        <w:jc w:val="both"/>
+        <w:rPr>
+          <w:rFonts w:ascii="Calibri" w:hAnsi="Calibri" w:cs="Calibri"/>
+          <w:b/>
+          <w:b/>
+          <w:bCs/>
+        </w:rPr>
+      </w:pPr>
+      <w:r>
+        <w:rPr>
+          <w:rFonts w:cs="Arial" w:ascii="Arial" w:hAnsi="Arial"/>
+          <w:b/>
+          <w:bCs/>
+          <w:sz w:val="18"/>
+        </w:rPr>
+        <w:t xml:space="preserve">11.1 </w:t>
       </w:r>
       <w:r>
         <w:rPr>
@@ -4198,61 +4217,29 @@
           <w:iCs/>
           <w:sz w:val="18"/>
         </w:rPr>
-        <w:t>The Sponsor guarantees compliance with the legislation on medical devices and in particular with art. 21, paragraph 3, of Regulation (EU) 2017/745 of the European Parliament and of the Council of 5 April 2017. Any medical devices that do not comply with the legislation or do not bear the CE marking may be exhibited or presented during the event only if accompanied by a clearly visible sign indicating that they are intended solely for presentation or demonstration purposes and cannot be made available until they have been brought into compliance.</w:t>
-      </w:r>
-    </w:p>
-    <w:p>
-      <w:pPr>
-        <w:pStyle w:val="Normal"/>
-        <w:spacing w:before="0" w:after="0" w:line="230" w:lineRule="auto"/>
-        <w:jc w:val="both"/>
-        <w:rPr>
-          <w:rFonts w:ascii="Calibri" w:hAnsi="Calibri" w:cs="Calibri"/>
-          <w:b/>
-          <w:b/>
-          <w:bCs/>
-        </w:rPr>
-      </w:pPr>
-    </w:p>
-    <w:p>
-      <w:pPr>
-        <w:pStyle w:val="Normal"/>
-        <w:spacing w:before="0" w:after="0" w:line="230" w:lineRule="auto"/>
-        <w:jc w:val="both"/>
-        <w:rPr>
-          <w:rFonts w:ascii="Calibri" w:hAnsi="Calibri" w:cs="Calibri"/>
-        </w:rPr>
-      </w:pPr>
-      <w:r>
-        <w:rPr>
-          <w:rFonts w:cs="Arial" w:ascii="Arial" w:hAnsi="Arial"/>
-          <w:b/>
-          <w:bCs/>
-          <w:sz w:val="18"/>
-        </w:rPr>
-        <w:t xml:space="preserve">11. RETURN OF THE SPACE - DAMAGE TO STAND SPACES - WASTE DISPOSAL </w:t>
-      </w:r>
-    </w:p>
-    <w:p>
-      <w:pPr>
-        <w:pStyle w:val="Normal"/>
-        <w:spacing w:before="0" w:after="0" w:line="230" w:lineRule="auto"/>
-        <w:jc w:val="both"/>
-        <w:rPr>
-          <w:rFonts w:ascii="Calibri" w:hAnsi="Calibri" w:cs="Calibri"/>
-          <w:b/>
-          <w:b/>
-          <w:bCs/>
-        </w:rPr>
-      </w:pPr>
-      <w:r>
-        <w:rPr>
-          <w:rFonts w:cs="Arial" w:ascii="Arial" w:hAnsi="Arial"/>
-          <w:b/>
-          <w:bCs/>
-          <w:sz w:val="18"/>
-        </w:rPr>
-        <w:t xml:space="preserve">11.1 </w:t>
+        <w:t>At the end of the event the exhibition space must be returned in the same condition in which it was taken over by the Sponsor. All materials and set-up residues must be removed from the Exhibition Space.</w:t>
+      </w:r>
+    </w:p>
+    <w:p>
+      <w:pPr>
+        <w:pStyle w:val="Normal"/>
+        <w:spacing w:before="0" w:after="0" w:line="230" w:lineRule="auto"/>
+        <w:jc w:val="both"/>
+        <w:rPr>
+          <w:rFonts w:ascii="Calibri" w:hAnsi="Calibri" w:cs="Calibri"/>
+          <w:b/>
+          <w:b/>
+          <w:bCs/>
+        </w:rPr>
+      </w:pPr>
+      <w:r>
+        <w:rPr>
+          <w:rFonts w:cs="Arial" w:ascii="Arial" w:hAnsi="Arial"/>
+          <w:b/>
+          <w:bCs/>
+          <w:sz w:val="18"/>
+        </w:rPr>
+        <w:t xml:space="preserve">11.2 </w:t>
       </w:r>
       <w:r>
         <w:rPr>
@@ -4260,29 +4247,61 @@
           <w:iCs/>
           <w:sz w:val="18"/>
         </w:rPr>
-        <w:t>At the end of the event the exhibition space must be returned in the same condition in which it was taken over by the Sponsor. All materials and set-up residues must be removed from the Exhibition Space.</w:t>
-      </w:r>
-    </w:p>
-    <w:p>
-      <w:pPr>
-        <w:pStyle w:val="Normal"/>
-        <w:spacing w:before="0" w:after="0" w:line="230" w:lineRule="auto"/>
-        <w:jc w:val="both"/>
-        <w:rPr>
-          <w:rFonts w:ascii="Calibri" w:hAnsi="Calibri" w:cs="Calibri"/>
-          <w:b/>
-          <w:b/>
-          <w:bCs/>
-        </w:rPr>
-      </w:pPr>
-      <w:r>
-        <w:rPr>
-          <w:rFonts w:cs="Arial" w:ascii="Arial" w:hAnsi="Arial"/>
-          <w:b/>
-          <w:bCs/>
-          <w:sz w:val="18"/>
-        </w:rPr>
-        <w:t xml:space="preserve">11.2 </w:t>
+        <w:t>All waste produced during set-up/dismantling and during the event must be disposed of by the Sponsor in compliance with the regulations in force. Should any materials not be taken to the landfill but be abandoned on the premises, or should waste not be disposed of correctly, the Organizing Secretariat reserves the right to clear, at the Sponsor's risk and expense, all materials, equipment and anything else not collected within the prescribed time limits, and to restore the occupied space. The Organizing Secretariat assumes no obligation to store the materials and goods of Sponsors cleared directly. All restoration costs and expenses, for any damage caused and for waste disposal, shall be borne by the Sponsor.</w:t>
+      </w:r>
+    </w:p>
+    <w:p>
+      <w:pPr>
+        <w:pStyle w:val="Normal"/>
+        <w:spacing w:before="0" w:after="0" w:line="230" w:lineRule="auto"/>
+        <w:jc w:val="both"/>
+        <w:rPr>
+          <w:rFonts w:ascii="Calibri" w:hAnsi="Calibri" w:cs="Calibri"/>
+          <w:b/>
+          <w:b/>
+          <w:bCs/>
+        </w:rPr>
+      </w:pPr>
+    </w:p>
+    <w:p>
+      <w:pPr>
+        <w:pStyle w:val="Normal"/>
+        <w:spacing w:before="0" w:after="0" w:line="230" w:lineRule="auto"/>
+        <w:jc w:val="both"/>
+        <w:rPr>
+          <w:rFonts w:ascii="Calibri" w:hAnsi="Calibri" w:cs="Calibri"/>
+        </w:rPr>
+      </w:pPr>
+      <w:r>
+        <w:rPr>
+          <w:rFonts w:cs="Arial" w:ascii="Arial" w:hAnsi="Arial"/>
+          <w:b/>
+          <w:bCs/>
+          <w:sz w:val="18"/>
+        </w:rPr>
+        <w:t xml:space="preserve">12. EXEMPTION FROM LIABILITY AND INSURANCE OBLIGATIONS </w:t>
+      </w:r>
+    </w:p>
+    <w:p>
+      <w:pPr>
+        <w:pStyle w:val="Normal"/>
+        <w:spacing w:before="0" w:after="0" w:line="230" w:lineRule="auto"/>
+        <w:jc w:val="both"/>
+        <w:rPr>
+          <w:rFonts w:ascii="Calibri" w:hAnsi="Calibri" w:cs="Calibri"/>
+          <w:b/>
+          <w:b/>
+          <w:bCs/>
+        </w:rPr>
+      </w:pPr>
+      <w:r>
+        <w:rPr>
+          <w:rFonts w:cs="Arial" w:ascii="Arial" w:hAnsi="Arial"/>
+          <w:b/>
+          <w:bCs/>
+          <w:sz w:val="18"/>
+        </w:rPr>
+        <w:t xml:space="preserve">12.1 </w:t>
       </w:r>
       <w:r>
         <w:rPr>
@@ -4290,69 +4309,28 @@
           <w:iCs/>
           <w:sz w:val="18"/>
         </w:rPr>
-        <w:t>All waste produced during set-up/dismantling and during the event must be disposed of by the Sponsor in compliance with the regulations in force. Should any materials not be taken to the landfill but be abandoned on the premises, or should waste not be disposed of correctly, the Organizing Secretariat reserves the right to clear, at the Sponsor's risk and expense, all materials, equipment and anything else not collected within the prescribed time limits, and to restore the occupied space. The Organizing Secretariat assumes no obligation to store the materials and goods of Sponsors cleared directly. All restoration costs and expenses, for any damage caused and for waste disposal, shall be borne by the Sponsor.</w:t>
-      </w:r>
-    </w:p>
-    <w:p>
-      <w:pPr>
-        <w:pStyle w:val="Normal"/>
-        <w:spacing w:before="0" w:after="0" w:line="230" w:lineRule="auto"/>
-        <w:jc w:val="both"/>
-        <w:rPr>
-          <w:rFonts w:ascii="Calibri" w:hAnsi="Calibri" w:cs="Calibri"/>
-          <w:b/>
-          <w:b/>
-          <w:bCs/>
-        </w:rPr>
-      </w:pPr>
-    </w:p>
-    <w:p>
-      <w:pPr>
-        <w:pStyle w:val="Normal"/>
-        <w:spacing w:before="0" w:after="0" w:line="230" w:lineRule="auto"/>
-        <w:jc w:val="both"/>
-        <w:rPr>
-          <w:rFonts w:ascii="Calibri" w:hAnsi="Calibri" w:cs="Calibri"/>
-        </w:rPr>
-      </w:pPr>
-      <w:r>
-        <w:rPr>
-          <w:rFonts w:cs="Arial" w:ascii="Arial" w:hAnsi="Arial"/>
-          <w:b/>
-          <w:bCs/>
-          <w:sz w:val="18"/>
-        </w:rPr>
-        <w:t xml:space="preserve">12. EXEMPTION FROM LIABILITY AND INSURANCE OBLIGATIONS </w:t>
-      </w:r>
-    </w:p>
-    <w:p>
-      <w:pPr>
-        <w:pStyle w:val="Normal"/>
-        <w:spacing w:before="0" w:after="0" w:line="230" w:lineRule="auto"/>
-        <w:jc w:val="both"/>
-        <w:rPr>
-          <w:rFonts w:ascii="Calibri" w:hAnsi="Calibri" w:cs="Calibri"/>
-          <w:b/>
-          <w:b/>
-          <w:bCs/>
-        </w:rPr>
-      </w:pPr>
-      <w:r>
-        <w:rPr>
-          <w:rFonts w:cs="Arial" w:ascii="Arial" w:hAnsi="Arial"/>
-          <w:b/>
-          <w:bCs/>
-          <w:sz w:val="18"/>
-        </w:rPr>
-        <w:t xml:space="preserve">12.1 </w:t>
-      </w:r>
+        <w:t>In addition to the provisions above, the Organizing Secretariat and the Congress Centre are expressly exempted from any liability, whether contractual or non-contractual, towards the Sponsors (including their employees or collaborators and the suppliers/stand builders appointed by them), the carriers of goods, the participants in the event and third parties in general for:</w:t>
+      </w:r>
+    </w:p>
+    <w:p>
+      <w:pPr>
+        <w:pStyle w:val="Normal"/>
+        <w:spacing w:before="0" w:after="0" w:line="230" w:lineRule="auto"/>
+        <w:jc w:val="both"/>
+        <w:rPr>
+          <w:rFonts w:ascii="Calibri" w:hAnsi="Calibri" w:cs="Calibri"/>
+          <w:b/>
+          <w:b/>
+          <w:bCs/>
+        </w:rPr>
+      </w:pPr>
       <w:r>
         <w:rPr>
           <w:rFonts w:cs="Arial" w:ascii="Arial" w:hAnsi="Arial"/>
           <w:iCs/>
           <w:sz w:val="18"/>
         </w:rPr>
-        <w:t>In addition to the provisions above, the Organizing Secretariat and the Congress Centre are expressly exempted from any liability, whether contractual or non-contractual, towards the Sponsors (including their employees or collaborators and the suppliers/stand builders appointed by them), the carriers of goods, the participants in the event and third parties in general for:</w:t>
+        <w:t>– theft of materials;</w:t>
       </w:r>
     </w:p>
     <w:p>
@@ -4373,7 +4351,7 @@
           <w:iCs/>
           <w:sz w:val="18"/>
         </w:rPr>
-        <w:t>– theft of materials;</w:t>
+        <w:t>– damage resulting from theft or damage from any cause (including fire) to materials of any kind;</w:t>
       </w:r>
     </w:p>
     <w:p>
@@ -4394,50 +4372,59 @@
           <w:iCs/>
           <w:sz w:val="18"/>
         </w:rPr>
-        <w:t>– damage resulting from theft or damage from any cause (including fire) to materials of any kind;</w:t>
-      </w:r>
-    </w:p>
-    <w:p>
-      <w:pPr>
-        <w:pStyle w:val="Normal"/>
-        <w:spacing w:before="0" w:after="0" w:line="230" w:lineRule="auto"/>
-        <w:jc w:val="both"/>
-        <w:rPr>
-          <w:rFonts w:ascii="Calibri" w:hAnsi="Calibri" w:cs="Calibri"/>
-          <w:b/>
-          <w:b/>
-          <w:bCs/>
-        </w:rPr>
-      </w:pPr>
+        <w:t>– improper and unauthorised use of equipment, furnishings, machinery and systems of the Organizing Secretariat and of the Congress Centre during the period of stay in their facilities.</w:t>
+      </w:r>
+    </w:p>
+    <w:p>
+      <w:pPr>
+        <w:pStyle w:val="Normal"/>
+        <w:spacing w:before="0" w:after="0" w:line="230" w:lineRule="auto"/>
+        <w:jc w:val="both"/>
+        <w:rPr>
+          <w:rFonts w:ascii="Calibri" w:hAnsi="Calibri" w:cs="Calibri"/>
+          <w:b/>
+          <w:b/>
+          <w:bCs/>
+        </w:rPr>
+      </w:pPr>
+      <w:r>
+        <w:rPr>
+          <w:rFonts w:cs="Arial" w:ascii="Arial" w:hAnsi="Arial"/>
+          <w:b/>
+          <w:bCs/>
+          <w:sz w:val="18"/>
+        </w:rPr>
+        <w:t xml:space="preserve">12.2 </w:t>
+      </w:r>
       <w:r>
         <w:rPr>
           <w:rFonts w:cs="Arial" w:ascii="Arial" w:hAnsi="Arial"/>
           <w:iCs/>
           <w:sz w:val="18"/>
         </w:rPr>
-        <w:t>– improper and unauthorised use of equipment, furnishings, machinery and systems of the Organizing Secretariat and of the Congress Centre during the period of stay in their facilities.</w:t>
-      </w:r>
-    </w:p>
-    <w:p>
-      <w:pPr>
-        <w:pStyle w:val="Normal"/>
-        <w:spacing w:before="0" w:after="0" w:line="230" w:lineRule="auto"/>
-        <w:jc w:val="both"/>
-        <w:rPr>
-          <w:rFonts w:ascii="Calibri" w:hAnsi="Calibri" w:cs="Calibri"/>
-          <w:b/>
-          <w:b/>
-          <w:bCs/>
-        </w:rPr>
-      </w:pPr>
-      <w:r>
-        <w:rPr>
-          <w:rFonts w:cs="Arial" w:ascii="Arial" w:hAnsi="Arial"/>
-          <w:b/>
-          <w:bCs/>
-          <w:sz w:val="18"/>
-        </w:rPr>
-        <w:t xml:space="preserve">12.2 </w:t>
+        <w:t>The Sponsor shall be liable for all damage directly or indirectly caused to the Organizing Secretariat, the Congress Centre, the Sponsors and any other third party by the Sponsor, its employees, auxiliaries and/or collaborators during the Event.</w:t>
+      </w:r>
+    </w:p>
+    <w:p>
+      <w:pPr>
+        <w:pStyle w:val="Normal"/>
+        <w:spacing w:before="0" w:after="0" w:line="230" w:lineRule="auto"/>
+        <w:jc w:val="both"/>
+        <w:rPr>
+          <w:rFonts w:ascii="Calibri" w:hAnsi="Calibri" w:cs="Calibri"/>
+          <w:b/>
+          <w:b/>
+          <w:bCs/>
+        </w:rPr>
+      </w:pPr>
+      <w:r>
+        <w:rPr>
+          <w:rFonts w:cs="Arial" w:ascii="Arial" w:hAnsi="Arial"/>
+          <w:b/>
+          <w:bCs/>
+          <w:sz w:val="18"/>
+        </w:rPr>
+        <w:t xml:space="preserve">12.3 </w:t>
       </w:r>
       <w:r>
         <w:rPr>
@@ -4445,29 +4432,29 @@
           <w:iCs/>
           <w:sz w:val="18"/>
         </w:rPr>
-        <w:t>The Sponsor shall be liable for all damage directly or indirectly caused to the Organizing Secretariat, the Congress Centre, the Sponsors and any other third party by the Sponsor, its employees, auxiliaries and/or collaborators during the Event.</w:t>
-      </w:r>
-    </w:p>
-    <w:p>
-      <w:pPr>
-        <w:pStyle w:val="Normal"/>
-        <w:spacing w:before="0" w:after="0" w:line="230" w:lineRule="auto"/>
-        <w:jc w:val="both"/>
-        <w:rPr>
-          <w:rFonts w:ascii="Calibri" w:hAnsi="Calibri" w:cs="Calibri"/>
-          <w:b/>
-          <w:b/>
-          <w:bCs/>
-        </w:rPr>
-      </w:pPr>
-      <w:r>
-        <w:rPr>
-          <w:rFonts w:cs="Arial" w:ascii="Arial" w:hAnsi="Arial"/>
-          <w:b/>
-          <w:bCs/>
-          <w:sz w:val="18"/>
-        </w:rPr>
-        <w:t xml:space="preserve">12.3 </w:t>
+        <w:t>Compensation for damage that the Sponsors and the Contractors (including their employees and/or collaborators), the participants and third parties in general may suffer and/or cause, directly or indirectly, shall be covered exclusively by an adequate insurance policy which the Sponsor undertakes to take out from the start of the relationship and to keep in force for its entire duration, with a leading insurance company, expressly including in the policy the insurer’s waiver of any action of recourse, subrogation and/or indemnity against the Organizing Secretariat (VALET Srl) and the Congress Centre and their employees or collaborators.</w:t>
+      </w:r>
+    </w:p>
+    <w:p>
+      <w:pPr>
+        <w:pStyle w:val="Normal"/>
+        <w:spacing w:before="0" w:after="0" w:line="230" w:lineRule="auto"/>
+        <w:jc w:val="both"/>
+        <w:rPr>
+          <w:rFonts w:ascii="Calibri" w:hAnsi="Calibri" w:cs="Calibri"/>
+          <w:b/>
+          <w:b/>
+          <w:bCs/>
+        </w:rPr>
+      </w:pPr>
+      <w:r>
+        <w:rPr>
+          <w:rFonts w:cs="Arial" w:ascii="Arial" w:hAnsi="Arial"/>
+          <w:b/>
+          <w:bCs/>
+          <w:sz w:val="18"/>
+        </w:rPr>
+        <w:t xml:space="preserve">12.4 </w:t>
       </w:r>
       <w:r>
         <w:rPr>
@@ -4475,29 +4462,61 @@
           <w:iCs/>
           <w:sz w:val="18"/>
         </w:rPr>
-        <w:t>Compensation for damage that the Sponsors and the Contractors (including their employees and/or collaborators), the participants and third parties in general may suffer and/or cause, directly or indirectly, shall be covered exclusively by an adequate insurance policy which the Sponsor undertakes to take out from the start of the relationship and to keep in force for its entire duration, with a leading insurance company, expressly including in the policy the insurer’s waiver of any action of recourse, subrogation and/or indemnity against the Organizing Secretariat (VALET Srl) and the Congress Centre and their employees or collaborators.</w:t>
-      </w:r>
-    </w:p>
-    <w:p>
-      <w:pPr>
-        <w:pStyle w:val="Normal"/>
-        <w:spacing w:before="0" w:after="0" w:line="230" w:lineRule="auto"/>
-        <w:jc w:val="both"/>
-        <w:rPr>
-          <w:rFonts w:ascii="Calibri" w:hAnsi="Calibri" w:cs="Calibri"/>
-          <w:b/>
-          <w:b/>
-          <w:bCs/>
-        </w:rPr>
-      </w:pPr>
-      <w:r>
-        <w:rPr>
-          <w:rFonts w:cs="Arial" w:ascii="Arial" w:hAnsi="Arial"/>
-          <w:b/>
-          <w:bCs/>
-          <w:sz w:val="18"/>
-        </w:rPr>
-        <w:t xml:space="preserve">12.4 </w:t>
+        <w:t>The Sponsor shall provide the Organizing Secretariat, upon simple request, with a copy of the insurance policies.</w:t>
+      </w:r>
+    </w:p>
+    <w:p>
+      <w:pPr>
+        <w:pStyle w:val="Normal"/>
+        <w:spacing w:before="0" w:after="0" w:line="230" w:lineRule="auto"/>
+        <w:jc w:val="both"/>
+        <w:rPr>
+          <w:rFonts w:ascii="Calibri" w:hAnsi="Calibri" w:cs="Calibri"/>
+          <w:b/>
+          <w:b/>
+          <w:bCs/>
+        </w:rPr>
+      </w:pPr>
+    </w:p>
+    <w:p>
+      <w:pPr>
+        <w:pStyle w:val="Normal"/>
+        <w:spacing w:before="0" w:after="0" w:line="230" w:lineRule="auto"/>
+        <w:jc w:val="both"/>
+        <w:rPr>
+          <w:rFonts w:ascii="Calibri" w:hAnsi="Calibri" w:cs="Calibri"/>
+        </w:rPr>
+      </w:pPr>
+      <w:r>
+        <w:rPr>
+          <w:rFonts w:cs="Arial" w:ascii="Arial" w:hAnsi="Arial"/>
+          <w:b/>
+          <w:bCs/>
+          <w:sz w:val="18"/>
+        </w:rPr>
+        <w:t xml:space="preserve">13. AMENDMENTS OR VARIATIONS </w:t>
+      </w:r>
+    </w:p>
+    <w:p>
+      <w:pPr>
+        <w:pStyle w:val="Normal"/>
+        <w:spacing w:before="0" w:after="0" w:line="230" w:lineRule="auto"/>
+        <w:jc w:val="both"/>
+        <w:rPr>
+          <w:rFonts w:ascii="Calibri" w:hAnsi="Calibri" w:cs="Calibri"/>
+          <w:b/>
+          <w:b/>
+          <w:bCs/>
+        </w:rPr>
+      </w:pPr>
+      <w:r>
+        <w:rPr>
+          <w:rFonts w:cs="Arial" w:ascii="Arial" w:hAnsi="Arial"/>
+          <w:b/>
+          <w:bCs/>
+          <w:sz w:val="18"/>
+        </w:rPr>
+        <w:t xml:space="preserve">13.1 </w:t>
       </w:r>
       <w:r>
         <w:rPr>
@@ -4505,69 +4524,28 @@
           <w:iCs/>
           <w:sz w:val="18"/>
         </w:rPr>
-        <w:t>The Sponsor shall provide the Organizing Secretariat, upon simple request, with a copy of the insurance policies.</w:t>
-      </w:r>
-    </w:p>
-    <w:p>
-      <w:pPr>
-        <w:pStyle w:val="Normal"/>
-        <w:spacing w:before="0" w:after="0" w:line="230" w:lineRule="auto"/>
-        <w:jc w:val="both"/>
-        <w:rPr>
-          <w:rFonts w:ascii="Calibri" w:hAnsi="Calibri" w:cs="Calibri"/>
-          <w:b/>
-          <w:b/>
-          <w:bCs/>
-        </w:rPr>
-      </w:pPr>
-    </w:p>
-    <w:p>
-      <w:pPr>
-        <w:pStyle w:val="Normal"/>
-        <w:spacing w:before="0" w:after="0" w:line="230" w:lineRule="auto"/>
-        <w:jc w:val="both"/>
-        <w:rPr>
-          <w:rFonts w:ascii="Calibri" w:hAnsi="Calibri" w:cs="Calibri"/>
-        </w:rPr>
-      </w:pPr>
-      <w:r>
-        <w:rPr>
-          <w:rFonts w:cs="Arial" w:ascii="Arial" w:hAnsi="Arial"/>
-          <w:b/>
-          <w:bCs/>
-          <w:sz w:val="18"/>
-        </w:rPr>
-        <w:t xml:space="preserve">13. AMENDMENTS OR VARIATIONS </w:t>
-      </w:r>
-    </w:p>
-    <w:p>
-      <w:pPr>
-        <w:pStyle w:val="Normal"/>
-        <w:spacing w:before="0" w:after="0" w:line="230" w:lineRule="auto"/>
-        <w:jc w:val="both"/>
-        <w:rPr>
-          <w:rFonts w:ascii="Calibri" w:hAnsi="Calibri" w:cs="Calibri"/>
-          <w:b/>
-          <w:b/>
-          <w:bCs/>
-        </w:rPr>
-      </w:pPr>
-      <w:r>
-        <w:rPr>
-          <w:rFonts w:cs="Arial" w:ascii="Arial" w:hAnsi="Arial"/>
-          <w:b/>
-          <w:bCs/>
-          <w:sz w:val="18"/>
-        </w:rPr>
-        <w:t xml:space="preserve">13.1 </w:t>
-      </w:r>
+        <w:t>Any derogation from this Agreement shall be null and void and in any case without effect unless made in writing.</w:t>
+      </w:r>
+    </w:p>
+    <w:p>
+      <w:pPr>
+        <w:pStyle w:val="Normal"/>
+        <w:spacing w:before="0" w:after="0" w:line="230" w:lineRule="auto"/>
+        <w:jc w:val="both"/>
+        <w:rPr>
+          <w:rFonts w:ascii="Calibri" w:hAnsi="Calibri" w:cs="Calibri"/>
+          <w:b/>
+          <w:b/>
+          <w:bCs/>
+        </w:rPr>
+      </w:pPr>
       <w:r>
         <w:rPr>
           <w:rFonts w:cs="Arial" w:ascii="Arial" w:hAnsi="Arial"/>
           <w:iCs/>
           <w:sz w:val="18"/>
         </w:rPr>
-        <w:t>Any derogation from this Agreement/Regulations shall be null and void and in any case without effect unless made in writing.</w:t>
+        <w:t>This document consists of {{ numero_pagine }} pages.</w:t>
       </w:r>
     </w:p>
     <w:p>
@@ -4588,28 +4566,7 @@
           <w:iCs/>
           <w:sz w:val="18"/>
         </w:rPr>
-        <w:t>This document consists of {{ numero_pagine }} pages.</w:t>
-      </w:r>
-    </w:p>
-    <w:p>
-      <w:pPr>
-        <w:pStyle w:val="Normal"/>
-        <w:spacing w:before="0" w:after="0" w:line="230" w:lineRule="auto"/>
-        <w:jc w:val="both"/>
-        <w:rPr>
-          <w:rFonts w:ascii="Calibri" w:hAnsi="Calibri" w:cs="Calibri"/>
-          <w:b/>
-          <w:b/>
-          <w:bCs/>
-        </w:rPr>
-      </w:pPr>
-      <w:r>
-        <w:rPr>
-          <w:rFonts w:cs="Arial" w:ascii="Arial" w:hAnsi="Arial"/>
-          <w:iCs/>
-          <w:sz w:val="18"/>
-        </w:rPr>
-        <w:t>By signing these regulations, the Sponsor declares to have read them and specifically approves their clauses.</w:t>
+        <w:t>By signing this Agreement, the Sponsor declares to have read it and specifically approves its clauses.</w:t>
       </w:r>
     </w:p>
     <w:p>

</xml_diff>

<commit_message>
Contratto: numero civico del legale rappresentante (via Marzabotto n. 21)
Co-Authored-By: Claude Opus 5.5 <noreply@anthropic.com>
</commit_message>
<xml_diff>
--- a/contracts/templates_pdf/template_contratto_sponsor_non_ecm_en.docx
+++ b/contracts/templates_pdf/template_contratto_sponsor_non_ecm_en.docx
@@ -352,7 +352,7 @@
           <w:rFonts w:cs="Arial" w:ascii="Arial" w:hAnsi="Arial"/>
           <w:sz w:val="18"/>
         </w:rPr>
-        <w:t xml:space="preserve"> 40065, via Marzabotto, n</w:t>
+        <w:t xml:space="preserve"> 40065, via Marzabotto no. </w:t>
       </w:r>
       <w:r>
         <w:rPr>
@@ -360,7 +360,7 @@
           <w:spacing w:val="49"/>
           <w:sz w:val="18"/>
         </w:rPr>
-        <w:t xml:space="preserve">21 </w:t>
+        <w:t xml:space="preserve">21, </w:t>
       </w:r>
       <w:r>
         <w:rPr>

</xml_diff>

<commit_message>
Contratto: denominazione della Segreteria Organizzativa e indirizzo pec
Co-Authored-By: Claude Opus 5.5 <noreply@anthropic.com>
</commit_message>
<xml_diff>
--- a/contracts/templates_pdf/template_contratto_sponsor_non_ecm_en.docx
+++ b/contracts/templates_pdf/template_contratto_sponsor_non_ecm_en.docx
@@ -427,7 +427,7 @@
           <w:rFonts w:cs="Arial" w:ascii="Arial" w:hAnsi="Arial"/>
           <w:sz w:val="18"/>
         </w:rPr>
-        <w:t xml:space="preserve">Code: MRN DNL 65L23 C265S with the necessary powers (hereinafter referred to as the “</w:t>
+        <w:t>Code: MRN DNL 65L23 C265S with the necessary powers, hereinafter referred to as the “</w:t>
       </w:r>
       <w:r>
         <w:rPr>
@@ -451,14 +451,13 @@
           <w:spacing w:val="-14"/>
           <w:sz w:val="18"/>
         </w:rPr>
-        <w:t xml:space="preserve"> </w:t>
-      </w:r>
-      <w:r>
-        <w:rPr>
-          <w:rFonts w:cs="Arial" w:ascii="Arial" w:hAnsi="Arial"/>
-          <w:sz w:val="18"/>
-        </w:rPr>
-        <w:t xml:space="preserve">PEC valet@pec.it</w:t>
+      </w:r>
+      <w:r>
+        <w:rPr>
+          <w:rFonts w:cs="Arial" w:ascii="Arial" w:hAnsi="Arial"/>
+          <w:sz w:val="18"/>
+        </w:rPr>
+        <w:t>PEC address: valet@pec.it</w:t>
       </w:r>
     </w:p>
     <w:p>

</xml_diff>

<commit_message>
Contratto: correzioni ai punti 1.1, 3.3, 4.2, 5.3 e 13.1
1.1 buon esito dell evento; 3.3 caparra a titolo di risarcimento del danno,
penale sotto i 30 giorni con trattenuta delle somme versate e addebito del
resto, tolta la frase sull alternativa al recesso; 4.2 rimuovere le merci;
5.3 effetto dal momento della ricezione; 13.1 deroga e/o variazione.
Stesse modifiche nella versione inglese.

Co-Authored-By: Claude Opus 5.5 <noreply@anthropic.com>
</commit_message>
<xml_diff>
--- a/contracts/templates_pdf/template_contratto_sponsor_non_ecm_en.docx
+++ b/contracts/templates_pdf/template_contratto_sponsor_non_ecm_en.docx
@@ -2352,7 +2352,7 @@
           <w:rFonts w:cs="Arial" w:ascii="Arial" w:hAnsi="Arial"/>
           <w:sz w:val="18"/>
         </w:rPr>
-        <w:t xml:space="preserve"> The procurement of all the resources and means necessary to ensure its success is entrusted to the Organizing Secretariat. It is understood that the funds necessary for the running of the event may also be raised by the Organizing Secretariat through recourse to other Sponsors.</w:t>
+        <w:t xml:space="preserve"> The procurement of all the resources and means necessary to ensure the success of the event is entrusted to the Organizing Secretariat. It is understood that the funds necessary for the running of the event may also be raised by the Organizing Secretariat through recourse to other Sponsors.</w:t>
       </w:r>
     </w:p>
     <w:p>
@@ -3011,7 +3011,7 @@
           <w:iCs/>
           <w:sz w:val="18"/>
         </w:rPr>
-        <w:t>Should the total withdrawal be received at least 30 days before the start of the event and constitute a breach attributable to the Sponsor, the Organizing Secretariat may withdraw from the agreement by written notice and retain the confirmatory deposit provided for in Annex 1 as agreed liquidation of damages pursuant to art. 1385, second paragraph, of the Italian Civil Code. In such case, any sums already paid in excess of the deposit shall be refunded to the Sponsor.</w:t>
+        <w:t>Should the total withdrawal be received at least 30 days before the start of the event and constitute a breach attributable to the Sponsor, the Organizing Secretariat may withdraw from the agreement by written notice and retain the confirmatory deposit provided for in Annex 1 as compensation for damages pursuant to art. 1385, second paragraph, of the Italian Civil Code. In such case, any sums already paid in excess of the deposit shall be refunded to the Sponsor.</w:t>
       </w:r>
     </w:p>
     <w:p>
@@ -3032,7 +3032,7 @@
           <w:iCs/>
           <w:sz w:val="18"/>
         </w:rPr>
-        <w:t>Should the total withdrawal be received less than 30 days before the start of the event and constitute a breach attributable to the Sponsor, the Organizing Secretariat may request the termination of the agreement and the payment, as a penalty pursuant to art. 1382 of the Italian Civil Code, of an amount equal to 100% of the total amount indicated in Annex 1, taken as the calculation basis including VAT. All sums already paid by the Sponsor in relation to the agreement, including the confirmatory deposit, shall be deducted from the penalty; only any remaining difference shall therefore be due. The application of this penalty is an alternative to withdrawal with retention of the confirmatory deposit and shall not be cumulated with it.</w:t>
+        <w:t>Should the total withdrawal be received less than 30 days before the start of the event and constitute a breach attributable to the Sponsor, the Organizing Secretariat may request the termination of the agreement and the payment, as a penalty pursuant to art. 1382 of the Italian Civil Code, of an amount equal to 100% of the total amount indicated in Annex 1, retaining the sums already paid by the Sponsor and charging the further amount due up to the total cost of participation.</w:t>
       </w:r>
     </w:p>
     <w:p>
@@ -4523,7 +4523,7 @@
           <w:iCs/>
           <w:sz w:val="18"/>
         </w:rPr>
-        <w:t>Any derogation from this Agreement shall be null and void and in any case without effect unless made in writing.</w:t>
+        <w:t>Any derogation from and/or variation to this Agreement shall be null and void and in any case without effect unless made in writing.</w:t>
       </w:r>
     </w:p>
     <w:p>

</xml_diff>